<commit_message>
devcontainer: configuracion alternativa con Docker (docker-outside-of-docker) sin tocar la por defecto; instrucciones actualizadas
Co-Authored-By: Claude Sonnet 5 <noreply@anthropic.com>
</commit_message>
<xml_diff>
--- a/docs/evidencias/informe-maestro.docx
+++ b/docs/evidencias/informe-maestro.docx
@@ -7606,7 +7606,7 @@
         <w:t xml:space="preserve">docker compose up</w:t>
       </w:r>
       <w:r>
-        <w:t xml:space="preserve">, Keycloak) requieren Docker. Verifique con</w:t>
+        <w:t xml:space="preserve">, Keycloak) requieren Docker. Para tener Docker se agregó la configuración alternativa</w:t>
       </w:r>
       <w:r>
         <w:t xml:space="preserve"> </w:t>
@@ -7615,13 +7615,63 @@
         <w:rPr>
           <w:rStyle w:val="VerbatimChar"/>
         </w:rPr>
+        <w:t xml:space="preserve">.devcontainer/con-docker/devcontainer.json</w:t>
+      </w:r>
+      <w:r>
+        <w:t xml:space="preserve"> </w:t>
+      </w:r>
+      <w:r>
+        <w:t xml:space="preserve">(</w:t>
+      </w:r>
+      <w:r>
+        <w:rPr>
+          <w:iCs/>
+          <w:i/>
+        </w:rPr>
+        <w:t xml:space="preserve">New with options… → CIB-204 DevSecOps (Node 20 + Docker)</w:t>
+      </w:r>
+      <w:r>
+        <w:t xml:space="preserve">), que añade</w:t>
+      </w:r>
+      <w:r>
+        <w:t xml:space="preserve"> </w:t>
+      </w:r>
+      <w:r>
+        <w:rPr>
+          <w:rStyle w:val="VerbatimChar"/>
+        </w:rPr>
+        <w:t xml:space="preserve">docker-outside-of-docker</w:t>
+      </w:r>
+      <w:r>
+        <w:t xml:space="preserve"> </w:t>
+      </w:r>
+      <w:r>
+        <w:t xml:space="preserve">sin alterar la configuración por defecto;</w:t>
+      </w:r>
+      <w:r>
+        <w:t xml:space="preserve"> </w:t>
+      </w:r>
+      <w:r>
+        <w:rPr>
+          <w:bCs/>
+          <w:b/>
+        </w:rPr>
+        <w:t xml:space="preserve">no se pudo probar en este entorno</w:t>
+      </w:r>
+      <w:r>
+        <w:t xml:space="preserve">. Verifique con</w:t>
+      </w:r>
+      <w:r>
+        <w:t xml:space="preserve"> </w:t>
+      </w:r>
+      <w:r>
+        <w:rPr>
+          <w:rStyle w:val="VerbatimChar"/>
+        </w:rPr>
         <w:t xml:space="preserve">docker --version</w:t>
       </w:r>
       <w:r>
-        <w:t xml:space="preserve"> </w:t>
-      </w:r>
-      <w:r>
-        <w:t xml:space="preserve">en el Codespace; si no está disponible, esos pasos se pueden reproducir con Docker en un equipo local (el script</w:t>
+        <w:t xml:space="preserve">; si no está disponible, esos pasos se pueden reproducir con Docker en un equipo local (el script</w:t>
       </w:r>
       <w:r>
         <w:t xml:space="preserve"> </w:t>

</xml_diff>

<commit_message>
fix(devcontainer): moby=false en la config con Docker; documenta el incidente del zip oficial y reporte a la docente
Causa (log del Codespace, 19-sep-2026): la opcion 'moby' no existe en Debian trixie,
base actual de javascript-node:20. El docker-in-docker:2 del zip oficial comparte
imagen y opcion por defecto.

Co-Authored-By: Claude Sonnet 5 <noreply@anthropic.com>
</commit_message>
<xml_diff>
--- a/docs/evidencias/informe-maestro.docx
+++ b/docs/evidencias/informe-maestro.docx
@@ -2620,7 +2620,7 @@
     </w:p>
     <w:bookmarkEnd w:id="22"/>
     <w:bookmarkEnd w:id="23"/>
-    <w:bookmarkStart w:id="74" w:name="parte-i-contexto-y-diseño"/>
+    <w:bookmarkStart w:id="75" w:name="parte-i-contexto-y-diseño"/>
     <w:p>
       <w:pPr>
         <w:pStyle w:val="Heading1"/>
@@ -6966,7 +6966,7 @@
     </w:p>
     <w:bookmarkEnd w:id="53"/>
     <w:bookmarkEnd w:id="54"/>
-    <w:bookmarkStart w:id="73" w:name="configuración-del-entorno-paso-a-paso"/>
+    <w:bookmarkStart w:id="74" w:name="configuración-del-entorno-paso-a-paso"/>
     <w:p>
       <w:pPr>
         <w:pStyle w:val="Heading2"/>
@@ -6975,7 +6975,7 @@
         <w:t xml:space="preserve">8. Configuración del entorno (paso a paso)</w:t>
       </w:r>
     </w:p>
-    <w:bookmarkStart w:id="67" w:name="entorno-en-la-nube-codespace"/>
+    <w:bookmarkStart w:id="68" w:name="entorno-en-la-nube-codespace"/>
     <w:p>
       <w:pPr>
         <w:pStyle w:val="Heading3"/>
@@ -7181,34 +7181,107 @@
           <w:bCs/>
           <w:b/>
         </w:rPr>
-        <w:t xml:space="preserve">Incidente resuelto.</w:t>
-      </w:r>
-      <w:r>
-        <w:t xml:space="preserve"> </w:t>
-      </w:r>
-      <w:r>
-        <w:t xml:space="preserve">La primera configuración del Codespace incluía la característica</w:t>
-      </w:r>
-      <w:r>
-        <w:t xml:space="preserve"> </w:t>
-      </w:r>
-      <w:r>
-        <w:rPr>
-          <w:rStyle w:val="VerbatimChar"/>
-        </w:rPr>
-        <w:t xml:space="preserve">docker-in-docker</w:t>
-      </w:r>
-      <w:r>
-        <w:t xml:space="preserve">; en el plan gratuito de 2 núcleos el contenedor fallaba y el Codespace arrancaba en</w:t>
-      </w:r>
-      <w:r>
-        <w:t xml:space="preserve"> </w:t>
+        <w:t xml:space="preserve">Incidente del Codespace (reportable a la docente; detalle en</w:t>
       </w:r>
       <w:r>
         <w:rPr>
           <w:bCs/>
           <w:b/>
         </w:rPr>
+        <w:t xml:space="preserve"> </w:t>
+      </w:r>
+      <w:hyperlink r:id="rId55">
+        <w:r>
+          <w:rPr>
+            <w:rStyle w:val="VerbatimChar"/>
+            <w:bCs/>
+            <w:b/>
+          </w:rPr>
+          <w:t xml:space="preserve">reporte-docente-devcontainer.md</w:t>
+        </w:r>
+      </w:hyperlink>
+      <w:r>
+        <w:rPr>
+          <w:bCs/>
+          <w:b/>
+        </w:rPr>
+        <w:t xml:space="preserve">).</w:t>
+      </w:r>
+      <w:r>
+        <w:t xml:space="preserve"> </w:t>
+      </w:r>
+      <w:r>
+        <w:t xml:space="preserve">El</w:t>
+      </w:r>
+      <w:r>
+        <w:t xml:space="preserve"> </w:t>
+      </w:r>
+      <w:r>
+        <w:rPr>
+          <w:rStyle w:val="VerbatimChar"/>
+        </w:rPr>
+        <w:t xml:space="preserve">.devcontainer/devcontainer.json</w:t>
+      </w:r>
+      <w:r>
+        <w:t xml:space="preserve"> </w:t>
+      </w:r>
+      <w:r>
+        <w:t xml:space="preserve">del</w:t>
+      </w:r>
+      <w:r>
+        <w:t xml:space="preserve"> </w:t>
+      </w:r>
+      <w:r>
+        <w:rPr>
+          <w:bCs/>
+          <w:b/>
+        </w:rPr>
+        <w:t xml:space="preserve">zip oficial</w:t>
+      </w:r>
+      <w:r>
+        <w:t xml:space="preserve"> </w:t>
+      </w:r>
+      <w:r>
+        <w:t xml:space="preserve">usa la imagen</w:t>
+      </w:r>
+      <w:r>
+        <w:t xml:space="preserve"> </w:t>
+      </w:r>
+      <w:r>
+        <w:rPr>
+          <w:rStyle w:val="VerbatimChar"/>
+        </w:rPr>
+        <w:t xml:space="preserve">mcr.microsoft.com/devcontainers/javascript-node:20</w:t>
+      </w:r>
+      <w:r>
+        <w:t xml:space="preserve"> </w:t>
+      </w:r>
+      <w:r>
+        <w:t xml:space="preserve">más la característica</w:t>
+      </w:r>
+      <w:r>
+        <w:t xml:space="preserve"> </w:t>
+      </w:r>
+      <w:r>
+        <w:rPr>
+          <w:rStyle w:val="VerbatimChar"/>
+        </w:rPr>
+        <w:t xml:space="preserve">docker-in-docker:2</w:t>
+      </w:r>
+      <w:r>
+        <w:t xml:space="preserve"> </w:t>
+      </w:r>
+      <w:r>
+        <w:t xml:space="preserve">(sin opciones). Al abrir el Codespace, este arrancaba en</w:t>
+      </w:r>
+      <w:r>
+        <w:t xml:space="preserve"> </w:t>
+      </w:r>
+      <w:r>
+        <w:rPr>
+          <w:bCs/>
+          <w:b/>
+        </w:rPr>
         <w:t xml:space="preserve">modo de recuperación</w:t>
       </w:r>
       <w:r>
@@ -7230,7 +7303,232 @@
         <w:t xml:space="preserve"> </w:t>
       </w:r>
       <w:r>
-        <w:t xml:space="preserve">retiró esa característica y pasó a una imagen Node 20 ligera, con lo que el Codespace arranca en menos de un minuto (EV-C204-045).</w:t>
+        <w:t xml:space="preserve">retiró la característica para poder trabajar (EV-C204-045) y el Codespace pasó a arrancar en menos de un minuto.</w:t>
+      </w:r>
+    </w:p>
+    <w:p>
+      <w:pPr>
+        <w:pStyle w:val="BodyText"/>
+      </w:pPr>
+      <w:r>
+        <w:rPr>
+          <w:iCs/>
+          <w:i/>
+        </w:rPr>
+        <w:t xml:space="preserve">Causa (confirmada para la variante con</w:t>
+      </w:r>
+      <w:r>
+        <w:rPr>
+          <w:iCs/>
+          <w:i/>
+        </w:rPr>
+        <w:t xml:space="preserve"> </w:t>
+      </w:r>
+      <w:r>
+        <w:rPr>
+          <w:rStyle w:val="VerbatimChar"/>
+          <w:iCs/>
+          <w:i/>
+        </w:rPr>
+        <w:t xml:space="preserve">docker-outside-of-docker</w:t>
+      </w:r>
+      <w:r>
+        <w:rPr>
+          <w:iCs/>
+          <w:i/>
+        </w:rPr>
+        <w:t xml:space="preserve">, inferida para la del zip).</w:t>
+      </w:r>
+      <w:r>
+        <w:t xml:space="preserve"> </w:t>
+      </w:r>
+      <w:r>
+        <w:t xml:space="preserve">Al reproducir el fallo con la configuración alternativa, el registro de creación del Codespace muestra:</w:t>
+      </w:r>
+      <w:r>
+        <w:t xml:space="preserve"> </w:t>
+      </w:r>
+      <w:r>
+        <w:rPr>
+          <w:rStyle w:val="VerbatimChar"/>
+        </w:rPr>
+        <w:t xml:space="preserve">The 'moby' option is not supported on debian 'trixie' because 'moby-cli' and related system packages are not available in that distribution</w:t>
+      </w:r>
+      <w:r>
+        <w:t xml:space="preserve"> </w:t>
+      </w:r>
+      <w:r>
+        <w:t xml:space="preserve">y</w:t>
+      </w:r>
+      <w:r>
+        <w:t xml:space="preserve"> </w:t>
+      </w:r>
+      <w:r>
+        <w:rPr>
+          <w:rStyle w:val="VerbatimChar"/>
+        </w:rPr>
+        <w:t xml:space="preserve">Feature "Docker (docker-outside-of-docker)" failed to install</w:t>
+      </w:r>
+      <w:r>
+        <w:t xml:space="preserve">. La imagen</w:t>
+      </w:r>
+      <w:r>
+        <w:t xml:space="preserve"> </w:t>
+      </w:r>
+      <w:r>
+        <w:rPr>
+          <w:rStyle w:val="VerbatimChar"/>
+        </w:rPr>
+        <w:t xml:space="preserve">javascript-node:20</w:t>
+      </w:r>
+      <w:r>
+        <w:t xml:space="preserve"> </w:t>
+      </w:r>
+      <w:r>
+        <w:t xml:space="preserve">es hoy</w:t>
+      </w:r>
+      <w:r>
+        <w:t xml:space="preserve"> </w:t>
+      </w:r>
+      <w:r>
+        <w:rPr>
+          <w:bCs/>
+          <w:b/>
+        </w:rPr>
+        <w:t xml:space="preserve">Debian 13 «trixie»</w:t>
+      </w:r>
+      <w:r>
+        <w:t xml:space="preserve"> </w:t>
+      </w:r>
+      <w:r>
+        <w:t xml:space="preserve">(verificado:</w:t>
+      </w:r>
+      <w:r>
+        <w:t xml:space="preserve"> </w:t>
+      </w:r>
+      <w:r>
+        <w:rPr>
+          <w:rStyle w:val="VerbatimChar"/>
+        </w:rPr>
+        <w:t xml:space="preserve">PRETTY_NAME="Debian GNU/Linux 13 (trixie)"</w:t>
+      </w:r>
+      <w:r>
+        <w:t xml:space="preserve">, Node 20.20.2, igual que la captura EV-C204-046) y las características de Docker instalan por defecto el paquete</w:t>
+      </w:r>
+      <w:r>
+        <w:t xml:space="preserve"> </w:t>
+      </w:r>
+      <w:r>
+        <w:rPr>
+          <w:rStyle w:val="VerbatimChar"/>
+        </w:rPr>
+        <w:t xml:space="preserve">moby</w:t>
+      </w:r>
+      <w:r>
+        <w:t xml:space="preserve">, que no existe en trixie. La característica</w:t>
+      </w:r>
+      <w:r>
+        <w:t xml:space="preserve"> </w:t>
+      </w:r>
+      <w:r>
+        <w:rPr>
+          <w:rStyle w:val="VerbatimChar"/>
+        </w:rPr>
+        <w:t xml:space="preserve">docker-in-docker:2</w:t>
+      </w:r>
+      <w:r>
+        <w:t xml:space="preserve"> </w:t>
+      </w:r>
+      <w:r>
+        <w:t xml:space="preserve">del zip tiene la misma opción por defecto y la misma imagen base, por lo que es</w:t>
+      </w:r>
+      <w:r>
+        <w:t xml:space="preserve"> </w:t>
+      </w:r>
+      <w:r>
+        <w:rPr>
+          <w:bCs/>
+          <w:b/>
+        </w:rPr>
+        <w:t xml:space="preserve">muy probable</w:t>
+      </w:r>
+      <w:r>
+        <w:t xml:space="preserve"> </w:t>
+      </w:r>
+      <w:r>
+        <w:t xml:space="preserve">que la causa sea la misma; no se conservó el texto exacto del error de la configuración original, solo su síntoma (modo de recuperación). Nota: una versión anterior de este informe atribuía el fallo al plan gratuito de 2 núcleos; esa hipótesis no tiene respaldo en los registros y se descarta.</w:t>
+      </w:r>
+    </w:p>
+    <w:p>
+      <w:pPr>
+        <w:pStyle w:val="BodyText"/>
+      </w:pPr>
+      <w:r>
+        <w:rPr>
+          <w:iCs/>
+          <w:i/>
+        </w:rPr>
+        <w:t xml:space="preserve">Solución.</w:t>
+      </w:r>
+      <w:r>
+        <w:t xml:space="preserve"> </w:t>
+      </w:r>
+      <w:r>
+        <w:t xml:space="preserve">La configuración alternativa</w:t>
+      </w:r>
+      <w:r>
+        <w:t xml:space="preserve"> </w:t>
+      </w:r>
+      <w:r>
+        <w:rPr>
+          <w:rStyle w:val="VerbatimChar"/>
+        </w:rPr>
+        <w:t xml:space="preserve">.devcontainer/con-docker/devcontainer.json</w:t>
+      </w:r>
+      <w:r>
+        <w:t xml:space="preserve"> </w:t>
+      </w:r>
+      <w:r>
+        <w:t xml:space="preserve">usa</w:t>
+      </w:r>
+      <w:r>
+        <w:t xml:space="preserve"> </w:t>
+      </w:r>
+      <w:r>
+        <w:rPr>
+          <w:rStyle w:val="VerbatimChar"/>
+        </w:rPr>
+        <w:t xml:space="preserve">docker-outside-of-docker</w:t>
+      </w:r>
+      <w:r>
+        <w:t xml:space="preserve"> </w:t>
+      </w:r>
+      <w:r>
+        <w:t xml:space="preserve">con</w:t>
+      </w:r>
+      <w:r>
+        <w:t xml:space="preserve"> </w:t>
+      </w:r>
+      <w:r>
+        <w:rPr>
+          <w:rStyle w:val="VerbatimChar"/>
+        </w:rPr>
+        <w:t xml:space="preserve">"moby": false</w:t>
+      </w:r>
+      <w:r>
+        <w:t xml:space="preserve">, que es lo que indica el propio mensaje de error (usar el Docker CLI de Docker en lugar de</w:t>
+      </w:r>
+      <w:r>
+        <w:t xml:space="preserve"> </w:t>
+      </w:r>
+      <w:r>
+        <w:rPr>
+          <w:rStyle w:val="VerbatimChar"/>
+        </w:rPr>
+        <w:t xml:space="preserve">moby</w:t>
+      </w:r>
+      <w:r>
+        <w:t xml:space="preserve">).</w:t>
       </w:r>
     </w:p>
     <w:p>
@@ -7242,18 +7540,18 @@
           <wp:inline>
             <wp:extent cx="5067300" cy="2536319"/>
             <wp:effectExtent b="0" l="0" r="0" t="0"/>
-            <wp:docPr descr="EV-C204-043 — Registro de creación del Codespace (creation.log) y mensaje de modo de recuperación" title="" id="56" name="Picture"/>
+            <wp:docPr descr="EV-C204-043 — Registro de creación del Codespace (creation.log) y mensaje de modo de recuperación" title="" id="57" name="Picture"/>
             <a:graphic>
               <a:graphicData uri="http://schemas.openxmlformats.org/drawingml/2006/picture">
                 <pic:pic>
                   <pic:nvPicPr>
-                    <pic:cNvPr descr="evidencias/capturas/consola-git/EV-C204-043-screenshot-image1.png" id="57" name="Picture"/>
+                    <pic:cNvPr descr="evidencias/capturas/consola-git/EV-C204-043-screenshot-image1.png" id="58" name="Picture"/>
                     <pic:cNvPicPr>
                       <a:picLocks noChangeArrowheads="1" noChangeAspect="1"/>
                     </pic:cNvPicPr>
                   </pic:nvPicPr>
                   <pic:blipFill>
-                    <a:blip r:embed="rId55"/>
+                    <a:blip r:embed="rId56"/>
                     <a:stretch>
                       <a:fillRect/>
                     </a:stretch>
@@ -7306,18 +7604,18 @@
           <wp:inline>
             <wp:extent cx="4267200" cy="1111760"/>
             <wp:effectExtent b="0" l="0" r="0" t="0"/>
-            <wp:docPr descr="EV-C204-044 — Detalle del terminal: modo de recuperación y git pull («Already up to date»)" title="" id="59" name="Picture"/>
+            <wp:docPr descr="EV-C204-044 — Detalle del terminal: modo de recuperación y git pull («Already up to date»)" title="" id="60" name="Picture"/>
             <a:graphic>
               <a:graphicData uri="http://schemas.openxmlformats.org/drawingml/2006/picture">
                 <pic:pic>
                   <pic:nvPicPr>
-                    <pic:cNvPr descr="evidencias/capturas/consola-git/EV-C204-044-screenshot-image2.png" id="60" name="Picture"/>
+                    <pic:cNvPr descr="evidencias/capturas/consola-git/EV-C204-044-screenshot-image2.png" id="61" name="Picture"/>
                     <pic:cNvPicPr>
                       <a:picLocks noChangeArrowheads="1" noChangeAspect="1"/>
                     </pic:cNvPicPr>
                   </pic:nvPicPr>
                   <pic:blipFill>
-                    <a:blip r:embed="rId58"/>
+                    <a:blip r:embed="rId59"/>
                     <a:stretch>
                       <a:fillRect/>
                     </a:stretch>
@@ -7376,18 +7674,18 @@
           <wp:inline>
             <wp:extent cx="5067300" cy="2536319"/>
             <wp:effectExtent b="0" l="0" r="0" t="0"/>
-            <wp:docPr descr="EV-C204-045 — Codespace ya operativo: explorador con .devcontainer, .github, app-movil, docs, scripts, servidor" title="" id="62" name="Picture"/>
+            <wp:docPr descr="EV-C204-045 — Codespace ya operativo: explorador con .devcontainer, .github, app-movil, docs, scripts, servidor" title="" id="63" name="Picture"/>
             <a:graphic>
               <a:graphicData uri="http://schemas.openxmlformats.org/drawingml/2006/picture">
                 <pic:pic>
                   <pic:nvPicPr>
-                    <pic:cNvPr descr="evidencias/capturas/consola-git/EV-C204-045-screenshot-image3.png" id="63" name="Picture"/>
+                    <pic:cNvPr descr="evidencias/capturas/consola-git/EV-C204-045-screenshot-image3.png" id="64" name="Picture"/>
                     <pic:cNvPicPr>
                       <a:picLocks noChangeArrowheads="1" noChangeAspect="1"/>
                     </pic:cNvPicPr>
                   </pic:nvPicPr>
                   <pic:blipFill>
-                    <a:blip r:embed="rId61"/>
+                    <a:blip r:embed="rId62"/>
                     <a:stretch>
                       <a:fillRect/>
                     </a:stretch>
@@ -7500,18 +7798,18 @@
           <wp:inline>
             <wp:extent cx="5067300" cy="2536319"/>
             <wp:effectExtent b="0" l="0" r="0" t="0"/>
-            <wp:docPr descr="EV-C204-046 — Versiones reales del entorno: node v20.20.2 y npm 10.8.2" title="" id="65" name="Picture"/>
+            <wp:docPr descr="EV-C204-046 — Versiones reales del entorno: node v20.20.2 y npm 10.8.2" title="" id="66" name="Picture"/>
             <a:graphic>
               <a:graphicData uri="http://schemas.openxmlformats.org/drawingml/2006/picture">
                 <pic:pic>
                   <pic:nvPicPr>
-                    <pic:cNvPr descr="evidencias/capturas/consola-git/EV-C204-046-screenshot-image4.png" id="66" name="Picture"/>
+                    <pic:cNvPr descr="evidencias/capturas/consola-git/EV-C204-046-screenshot-image4.png" id="67" name="Picture"/>
                     <pic:cNvPicPr>
                       <a:picLocks noChangeArrowheads="1" noChangeAspect="1"/>
                     </pic:cNvPicPr>
                   </pic:nvPicPr>
                   <pic:blipFill>
-                    <a:blip r:embed="rId64"/>
+                    <a:blip r:embed="rId65"/>
                     <a:stretch>
                       <a:fillRect/>
                     </a:stretch>
@@ -7585,37 +7883,25 @@
         <w:t xml:space="preserve"> </w:t>
       </w:r>
       <w:r>
-        <w:t xml:space="preserve">al quitar</w:t>
-      </w:r>
-      <w:r>
-        <w:t xml:space="preserve"> </w:t>
+        <w:t xml:space="preserve">la configuración por defecto (sin Docker) no permite los pasos 6.2 y 7 de la guía (</w:t>
       </w:r>
       <w:r>
         <w:rPr>
           <w:rStyle w:val="VerbatimChar"/>
         </w:rPr>
-        <w:t xml:space="preserve">docker-in-docker</w:t>
-      </w:r>
-      <w:r>
-        <w:t xml:space="preserve">, la imagen del Codespace ya no incluye Docker, y los pasos 6.2 y 7 de la guía (</w:t>
+        <w:t xml:space="preserve">docker compose up</w:t>
+      </w:r>
+      <w:r>
+        <w:t xml:space="preserve">, Keycloak). Para eso se creó la configuración alternativa</w:t>
+      </w:r>
+      <w:r>
+        <w:t xml:space="preserve"> </w:t>
       </w:r>
       <w:r>
         <w:rPr>
           <w:rStyle w:val="VerbatimChar"/>
         </w:rPr>
-        <w:t xml:space="preserve">docker compose up</w:t>
-      </w:r>
-      <w:r>
-        <w:t xml:space="preserve">, Keycloak) requieren Docker. Para tener Docker se agregó la configuración alternativa</w:t>
-      </w:r>
-      <w:r>
-        <w:t xml:space="preserve"> </w:t>
-      </w:r>
-      <w:r>
-        <w:rPr>
-          <w:rStyle w:val="VerbatimChar"/>
-        </w:rPr>
-        <w:t xml:space="preserve">.devcontainer/con-docker/devcontainer.json</w:t>
+        <w:t xml:space="preserve">con-docker</w:t>
       </w:r>
       <w:r>
         <w:t xml:space="preserve"> </w:t>
@@ -7628,10 +7914,10 @@
           <w:iCs/>
           <w:i/>
         </w:rPr>
-        <w:t xml:space="preserve">New with options… → CIB-204 DevSecOps (Node 20 + Docker)</w:t>
-      </w:r>
-      <w:r>
-        <w:t xml:space="preserve">), que añade</w:t>
+        <w:t xml:space="preserve">Code → Codespaces → New with options… → CIB-204 DevSecOps (Node 20 + Docker)</w:t>
+      </w:r>
+      <w:r>
+        <w:t xml:space="preserve">) con</w:t>
       </w:r>
       <w:r>
         <w:t xml:space="preserve"> </w:t>
@@ -7640,13 +7926,10 @@
         <w:rPr>
           <w:rStyle w:val="VerbatimChar"/>
         </w:rPr>
-        <w:t xml:space="preserve">docker-outside-of-docker</w:t>
-      </w:r>
-      <w:r>
-        <w:t xml:space="preserve"> </w:t>
-      </w:r>
-      <w:r>
-        <w:t xml:space="preserve">sin alterar la configuración por defecto;</w:t>
+        <w:t xml:space="preserve">"moby": false</w:t>
+      </w:r>
+      <w:r>
+        <w:t xml:space="preserve">;</w:t>
       </w:r>
       <w:r>
         <w:t xml:space="preserve"> </w:t>
@@ -7659,7 +7942,10 @@
         <w:t xml:space="preserve">no se pudo probar en este entorno</w:t>
       </w:r>
       <w:r>
-        <w:t xml:space="preserve">. Verifique con</w:t>
+        <w:t xml:space="preserve"> </w:t>
+      </w:r>
+      <w:r>
+        <w:t xml:space="preserve">y debe verificarse con</w:t>
       </w:r>
       <w:r>
         <w:t xml:space="preserve"> </w:t>
@@ -7671,22 +7957,7 @@
         <w:t xml:space="preserve">docker --version</w:t>
       </w:r>
       <w:r>
-        <w:t xml:space="preserve">; si no está disponible, esos pasos se pueden reproducir con Docker en un equipo local (el script</w:t>
-      </w:r>
-      <w:r>
-        <w:t xml:space="preserve"> </w:t>
-      </w:r>
-      <w:r>
-        <w:rPr>
-          <w:rStyle w:val="VerbatimChar"/>
-        </w:rPr>
-        <w:t xml:space="preserve">scripts/prueba-e2e-keycloak.sh</w:t>
-      </w:r>
-      <w:r>
-        <w:t xml:space="preserve"> </w:t>
-      </w:r>
-      <w:r>
-        <w:t xml:space="preserve">lo hace de forma automática). El pipeline de GitHub Actions no depende de esto.</w:t>
+        <w:t xml:space="preserve">. El pipeline de GitHub Actions no depende de esto.</w:t>
       </w:r>
     </w:p>
     <w:p>
@@ -7707,8 +7978,8 @@
         <w:t xml:space="preserve">EV-C204-043 a EV-C204-046 (EV-C204-001 = 046).</w:t>
       </w:r>
     </w:p>
-    <w:bookmarkEnd w:id="67"/>
-    <w:bookmarkStart w:id="68" w:name="levantar-el-servicio-y-keycloak"/>
+    <w:bookmarkEnd w:id="68"/>
+    <w:bookmarkStart w:id="69" w:name="levantar-el-servicio-y-keycloak"/>
     <w:p>
       <w:pPr>
         <w:pStyle w:val="Heading3"/>
@@ -7903,8 +8174,8 @@
         <w:t xml:space="preserve">EV-C204-002 (transcripción en EV-C204-023; captura del navegador pendiente del equipo).</w:t>
       </w:r>
     </w:p>
-    <w:bookmarkEnd w:id="68"/>
-    <w:bookmarkStart w:id="69" w:name="configurar-keycloak-iam"/>
+    <w:bookmarkEnd w:id="69"/>
+    <w:bookmarkStart w:id="70" w:name="configurar-keycloak-iam"/>
     <w:p>
       <w:pPr>
         <w:pStyle w:val="Heading3"/>
@@ -8165,8 +8436,8 @@
         <w:t xml:space="preserve">.</w:t>
       </w:r>
     </w:p>
-    <w:bookmarkEnd w:id="69"/>
-    <w:bookmarkStart w:id="70" w:name="probar-la-app-móvil"/>
+    <w:bookmarkEnd w:id="70"/>
+    <w:bookmarkStart w:id="71" w:name="probar-la-app-móvil"/>
     <w:p>
       <w:pPr>
         <w:pStyle w:val="Heading3"/>
@@ -8281,8 +8552,8 @@
         <w:t xml:space="preserve">. No se pudo ejecutar la app móvil en este entorno.</w:t>
       </w:r>
     </w:p>
-    <w:bookmarkEnd w:id="70"/>
-    <w:bookmarkStart w:id="71" w:name="X71d9dd88e91b1136218c4aa8f763acec6511eab"/>
+    <w:bookmarkEnd w:id="71"/>
+    <w:bookmarkStart w:id="72" w:name="X71d9dd88e91b1136218c4aa8f763acec6511eab"/>
     <w:p>
       <w:pPr>
         <w:pStyle w:val="Heading3"/>
@@ -9463,8 +9734,8 @@
         <w:t xml:space="preserve">. No requiere notificación a la profesora.</w:t>
       </w:r>
     </w:p>
-    <w:bookmarkEnd w:id="71"/>
-    <w:bookmarkStart w:id="72" w:name="X7ef59c872bc6003c713567e2c439786ae07b049"/>
+    <w:bookmarkEnd w:id="72"/>
+    <w:bookmarkStart w:id="73" w:name="X7ef59c872bc6003c713567e2c439786ae07b049"/>
     <w:p>
       <w:pPr>
         <w:pStyle w:val="Heading3"/>
@@ -9800,10 +10071,10 @@
         </w:pict>
       </w:r>
     </w:p>
-    <w:bookmarkEnd w:id="72"/>
     <w:bookmarkEnd w:id="73"/>
     <w:bookmarkEnd w:id="74"/>
-    <w:bookmarkStart w:id="92" w:name="parte-ii-implementación-y-entorno"/>
+    <w:bookmarkEnd w:id="75"/>
+    <w:bookmarkStart w:id="93" w:name="parte-ii-implementación-y-entorno"/>
     <w:p>
       <w:pPr>
         <w:pStyle w:val="Heading1"/>
@@ -9858,7 +10129,7 @@
         <w:t xml:space="preserve">) se integra desde el material del laboratorio; aquí se documenta el diseño seguro de referencia que guía la remediación de la Fase 2.</w:t>
       </w:r>
     </w:p>
-    <w:bookmarkStart w:id="78" w:name="Xb44003f4d804ca91c6a4233e131d0388fe1eb79"/>
+    <w:bookmarkStart w:id="79" w:name="Xb44003f4d804ca91c6a4233e131d0388fe1eb79"/>
     <w:p>
       <w:pPr>
         <w:pStyle w:val="Heading2"/>
@@ -9867,7 +10138,7 @@
         <w:t xml:space="preserve">9. Módulo de encriptación/desencriptación (RSA)</w:t>
       </w:r>
     </w:p>
-    <w:bookmarkStart w:id="75" w:name="selección-del-algoritmo-criptográfico"/>
+    <w:bookmarkStart w:id="76" w:name="selección-del-algoritmo-criptográfico"/>
     <w:p>
       <w:pPr>
         <w:pStyle w:val="Heading3"/>
@@ -10140,8 +10411,8 @@
         </w:tc>
       </w:tr>
     </w:tbl>
-    <w:bookmarkEnd w:id="75"/>
-    <w:bookmarkStart w:id="76" w:name="funciones-del-módulo-cifrado.js"/>
+    <w:bookmarkEnd w:id="76"/>
+    <w:bookmarkStart w:id="77" w:name="funciones-del-módulo-cifrado.js"/>
     <w:p>
       <w:pPr>
         <w:pStyle w:val="Heading3"/>
@@ -10385,8 +10656,8 @@
         </w:tc>
       </w:tr>
     </w:tbl>
-    <w:bookmarkEnd w:id="76"/>
-    <w:bookmarkStart w:id="77" w:name="Xe060fca36e803a6ba52242daf837f1f551c2bbb"/>
+    <w:bookmarkEnd w:id="77"/>
+    <w:bookmarkStart w:id="78" w:name="Xe060fca36e803a6ba52242daf837f1f551c2bbb"/>
     <w:p>
       <w:pPr>
         <w:pStyle w:val="Heading3"/>
@@ -10697,9 +10968,9 @@
         <w:t xml:space="preserve">) y los hallazgos reales de la Tabla 3.</w:t>
       </w:r>
     </w:p>
-    <w:bookmarkEnd w:id="77"/>
     <w:bookmarkEnd w:id="78"/>
-    <w:bookmarkStart w:id="82" w:name="funciones-de-utilidad"/>
+    <w:bookmarkEnd w:id="79"/>
+    <w:bookmarkStart w:id="83" w:name="funciones-de-utilidad"/>
     <w:p>
       <w:pPr>
         <w:pStyle w:val="Heading2"/>
@@ -10708,7 +10979,7 @@
         <w:t xml:space="preserve">10. Funciones de utilidad</w:t>
       </w:r>
     </w:p>
-    <w:bookmarkStart w:id="79" w:name="validación-de-entrada"/>
+    <w:bookmarkStart w:id="80" w:name="validación-de-entrada"/>
     <w:p>
       <w:pPr>
         <w:pStyle w:val="Heading3"/>
@@ -10830,8 +11101,8 @@
         <w:t xml:space="preserve">rechazo con error genérico y código HTTP adecuado.</w:t>
       </w:r>
     </w:p>
-    <w:bookmarkEnd w:id="79"/>
-    <w:bookmarkStart w:id="80" w:name="manejo-de-errores"/>
+    <w:bookmarkEnd w:id="80"/>
+    <w:bookmarkStart w:id="81" w:name="manejo-de-errores"/>
     <w:p>
       <w:pPr>
         <w:pStyle w:val="Heading3"/>
@@ -10939,8 +11210,8 @@
         <w:t xml:space="preserve">ante cualquier excepción la operación falla cerrada y no devuelve datos parciales.</w:t>
       </w:r>
     </w:p>
-    <w:bookmarkEnd w:id="80"/>
-    <w:bookmarkStart w:id="81" w:name="codificación-y-bitácora"/>
+    <w:bookmarkEnd w:id="81"/>
+    <w:bookmarkStart w:id="82" w:name="codificación-y-bitácora"/>
     <w:p>
       <w:pPr>
         <w:pStyle w:val="Heading3"/>
@@ -11065,9 +11336,9 @@
         <w:t xml:space="preserve">en MySQL con consulta parametrizada (CWE-89 cerrado); sin base de datos configurada devuelve el SQL y el parámetro sin ejecutar nada.</w:t>
       </w:r>
     </w:p>
-    <w:bookmarkEnd w:id="81"/>
     <w:bookmarkEnd w:id="82"/>
-    <w:bookmarkStart w:id="86" w:name="autenticación-con-keycloak-jwt"/>
+    <w:bookmarkEnd w:id="83"/>
+    <w:bookmarkStart w:id="87" w:name="autenticación-con-keycloak-jwt"/>
     <w:p>
       <w:pPr>
         <w:pStyle w:val="Heading2"/>
@@ -11076,7 +11347,7 @@
         <w:t xml:space="preserve">11. Autenticación con Keycloak (JWT)</w:t>
       </w:r>
     </w:p>
-    <w:bookmarkStart w:id="83" w:name="flujo-de-identidad"/>
+    <w:bookmarkStart w:id="84" w:name="flujo-de-identidad"/>
     <w:p>
       <w:pPr>
         <w:pStyle w:val="Heading3"/>
@@ -11206,8 +11477,8 @@
         <w:t xml:space="preserve">Token válido → 200 OK; token inválido/ausente → 401.</w:t>
       </w:r>
     </w:p>
-    <w:bookmarkEnd w:id="83"/>
-    <w:bookmarkStart w:id="84" w:name="X685656aa7c6a45ed79461133438c6f7656a327e"/>
+    <w:bookmarkEnd w:id="84"/>
+    <w:bookmarkStart w:id="85" w:name="X685656aa7c6a45ed79461133438c6f7656a327e"/>
     <w:p>
       <w:pPr>
         <w:pStyle w:val="Heading3"/>
@@ -11883,8 +12154,8 @@
         <w:t xml:space="preserve">de Node.</w:t>
       </w:r>
     </w:p>
-    <w:bookmarkEnd w:id="84"/>
-    <w:bookmarkStart w:id="85" w:name="verificación-contra-un-keycloak-real"/>
+    <w:bookmarkEnd w:id="85"/>
+    <w:bookmarkStart w:id="86" w:name="verificación-contra-un-keycloak-real"/>
     <w:p>
       <w:pPr>
         <w:pStyle w:val="Heading3"/>
@@ -12189,9 +12460,9 @@
         <w:t xml:space="preserve">repite todo el experimento (contraseñas aleatorias en cada corrida).</w:t>
       </w:r>
     </w:p>
-    <w:bookmarkEnd w:id="85"/>
     <w:bookmarkEnd w:id="86"/>
-    <w:bookmarkStart w:id="91" w:name="pipeline-devsecops-las-6-pruebas"/>
+    <w:bookmarkEnd w:id="87"/>
+    <w:bookmarkStart w:id="92" w:name="pipeline-devsecops-las-6-pruebas"/>
     <w:p>
       <w:pPr>
         <w:pStyle w:val="Heading2"/>
@@ -12200,7 +12471,7 @@
         <w:t xml:space="preserve">12. Pipeline DevSecOps (las 6 pruebas)</w:t>
       </w:r>
     </w:p>
-    <w:bookmarkStart w:id="87" w:name="diseño-del-pipeline"/>
+    <w:bookmarkStart w:id="88" w:name="diseño-del-pipeline"/>
     <w:p>
       <w:pPr>
         <w:pStyle w:val="Heading3"/>
@@ -12765,8 +13036,8 @@
         <w:t xml:space="preserve">: sobre el commit final produjo 2 análisis (87 y 17 reglas) con 0 resultados abiertos. Si el docente exige el job literal en el workflow, basta desactivar el default setup y restaurar el job; se prefirió no romper el pipeline verde.</w:t>
       </w:r>
     </w:p>
-    <w:bookmarkEnd w:id="87"/>
-    <w:bookmarkStart w:id="88" w:name="comportamiento-por-fase"/>
+    <w:bookmarkEnd w:id="88"/>
+    <w:bookmarkStart w:id="89" w:name="comportamiento-por-fase"/>
     <w:p>
       <w:pPr>
         <w:pStyle w:val="Heading3"/>
@@ -12908,8 +13179,8 @@
         <w:t xml:space="preserve">sobre ese mismo commit (EV-C204-025 y EV-C204-026). La historia completa de ejecuciones está en EV-C204-029.</w:t>
       </w:r>
     </w:p>
-    <w:bookmarkEnd w:id="88"/>
-    <w:bookmarkStart w:id="89" w:name="configuración-del-workflow"/>
+    <w:bookmarkEnd w:id="89"/>
+    <w:bookmarkStart w:id="90" w:name="configuración-del-workflow"/>
     <w:p>
       <w:pPr>
         <w:pStyle w:val="Heading3"/>
@@ -13049,8 +13320,8 @@
         <w:t xml:space="preserve">) para evitar ataques de supply chain por tags mutables.</w:t>
       </w:r>
     </w:p>
-    <w:bookmarkEnd w:id="89"/>
-    <w:bookmarkStart w:id="90" w:name="hallazgos-dast-zap-antes-y-después"/>
+    <w:bookmarkEnd w:id="90"/>
+    <w:bookmarkStart w:id="91" w:name="hallazgos-dast-zap-antes-y-después"/>
     <w:p>
       <w:pPr>
         <w:pStyle w:val="Heading3"/>
@@ -13653,10 +13924,10 @@
         </w:pict>
       </w:r>
     </w:p>
-    <w:bookmarkEnd w:id="90"/>
     <w:bookmarkEnd w:id="91"/>
     <w:bookmarkEnd w:id="92"/>
-    <w:bookmarkStart w:id="146" w:name="parte-iii-diagnóstico-y-remediación"/>
+    <w:bookmarkEnd w:id="93"/>
+    <w:bookmarkStart w:id="147" w:name="parte-iii-diagnóstico-y-remediación"/>
     <w:p>
       <w:pPr>
         <w:pStyle w:val="Heading1"/>
@@ -13665,7 +13936,7 @@
         <w:t xml:space="preserve">PARTE III — DIAGNÓSTICO Y REMEDIACIÓN</w:t>
       </w:r>
     </w:p>
-    <w:bookmarkStart w:id="137" w:name="fase-1-diagnóstico-pipeline-en-rojo"/>
+    <w:bookmarkStart w:id="138" w:name="fase-1-diagnóstico-pipeline-en-rojo"/>
     <w:p>
       <w:pPr>
         <w:pStyle w:val="Heading2"/>
@@ -13674,7 +13945,7 @@
         <w:t xml:space="preserve">13. Fase 1 — Diagnóstico (pipeline en rojo)</w:t>
       </w:r>
     </w:p>
-    <w:bookmarkStart w:id="93" w:name="qué-se-hizo"/>
+    <w:bookmarkStart w:id="94" w:name="qué-se-hizo"/>
     <w:p>
       <w:pPr>
         <w:pStyle w:val="Heading3"/>
@@ -13747,8 +14018,8 @@
         <w:t xml:space="preserve">, 18-sep-2026), cuyos artefactos se descargaron íntegros (EV-C204-020, 021, 022, 027 y 028).</w:t>
       </w:r>
     </w:p>
-    <w:bookmarkEnd w:id="93"/>
-    <w:bookmarkStart w:id="118" w:name="las-primeras-ejecuciones"/>
+    <w:bookmarkEnd w:id="94"/>
+    <w:bookmarkStart w:id="119" w:name="las-primeras-ejecuciones"/>
     <w:p>
       <w:pPr>
         <w:pStyle w:val="Heading3"/>
@@ -14944,18 +15215,18 @@
           <wp:inline>
             <wp:extent cx="5067300" cy="2536319"/>
             <wp:effectExtent b="0" l="0" r="0" t="0"/>
-            <wp:docPr descr="EV-C204-047 — Pestaña Actions: las 8 ejecuciones, todas en rojo" title="" id="95" name="Picture"/>
+            <wp:docPr descr="EV-C204-047 — Pestaña Actions: las 8 ejecuciones, todas en rojo" title="" id="96" name="Picture"/>
             <a:graphic>
               <a:graphicData uri="http://schemas.openxmlformats.org/drawingml/2006/picture">
                 <pic:pic>
                   <pic:nvPicPr>
-                    <pic:cNvPr descr="evidencias/capturas/consola-git/EV-C204-047-screenshot-image5.png" id="96" name="Picture"/>
+                    <pic:cNvPr descr="evidencias/capturas/consola-git/EV-C204-047-screenshot-image5.png" id="97" name="Picture"/>
                     <pic:cNvPicPr>
                       <a:picLocks noChangeArrowheads="1" noChangeAspect="1"/>
                     </pic:cNvPicPr>
                   </pic:nvPicPr>
                   <pic:blipFill>
-                    <a:blip r:embed="rId94"/>
+                    <a:blip r:embed="rId95"/>
                     <a:stretch>
                       <a:fillRect/>
                     </a:stretch>
@@ -14999,18 +15270,18 @@
           <wp:inline>
             <wp:extent cx="4533900" cy="2269338"/>
             <wp:effectExtent b="0" l="0" r="0" t="0"/>
-            <wp:docPr descr="EV-C204-036 — Run #1 (35280933094, a20bf16): estructura inicial" title="" id="98" name="Picture"/>
+            <wp:docPr descr="EV-C204-036 — Run #1 (35280933094, a20bf16): estructura inicial" title="" id="99" name="Picture"/>
             <a:graphic>
               <a:graphicData uri="http://schemas.openxmlformats.org/drawingml/2006/picture">
                 <pic:pic>
                   <pic:nvPicPr>
-                    <pic:cNvPr descr="evidencias/capturas/consola-git/EV-C204-036-screenshot-image13.png" id="99" name="Picture"/>
+                    <pic:cNvPr descr="evidencias/capturas/consola-git/EV-C204-036-screenshot-image13.png" id="100" name="Picture"/>
                     <pic:cNvPicPr>
                       <a:picLocks noChangeArrowheads="1" noChangeAspect="1"/>
                     </pic:cNvPicPr>
                   </pic:nvPicPr>
                   <pic:blipFill>
-                    <a:blip r:embed="rId97"/>
+                    <a:blip r:embed="rId98"/>
                     <a:stretch>
                       <a:fillRect/>
                     </a:stretch>
@@ -15066,18 +15337,18 @@
           <wp:inline>
             <wp:extent cx="4533900" cy="2269338"/>
             <wp:effectExtent b="0" l="0" r="0" t="0"/>
-            <wp:docPr descr="EV-C204-035 — Run #2 (35283334710, 8129154): plan de acción" title="" id="101" name="Picture"/>
+            <wp:docPr descr="EV-C204-035 — Run #2 (35283334710, 8129154): plan de acción" title="" id="102" name="Picture"/>
             <a:graphic>
               <a:graphicData uri="http://schemas.openxmlformats.org/drawingml/2006/picture">
                 <pic:pic>
                   <pic:nvPicPr>
-                    <pic:cNvPr descr="evidencias/capturas/consola-git/EV-C204-035-screenshot-image12.png" id="102" name="Picture"/>
+                    <pic:cNvPr descr="evidencias/capturas/consola-git/EV-C204-035-screenshot-image12.png" id="103" name="Picture"/>
                     <pic:cNvPicPr>
                       <a:picLocks noChangeArrowheads="1" noChangeAspect="1"/>
                     </pic:cNvPicPr>
                   </pic:nvPicPr>
                   <pic:blipFill>
-                    <a:blip r:embed="rId100"/>
+                    <a:blip r:embed="rId101"/>
                     <a:stretch>
                       <a:fillRect/>
                     </a:stretch>
@@ -15133,18 +15404,18 @@
           <wp:inline>
             <wp:extent cx="4533900" cy="2269338"/>
             <wp:effectExtent b="0" l="0" r="0" t="0"/>
-            <wp:docPr descr="EV-C204-034 — Run #3 (35284491567, 3441e89): repo privado / público" title="" id="104" name="Picture"/>
+            <wp:docPr descr="EV-C204-034 — Run #3 (35284491567, 3441e89): repo privado / público" title="" id="105" name="Picture"/>
             <a:graphic>
               <a:graphicData uri="http://schemas.openxmlformats.org/drawingml/2006/picture">
                 <pic:pic>
                   <pic:nvPicPr>
-                    <pic:cNvPr descr="evidencias/capturas/consola-git/EV-C204-034-screenshot-image11.png" id="105" name="Picture"/>
+                    <pic:cNvPr descr="evidencias/capturas/consola-git/EV-C204-034-screenshot-image11.png" id="106" name="Picture"/>
                     <pic:cNvPicPr>
                       <a:picLocks noChangeArrowheads="1" noChangeAspect="1"/>
                     </pic:cNvPicPr>
                   </pic:nvPicPr>
                   <pic:blipFill>
-                    <a:blip r:embed="rId103"/>
+                    <a:blip r:embed="rId104"/>
                     <a:stretch>
                       <a:fillRect/>
                     </a:stretch>
@@ -15200,18 +15471,18 @@
           <wp:inline>
             <wp:extent cx="4533900" cy="2269338"/>
             <wp:effectExtent b="0" l="0" r="0" t="0"/>
-            <wp:docPr descr="EV-C204-033 — Run #4 (35287858942, e15ebce): validación de objetivos, Tablas 1-2" title="" id="107" name="Picture"/>
+            <wp:docPr descr="EV-C204-033 — Run #4 (35287858942, e15ebce): validación de objetivos, Tablas 1-2" title="" id="108" name="Picture"/>
             <a:graphic>
               <a:graphicData uri="http://schemas.openxmlformats.org/drawingml/2006/picture">
                 <pic:pic>
                   <pic:nvPicPr>
-                    <pic:cNvPr descr="evidencias/capturas/consola-git/EV-C204-033-screenshot-image10.png" id="108" name="Picture"/>
+                    <pic:cNvPr descr="evidencias/capturas/consola-git/EV-C204-033-screenshot-image10.png" id="109" name="Picture"/>
                     <pic:cNvPicPr>
                       <a:picLocks noChangeArrowheads="1" noChangeAspect="1"/>
                     </pic:cNvPicPr>
                   </pic:nvPicPr>
                   <pic:blipFill>
-                    <a:blip r:embed="rId106"/>
+                    <a:blip r:embed="rId107"/>
                     <a:stretch>
                       <a:fillRect/>
                     </a:stretch>
@@ -15267,18 +15538,18 @@
           <wp:inline>
             <wp:extent cx="4533900" cy="2269338"/>
             <wp:effectExtent b="0" l="0" r="0" t="0"/>
-            <wp:docPr descr="EV-C204-051 — Run #5 (35288102685, 82c3bbe): Parte II del informe" title="" id="110" name="Picture"/>
+            <wp:docPr descr="EV-C204-051 — Run #5 (35288102685, 82c3bbe): Parte II del informe" title="" id="111" name="Picture"/>
             <a:graphic>
               <a:graphicData uri="http://schemas.openxmlformats.org/drawingml/2006/picture">
                 <pic:pic>
                   <pic:nvPicPr>
-                    <pic:cNvPr descr="evidencias/capturas/consola-git/EV-C204-051-screenshot-image9.png" id="111" name="Picture"/>
+                    <pic:cNvPr descr="evidencias/capturas/consola-git/EV-C204-051-screenshot-image9.png" id="112" name="Picture"/>
                     <pic:cNvPicPr>
                       <a:picLocks noChangeArrowheads="1" noChangeAspect="1"/>
                     </pic:cNvPicPr>
                   </pic:nvPicPr>
                   <pic:blipFill>
-                    <a:blip r:embed="rId109"/>
+                    <a:blip r:embed="rId110"/>
                     <a:stretch>
                       <a:fillRect/>
                     </a:stretch>
@@ -15334,18 +15605,18 @@
           <wp:inline>
             <wp:extent cx="4533900" cy="2269338"/>
             <wp:effectExtent b="0" l="0" r="0" t="0"/>
-            <wp:docPr descr="EV-C204-050 — Run #6 (35303227701, 9b1bddb): se integra el material oficial; aparecen 5 jobs en rojo" title="" id="113" name="Picture"/>
+            <wp:docPr descr="EV-C204-050 — Run #6 (35303227701, 9b1bddb): se integra el material oficial; aparecen 5 jobs en rojo" title="" id="114" name="Picture"/>
             <a:graphic>
               <a:graphicData uri="http://schemas.openxmlformats.org/drawingml/2006/picture">
                 <pic:pic>
                   <pic:nvPicPr>
-                    <pic:cNvPr descr="evidencias/capturas/consola-git/EV-C204-050-screenshot-image8.png" id="114" name="Picture"/>
+                    <pic:cNvPr descr="evidencias/capturas/consola-git/EV-C204-050-screenshot-image8.png" id="115" name="Picture"/>
                     <pic:cNvPicPr>
                       <a:picLocks noChangeArrowheads="1" noChangeAspect="1"/>
                     </pic:cNvPicPr>
                   </pic:nvPicPr>
                   <pic:blipFill>
-                    <a:blip r:embed="rId112"/>
+                    <a:blip r:embed="rId113"/>
                     <a:stretch>
                       <a:fillRect/>
                     </a:stretch>
@@ -15401,18 +15672,18 @@
           <wp:inline>
             <wp:extent cx="4533900" cy="2269338"/>
             <wp:effectExtent b="0" l="0" r="0" t="0"/>
-            <wp:docPr descr="EV-C204-049 — Run #7 (35303673682, 9a63eb8): mismo código, mismo resultado" title="" id="116" name="Picture"/>
+            <wp:docPr descr="EV-C204-049 — Run #7 (35303673682, 9a63eb8): mismo código, mismo resultado" title="" id="117" name="Picture"/>
             <a:graphic>
               <a:graphicData uri="http://schemas.openxmlformats.org/drawingml/2006/picture">
                 <pic:pic>
                   <pic:nvPicPr>
-                    <pic:cNvPr descr="evidencias/capturas/consola-git/EV-C204-049-screenshot-image7.png" id="117" name="Picture"/>
+                    <pic:cNvPr descr="evidencias/capturas/consola-git/EV-C204-049-screenshot-image7.png" id="118" name="Picture"/>
                     <pic:cNvPicPr>
                       <a:picLocks noChangeArrowheads="1" noChangeAspect="1"/>
                     </pic:cNvPicPr>
                   </pic:nvPicPr>
                   <pic:blipFill>
-                    <a:blip r:embed="rId115"/>
+                    <a:blip r:embed="rId116"/>
                     <a:stretch>
                       <a:fillRect/>
                     </a:stretch>
@@ -15459,8 +15730,8 @@
         <w:t xml:space="preserve">): mismo código, mismo resultado</w:t>
       </w:r>
     </w:p>
-    <w:bookmarkEnd w:id="118"/>
-    <w:bookmarkStart w:id="134" w:name="X4eec00fb3d4babaf1bc3784784d082b53f49a32"/>
+    <w:bookmarkEnd w:id="119"/>
+    <w:bookmarkStart w:id="135" w:name="X4eec00fb3d4babaf1bc3784784d082b53f49a32"/>
     <w:p>
       <w:pPr>
         <w:pStyle w:val="Heading3"/>
@@ -15499,18 +15770,18 @@
           <wp:inline>
             <wp:extent cx="4800600" cy="2402829"/>
             <wp:effectExtent b="0" l="0" r="0" t="0"/>
-            <wp:docPr descr="EV-C204-048 — Run #8: resumen de los 6 jobs (SAST-Semgrep, SAST-CodeQL, Secretos-Gitleaks, SCA e Imagen en rojo; DAST-ZAP en verde)" title="" id="120" name="Picture"/>
+            <wp:docPr descr="EV-C204-048 — Run #8: resumen de los 6 jobs (SAST-Semgrep, SAST-CodeQL, Secretos-Gitleaks, SCA e Imagen en rojo; DAST-ZAP en verde)" title="" id="121" name="Picture"/>
             <a:graphic>
               <a:graphicData uri="http://schemas.openxmlformats.org/drawingml/2006/picture">
                 <pic:pic>
                   <pic:nvPicPr>
-                    <pic:cNvPr descr="evidencias/capturas/consola-git/EV-C204-048-screenshot-image6.png" id="121" name="Picture"/>
+                    <pic:cNvPr descr="evidencias/capturas/consola-git/EV-C204-048-screenshot-image6.png" id="122" name="Picture"/>
                     <pic:cNvPicPr>
                       <a:picLocks noChangeArrowheads="1" noChangeAspect="1"/>
                     </pic:cNvPicPr>
                   </pic:nvPicPr>
                   <pic:blipFill>
-                    <a:blip r:embed="rId119"/>
+                    <a:blip r:embed="rId120"/>
                     <a:stretch>
                       <a:fillRect/>
                     </a:stretch>
@@ -15554,18 +15825,18 @@
           <wp:inline>
             <wp:extent cx="4800600" cy="2402829"/>
             <wp:effectExtent b="0" l="0" r="0" t="0"/>
-            <wp:docPr descr="EV-C204-038 — Artefactos del run #8 con su huella SHA-256: los de reporte-gitleaks, reporte-semgrep y reporte-zap coinciden con los zips instalados (EV-C204-020, 021 y 022)" title="" id="123" name="Picture"/>
+            <wp:docPr descr="EV-C204-038 — Artefactos del run #8 con su huella SHA-256: los de reporte-gitleaks, reporte-semgrep y reporte-zap coinciden con los zips instalados (EV-C204-020, 021 y 022)" title="" id="124" name="Picture"/>
             <a:graphic>
               <a:graphicData uri="http://schemas.openxmlformats.org/drawingml/2006/picture">
                 <pic:pic>
                   <pic:nvPicPr>
-                    <pic:cNvPr descr="evidencias/capturas/consola-git/EV-C204-038-screenshot-image15.png" id="124" name="Picture"/>
+                    <pic:cNvPr descr="evidencias/capturas/consola-git/EV-C204-038-screenshot-image15.png" id="125" name="Picture"/>
                     <pic:cNvPicPr>
                       <a:picLocks noChangeArrowheads="1" noChangeAspect="1"/>
                     </pic:cNvPicPr>
                   </pic:nvPicPr>
                   <pic:blipFill>
-                    <a:blip r:embed="rId122"/>
+                    <a:blip r:embed="rId123"/>
                     <a:stretch>
                       <a:fillRect/>
                     </a:stretch>
@@ -15678,18 +15949,18 @@
           <wp:inline>
             <wp:extent cx="4800600" cy="2402829"/>
             <wp:effectExtent b="0" l="0" r="0" t="0"/>
-            <wp:docPr descr="EV-C204-040 — Log de SAST-Semgrep: 23 hallazgos bloqueantes" title="" id="126" name="Picture"/>
+            <wp:docPr descr="EV-C204-040 — Log de SAST-Semgrep: 23 hallazgos bloqueantes" title="" id="127" name="Picture"/>
             <a:graphic>
               <a:graphicData uri="http://schemas.openxmlformats.org/drawingml/2006/picture">
                 <pic:pic>
                   <pic:nvPicPr>
-                    <pic:cNvPr descr="evidencias/capturas/consola-git/EV-C204-040-screenshot-image17.png" id="127" name="Picture"/>
+                    <pic:cNvPr descr="evidencias/capturas/consola-git/EV-C204-040-screenshot-image17.png" id="128" name="Picture"/>
                     <pic:cNvPicPr>
                       <a:picLocks noChangeArrowheads="1" noChangeAspect="1"/>
                     </pic:cNvPicPr>
                   </pic:nvPicPr>
                   <pic:blipFill>
-                    <a:blip r:embed="rId125"/>
+                    <a:blip r:embed="rId126"/>
                     <a:stretch>
                       <a:fillRect/>
                     </a:stretch>
@@ -15778,18 +16049,18 @@
           <wp:inline>
             <wp:extent cx="4800600" cy="2402829"/>
             <wp:effectExtent b="0" l="0" r="0" t="0"/>
-            <wp:docPr descr="EV-C204-041 — Log de Secretos-Gitleaks: leaks found: 4 (aws-access-token y generic-api-key)" title="" id="129" name="Picture"/>
+            <wp:docPr descr="EV-C204-041 — Log de Secretos-Gitleaks: leaks found: 4 (aws-access-token y generic-api-key)" title="" id="130" name="Picture"/>
             <a:graphic>
               <a:graphicData uri="http://schemas.openxmlformats.org/drawingml/2006/picture">
                 <pic:pic>
                   <pic:nvPicPr>
-                    <pic:cNvPr descr="evidencias/capturas/consola-git/EV-C204-041-screenshot-image18.png" id="130" name="Picture"/>
+                    <pic:cNvPr descr="evidencias/capturas/consola-git/EV-C204-041-screenshot-image18.png" id="131" name="Picture"/>
                     <pic:cNvPicPr>
                       <a:picLocks noChangeArrowheads="1" noChangeAspect="1"/>
                     </pic:cNvPicPr>
                   </pic:nvPicPr>
                   <pic:blipFill>
-                    <a:blip r:embed="rId128"/>
+                    <a:blip r:embed="rId129"/>
                     <a:stretch>
                       <a:fillRect/>
                     </a:stretch>
@@ -15890,18 +16161,18 @@
           <wp:inline>
             <wp:extent cx="4800600" cy="2402829"/>
             <wp:effectExtent b="0" l="0" r="0" t="0"/>
-            <wp:docPr descr="EV-C204-042 — Job DAST-OWASP ZAP: exitoso en 2 min 1 s; el valor está en el informe reporte-zap" title="" id="132" name="Picture"/>
+            <wp:docPr descr="EV-C204-042 — Job DAST-OWASP ZAP: exitoso en 2 min 1 s; el valor está en el informe reporte-zap" title="" id="133" name="Picture"/>
             <a:graphic>
               <a:graphicData uri="http://schemas.openxmlformats.org/drawingml/2006/picture">
                 <pic:pic>
                   <pic:nvPicPr>
-                    <pic:cNvPr descr="evidencias/capturas/consola-git/EV-C204-042-screenshot-image19.png" id="133" name="Picture"/>
+                    <pic:cNvPr descr="evidencias/capturas/consola-git/EV-C204-042-screenshot-image19.png" id="134" name="Picture"/>
                     <pic:cNvPicPr>
                       <a:picLocks noChangeArrowheads="1" noChangeAspect="1"/>
                     </pic:cNvPicPr>
                   </pic:nvPicPr>
                   <pic:blipFill>
-                    <a:blip r:embed="rId131"/>
+                    <a:blip r:embed="rId132"/>
                     <a:stretch>
                       <a:fillRect/>
                     </a:stretch>
@@ -15953,8 +16224,8 @@
         <w:t xml:space="preserve">Las capturas EV-C204-037 y EV-C204-039 son la misma página del run #8 tomada en otros momentos («hace 1 hora» y «hace 2 horas») y se conservan como respaldo (Anexo I).</w:t>
       </w:r>
     </w:p>
-    <w:bookmarkEnd w:id="134"/>
-    <w:bookmarkStart w:id="136" w:name="resultados-del-diagnóstico"/>
+    <w:bookmarkEnd w:id="135"/>
+    <w:bookmarkStart w:id="137" w:name="resultados-del-diagnóstico"/>
     <w:p>
       <w:pPr>
         <w:pStyle w:val="Heading3"/>
@@ -16249,7 +16520,7 @@
       <w:r>
         <w:t xml:space="preserve"> </w:t>
       </w:r>
-      <w:hyperlink r:id="rId135">
+      <w:hyperlink r:id="rId136">
         <w:r>
           <w:rPr>
             <w:rStyle w:val="VerbatimChar"/>
@@ -16353,9 +16624,9 @@
         <w:t xml:space="preserve">la revisión de código.</w:t>
       </w:r>
     </w:p>
-    <w:bookmarkEnd w:id="136"/>
     <w:bookmarkEnd w:id="137"/>
-    <w:bookmarkStart w:id="144" w:name="fase-2-remediación-de-rojo-a-verde"/>
+    <w:bookmarkEnd w:id="138"/>
+    <w:bookmarkStart w:id="145" w:name="fase-2-remediación-de-rojo-a-verde"/>
     <w:p>
       <w:pPr>
         <w:pStyle w:val="Heading2"/>
@@ -16364,7 +16635,7 @@
         <w:t xml:space="preserve">14. Fase 2 — Remediación (de rojo a verde)</w:t>
       </w:r>
     </w:p>
-    <w:bookmarkStart w:id="140" w:name="método"/>
+    <w:bookmarkStart w:id="141" w:name="método"/>
     <w:p>
       <w:pPr>
         <w:pStyle w:val="Heading3"/>
@@ -16396,7 +16667,7 @@
       <w:r>
         <w:t xml:space="preserve"> </w:t>
       </w:r>
-      <w:hyperlink r:id="rId138">
+      <w:hyperlink r:id="rId139">
         <w:r>
           <w:rPr>
             <w:rStyle w:val="VerbatimChar"/>
@@ -16410,7 +16681,7 @@
       <w:r>
         <w:t xml:space="preserve"> </w:t>
       </w:r>
-      <w:hyperlink r:id="rId139">
+      <w:hyperlink r:id="rId140">
         <w:r>
           <w:rPr>
             <w:rStyle w:val="VerbatimChar"/>
@@ -16422,8 +16693,8 @@
         <w:t xml:space="preserve">.</w:t>
       </w:r>
     </w:p>
-    <w:bookmarkEnd w:id="140"/>
-    <w:bookmarkStart w:id="141" w:name="recorrido-real-de-rojo-a-verde"/>
+    <w:bookmarkEnd w:id="141"/>
+    <w:bookmarkStart w:id="142" w:name="recorrido-real-de-rojo-a-verde"/>
     <w:p>
       <w:pPr>
         <w:pStyle w:val="Heading3"/>
@@ -17896,8 +18167,8 @@
         <w:t xml:space="preserve">no cerró los CVEs, y dos veces una corrección nueva encendió Semgrep en rojo hasta ajustarla.</w:t>
       </w:r>
     </w:p>
-    <w:bookmarkEnd w:id="141"/>
-    <w:bookmarkStart w:id="142" w:name="X802f1d2677ce5a199922dbac06914387fda5134"/>
+    <w:bookmarkEnd w:id="142"/>
+    <w:bookmarkStart w:id="143" w:name="X802f1d2677ce5a199922dbac06914387fda5134"/>
     <w:p>
       <w:pPr>
         <w:pStyle w:val="Heading3"/>
@@ -18357,8 +18628,8 @@
         <w:t xml:space="preserve">a los artefactos del run.</w:t>
       </w:r>
     </w:p>
-    <w:bookmarkEnd w:id="142"/>
-    <w:bookmarkStart w:id="143" w:name="X90c915205735c26bb30e51af496094beb9c6e7a"/>
+    <w:bookmarkEnd w:id="143"/>
+    <w:bookmarkStart w:id="144" w:name="X90c915205735c26bb30e51af496094beb9c6e7a"/>
     <w:p>
       <w:pPr>
         <w:pStyle w:val="Heading3"/>
@@ -18633,9 +18904,9 @@
         </w:tc>
       </w:tr>
     </w:tbl>
-    <w:bookmarkEnd w:id="143"/>
     <w:bookmarkEnd w:id="144"/>
-    <w:bookmarkStart w:id="145" w:name="protección-de-la-rama-principal"/>
+    <w:bookmarkEnd w:id="145"/>
+    <w:bookmarkStart w:id="146" w:name="protección-de-la-rama-principal"/>
     <w:p>
       <w:pPr>
         <w:pStyle w:val="Heading2"/>
@@ -18914,9 +19185,9 @@
         </w:pict>
       </w:r>
     </w:p>
-    <w:bookmarkEnd w:id="145"/>
     <w:bookmarkEnd w:id="146"/>
-    <w:bookmarkStart w:id="153" w:name="parte-iv-pruebas-y-riesgos"/>
+    <w:bookmarkEnd w:id="147"/>
+    <w:bookmarkStart w:id="154" w:name="parte-iv-pruebas-y-riesgos"/>
     <w:p>
       <w:pPr>
         <w:pStyle w:val="Heading1"/>
@@ -18925,7 +19196,7 @@
         <w:t xml:space="preserve">PARTE IV — PRUEBAS Y RIESGOS</w:t>
       </w:r>
     </w:p>
-    <w:bookmarkStart w:id="148" w:name="cálculo-de-riesgo"/>
+    <w:bookmarkStart w:id="149" w:name="cálculo-de-riesgo"/>
     <w:p>
       <w:pPr>
         <w:pStyle w:val="Heading2"/>
@@ -18960,7 +19231,7 @@
       <w:r>
         <w:t xml:space="preserve"> </w:t>
       </w:r>
-      <w:hyperlink r:id="rId147">
+      <w:hyperlink r:id="rId148">
         <w:r>
           <w:rPr>
             <w:rStyle w:val="VerbatimChar"/>
@@ -19217,8 +19488,8 @@
         <w:t xml:space="preserve">Riesgo residual aceptado: CVEs de util-linux sin parche, falso positivo de ZAP en respuestas 404 y secretos ficticios que permanecen en el historial de git.</w:t>
       </w:r>
     </w:p>
-    <w:bookmarkEnd w:id="148"/>
-    <w:bookmarkStart w:id="150" w:name="documentación-de-pruebas"/>
+    <w:bookmarkEnd w:id="149"/>
+    <w:bookmarkStart w:id="151" w:name="documentación-de-pruebas"/>
     <w:p>
       <w:pPr>
         <w:pStyle w:val="Heading2"/>
@@ -19253,7 +19524,7 @@
       <w:r>
         <w:t xml:space="preserve"> </w:t>
       </w:r>
-      <w:hyperlink r:id="rId149">
+      <w:hyperlink r:id="rId150">
         <w:r>
           <w:rPr>
             <w:rStyle w:val="VerbatimChar"/>
@@ -19615,8 +19886,8 @@
         <w:t xml:space="preserve">P-27 (app móvil) y P-28 (consola de Keycloak en el Codespace).</w:t>
       </w:r>
     </w:p>
-    <w:bookmarkEnd w:id="150"/>
-    <w:bookmarkStart w:id="152" w:name="plantilla-de-diagnóstico-del-curso"/>
+    <w:bookmarkEnd w:id="151"/>
+    <w:bookmarkStart w:id="153" w:name="plantilla-de-diagnóstico-del-curso"/>
     <w:p>
       <w:pPr>
         <w:pStyle w:val="Heading2"/>
@@ -19635,7 +19906,7 @@
       <w:r>
         <w:t xml:space="preserve"> </w:t>
       </w:r>
-      <w:hyperlink r:id="rId151">
+      <w:hyperlink r:id="rId152">
         <w:r>
           <w:rPr>
             <w:rStyle w:val="VerbatimChar"/>
@@ -19657,9 +19928,9 @@
         </w:pict>
       </w:r>
     </w:p>
-    <w:bookmarkEnd w:id="152"/>
     <w:bookmarkEnd w:id="153"/>
-    <w:bookmarkStart w:id="211" w:name="parte-v-cierre-académico"/>
+    <w:bookmarkEnd w:id="154"/>
+    <w:bookmarkStart w:id="212" w:name="parte-v-cierre-académico"/>
     <w:p>
       <w:pPr>
         <w:pStyle w:val="Heading1"/>
@@ -19668,7 +19939,7 @@
         <w:t xml:space="preserve">PARTE V — CIERRE ACADÉMICO</w:t>
       </w:r>
     </w:p>
-    <w:bookmarkStart w:id="154" w:name="resumen-de-resultados"/>
+    <w:bookmarkStart w:id="155" w:name="resumen-de-resultados"/>
     <w:p>
       <w:pPr>
         <w:pStyle w:val="Heading2"/>
@@ -20108,8 +20379,8 @@
         </w:tc>
       </w:tr>
     </w:tbl>
-    <w:bookmarkEnd w:id="154"/>
-    <w:bookmarkStart w:id="155" w:name="conclusiones"/>
+    <w:bookmarkEnd w:id="155"/>
+    <w:bookmarkStart w:id="156" w:name="conclusiones"/>
     <w:p>
       <w:pPr>
         <w:pStyle w:val="Heading2"/>
@@ -20309,8 +20580,8 @@
         <w:t xml:space="preserve">La app móvil y la consola de Keycloak del Codespace no se pudieron verificar en este entorno (pendiente del equipo); las llaves RSA se generan en memoria y se pierden al reiniciar (adecuado para un laboratorio, no para producción).</w:t>
       </w:r>
     </w:p>
-    <w:bookmarkEnd w:id="155"/>
-    <w:bookmarkStart w:id="156" w:name="recomendaciones"/>
+    <w:bookmarkEnd w:id="156"/>
+    <w:bookmarkStart w:id="157" w:name="recomendaciones"/>
     <w:p>
       <w:pPr>
         <w:pStyle w:val="Heading2"/>
@@ -20685,8 +20956,8 @@
         <w:t xml:space="preserve">del código junto al pipeline, dado el hallazgo metodológico de §13.4.</w:t>
       </w:r>
     </w:p>
-    <w:bookmarkEnd w:id="156"/>
-    <w:bookmarkStart w:id="157" w:name="referencias"/>
+    <w:bookmarkEnd w:id="157"/>
+    <w:bookmarkStart w:id="158" w:name="referencias"/>
     <w:p>
       <w:pPr>
         <w:pStyle w:val="Heading2"/>
@@ -21081,8 +21352,8 @@
         </w:pict>
       </w:r>
     </w:p>
-    <w:bookmarkEnd w:id="157"/>
-    <w:bookmarkStart w:id="158" w:name="cobertura-de-la-rúbrica-del-proyecto"/>
+    <w:bookmarkEnd w:id="158"/>
+    <w:bookmarkStart w:id="159" w:name="cobertura-de-la-rúbrica-del-proyecto"/>
     <w:p>
       <w:pPr>
         <w:pStyle w:val="Heading2"/>
@@ -21580,8 +21851,8 @@
         </w:pict>
       </w:r>
     </w:p>
-    <w:bookmarkEnd w:id="158"/>
-    <w:bookmarkStart w:id="159" w:name="anexos"/>
+    <w:bookmarkEnd w:id="159"/>
+    <w:bookmarkStart w:id="160" w:name="anexos"/>
     <w:p>
       <w:pPr>
         <w:pStyle w:val="Heading2"/>
@@ -21817,8 +22088,8 @@
         </w:pict>
       </w:r>
     </w:p>
-    <w:bookmarkEnd w:id="159"/>
-    <w:bookmarkStart w:id="198" w:name="anexo-a-tablas-16-completas"/>
+    <w:bookmarkEnd w:id="160"/>
+    <w:bookmarkStart w:id="199" w:name="anexo-a-tablas-16-completas"/>
     <w:p>
       <w:pPr>
         <w:pStyle w:val="Heading2"/>
@@ -21827,7 +22098,7 @@
         <w:t xml:space="preserve">Anexo A — Tablas 1–6 completas</w:t>
       </w:r>
     </w:p>
-    <w:bookmarkStart w:id="165" w:name="tabla-1-requisitos-de-seguridad"/>
+    <w:bookmarkStart w:id="166" w:name="tabla-1-requisitos-de-seguridad"/>
     <w:p>
       <w:pPr>
         <w:pStyle w:val="Heading3"/>
@@ -21866,7 +22137,7 @@
         <w:t xml:space="preserve">Marco de referencia: OWASP SAMM, NIST SSDF, OWASP ASVS y OWASP MASVS.</w:t>
       </w:r>
     </w:p>
-    <w:bookmarkStart w:id="160" w:name="requisitos-de-seguridad"/>
+    <w:bookmarkStart w:id="161" w:name="requisitos-de-seguridad"/>
     <w:p>
       <w:pPr>
         <w:pStyle w:val="Heading4"/>
@@ -22268,8 +22539,8 @@
         </w:tc>
       </w:tr>
     </w:tbl>
-    <w:bookmarkEnd w:id="160"/>
-    <w:bookmarkStart w:id="161" w:name="justificación-de-cada-requisito-por-qué"/>
+    <w:bookmarkEnd w:id="161"/>
+    <w:bookmarkStart w:id="162" w:name="justificación-de-cada-requisito-por-qué"/>
     <w:p>
       <w:pPr>
         <w:pStyle w:val="Heading4"/>
@@ -22400,8 +22671,8 @@
         <w:t xml:space="preserve">Para operaciones sensibles, debe quedar evidencia de quién hizo qué y cuándo. La bitácora permite auditoría y detección de abusos. Se documenta como requisito adicional para exceder el alcance mínimo (CIA + autenticación).</w:t>
       </w:r>
     </w:p>
-    <w:bookmarkEnd w:id="161"/>
-    <w:bookmarkStart w:id="162" w:name="mapeo-con-estándares"/>
+    <w:bookmarkEnd w:id="162"/>
+    <w:bookmarkStart w:id="163" w:name="mapeo-con-estándares"/>
     <w:p>
       <w:pPr>
         <w:pStyle w:val="Heading4"/>
@@ -22800,8 +23071,8 @@
         </w:tc>
       </w:tr>
     </w:tbl>
-    <w:bookmarkEnd w:id="162"/>
-    <w:bookmarkStart w:id="163" w:name="X666b4e7d9d99764e434239e12ace7d4bf548d22"/>
+    <w:bookmarkEnd w:id="163"/>
+    <w:bookmarkStart w:id="164" w:name="X666b4e7d9d99764e434239e12ace7d4bf548d22"/>
     <w:p>
       <w:pPr>
         <w:pStyle w:val="Heading4"/>
@@ -23101,8 +23372,8 @@
         </w:tc>
       </w:tr>
     </w:tbl>
-    <w:bookmarkEnd w:id="163"/>
-    <w:bookmarkStart w:id="164" w:name="nota-de-trazabilidad"/>
+    <w:bookmarkEnd w:id="164"/>
+    <w:bookmarkStart w:id="165" w:name="nota-de-trazabilidad"/>
     <w:p>
       <w:pPr>
         <w:pStyle w:val="Heading4"/>
@@ -23119,9 +23390,9 @@
         <w:t xml:space="preserve">Esta tabla alimenta: informe §5, Tabla 2 (STRIDE — los controles responden a las amenazas), Tabla 5 (riesgo — los requisitos priorizan las mitigaciones) y Tabla 6 (pruebas — cada requisito tiene su prueba de verificación).</w:t>
       </w:r>
     </w:p>
-    <w:bookmarkEnd w:id="164"/>
     <w:bookmarkEnd w:id="165"/>
-    <w:bookmarkStart w:id="171" w:name="tabla-2-amenazas-stride"/>
+    <w:bookmarkEnd w:id="166"/>
+    <w:bookmarkStart w:id="172" w:name="tabla-2-amenazas-stride"/>
     <w:p>
       <w:pPr>
         <w:pStyle w:val="Heading3"/>
@@ -23154,7 +23425,7 @@
         <w:t xml:space="preserve">— Primer Avance. Modelado de amenazas con STRIDE (Microsoft): por cada amenaza, qué componente afecta, un ejemplo de ataque y cómo se frena.</w:t>
       </w:r>
     </w:p>
-    <w:bookmarkStart w:id="166" w:name="amenazas-stride-1"/>
+    <w:bookmarkStart w:id="167" w:name="amenazas-stride-1"/>
     <w:p>
       <w:pPr>
         <w:pStyle w:val="Heading4"/>
@@ -23587,8 +23858,8 @@
         </w:tc>
       </w:tr>
     </w:tbl>
-    <w:bookmarkEnd w:id="166"/>
-    <w:bookmarkStart w:id="167" w:name="severidad-estimada-por-amenaza"/>
+    <w:bookmarkEnd w:id="167"/>
+    <w:bookmarkStart w:id="168" w:name="severidad-estimada-por-amenaza"/>
     <w:p>
       <w:pPr>
         <w:pStyle w:val="Heading4"/>
@@ -23931,8 +24202,8 @@
         </w:tc>
       </w:tr>
     </w:tbl>
-    <w:bookmarkEnd w:id="167"/>
-    <w:bookmarkStart w:id="168" w:name="X4136c939b174cf6b5602bf7d696b7a729574dcc"/>
+    <w:bookmarkEnd w:id="168"/>
+    <w:bookmarkStart w:id="169" w:name="X4136c939b174cf6b5602bf7d696b7a729574dcc"/>
     <w:p>
       <w:pPr>
         <w:pStyle w:val="Heading4"/>
@@ -24503,8 +24774,8 @@
         </w:tc>
       </w:tr>
     </w:tbl>
-    <w:bookmarkEnd w:id="168"/>
-    <w:bookmarkStart w:id="169" w:name="mapeo-a-cwe-para-cruzar-con-la-tabla-3"/>
+    <w:bookmarkEnd w:id="169"/>
+    <w:bookmarkStart w:id="170" w:name="mapeo-a-cwe-para-cruzar-con-la-tabla-3"/>
     <w:p>
       <w:pPr>
         <w:pStyle w:val="Heading4"/>
@@ -24813,8 +25084,8 @@
         </w:tc>
       </w:tr>
     </w:tbl>
-    <w:bookmarkEnd w:id="169"/>
-    <w:bookmarkStart w:id="170" w:name="nota-de-trazabilidad-1"/>
+    <w:bookmarkEnd w:id="170"/>
+    <w:bookmarkStart w:id="171" w:name="nota-de-trazabilidad-1"/>
     <w:p>
       <w:pPr>
         <w:pStyle w:val="Heading4"/>
@@ -24831,9 +25102,9 @@
         <w:t xml:space="preserve">Esta tabla alimenta: informe §6, Tabla 3 (los hallazgos de Fase 1 se clasifican por amenaza/CWE), Tabla 5 (riesgo — la severidad aquí se cuantifica con P×I) y Tabla 6 (las pruebas de verificación de esta tabla se ejecutan y documentan).</w:t>
       </w:r>
     </w:p>
-    <w:bookmarkEnd w:id="170"/>
     <w:bookmarkEnd w:id="171"/>
-    <w:bookmarkStart w:id="177" w:name="X88e3b57aa7f7cbbca5e2ce00a2ca14142f424a2"/>
+    <w:bookmarkEnd w:id="172"/>
+    <w:bookmarkStart w:id="178" w:name="X88e3b57aa7f7cbbca5e2ce00a2ca14142f424a2"/>
     <w:p>
       <w:pPr>
         <w:pStyle w:val="Heading3"/>
@@ -24888,7 +25159,7 @@
         <w:t xml:space="preserve">, código oficial sin remediar), descargada de GitHub Actions. Es la única corrida que refleja el proyecto tal como llegó, antes de corregir. Reportes: EV-C204-020/021/022 (zips de artefactos), EV-C204-027 (SBOM) y EV-C204-028 (log de los jobs en rojo); capturas de pantalla EV-C204-033 a EV-C204-051.</w:t>
       </w:r>
     </w:p>
-    <w:bookmarkStart w:id="172" w:name="resultado-por-prueba"/>
+    <w:bookmarkStart w:id="173" w:name="resultado-por-prueba"/>
     <w:p>
       <w:pPr>
         <w:pStyle w:val="Heading4"/>
@@ -25339,8 +25610,8 @@
         </w:tc>
       </w:tr>
     </w:tbl>
-    <w:bookmarkEnd w:id="172"/>
-    <w:bookmarkStart w:id="173" w:name="hallazgos-h-01-a-h-15"/>
+    <w:bookmarkEnd w:id="173"/>
+    <w:bookmarkStart w:id="174" w:name="hallazgos-h-01-a-h-15"/>
     <w:p>
       <w:pPr>
         <w:pStyle w:val="Heading4"/>
@@ -27371,8 +27642,8 @@
         <w:t xml:space="preserve">: por eso la revisión manual del código sigue siendo necesaria además del pipeline.</w:t>
       </w:r>
     </w:p>
-    <w:bookmarkEnd w:id="173"/>
-    <w:bookmarkStart w:id="174" w:name="dónde-encontrar-cada-hallazgo"/>
+    <w:bookmarkEnd w:id="174"/>
+    <w:bookmarkStart w:id="175" w:name="dónde-encontrar-cada-hallazgo"/>
     <w:p>
       <w:pPr>
         <w:pStyle w:val="Heading4"/>
@@ -27660,8 +27931,8 @@
         </w:tc>
       </w:tr>
     </w:tbl>
-    <w:bookmarkEnd w:id="174"/>
-    <w:bookmarkStart w:id="175" w:name="evidencia-descargada-fase-1"/>
+    <w:bookmarkEnd w:id="175"/>
+    <w:bookmarkStart w:id="176" w:name="evidencia-descargada-fase-1"/>
     <w:p>
       <w:pPr>
         <w:pStyle w:val="Heading4"/>
@@ -27852,8 +28123,8 @@
         <w:t xml:space="preserve">porque el job de CodeQL avanzado no llegó a publicar alertas; las alertas de CodeQL de la Fase 2 están en EV-C204-025.</w:t>
       </w:r>
     </w:p>
-    <w:bookmarkEnd w:id="175"/>
-    <w:bookmarkStart w:id="176" w:name="registro-de-confirmación"/>
+    <w:bookmarkEnd w:id="176"/>
+    <w:bookmarkStart w:id="177" w:name="registro-de-confirmación"/>
     <w:p>
       <w:pPr>
         <w:pStyle w:val="Heading4"/>
@@ -27902,9 +28173,9 @@
         <w:t xml:space="preserve">(H-06, H-10, H-12, H-16); H-15 es un falso positivo documentado. Ningún hallazgo esperado quedó sin evidencia de alguna de las dos fuentes.</w:t>
       </w:r>
     </w:p>
-    <w:bookmarkEnd w:id="176"/>
     <w:bookmarkEnd w:id="177"/>
-    <w:bookmarkStart w:id="180" w:name="X37972edf4fadebafaabacd263fa60fae156b3b2"/>
+    <w:bookmarkEnd w:id="178"/>
+    <w:bookmarkStart w:id="181" w:name="X37972edf4fadebafaabacd263fa60fae156b3b2"/>
     <w:p>
       <w:pPr>
         <w:pStyle w:val="Heading3"/>
@@ -27977,7 +28248,7 @@
         <w:t xml:space="preserve">, 5/5 jobs en verde y CodeQL con 0 alertas abiertas, EV-C204-026 y EV-C204-025).</w:t>
       </w:r>
     </w:p>
-    <w:bookmarkStart w:id="178" w:name="evidencia-antesdespués-por-hallazgo"/>
+    <w:bookmarkStart w:id="179" w:name="evidencia-antesdespués-por-hallazgo"/>
     <w:p>
       <w:pPr>
         <w:pStyle w:val="Heading4"/>
@@ -29824,8 +30095,8 @@
         </w:tc>
       </w:tr>
     </w:tbl>
-    <w:bookmarkEnd w:id="178"/>
-    <w:bookmarkStart w:id="179" w:name="Xcafc4bbed3100adc00f4dde4e229385ac3cc079"/>
+    <w:bookmarkEnd w:id="179"/>
+    <w:bookmarkStart w:id="180" w:name="Xcafc4bbed3100adc00f4dde4e229385ac3cc079"/>
     <w:p>
       <w:pPr>
         <w:pStyle w:val="Heading4"/>
@@ -30793,9 +31064,9 @@
         <w:t xml:space="preserve">.</w:t>
       </w:r>
     </w:p>
-    <w:bookmarkEnd w:id="179"/>
     <w:bookmarkEnd w:id="180"/>
-    <w:bookmarkStart w:id="189" w:name="tabla-5-cálculo-de-riesgo"/>
+    <w:bookmarkEnd w:id="181"/>
+    <w:bookmarkStart w:id="190" w:name="tabla-5-cálculo-de-riesgo"/>
     <w:p>
       <w:pPr>
         <w:pStyle w:val="Heading3"/>
@@ -30854,7 +31125,7 @@
         <w:t xml:space="preserve">con la evidencia de la corrida verde 35442482331 (Tabla 4). Los valores de P e I son un juicio fundamentado del equipo con la escala documentada abajo; no son mediciones.</w:t>
       </w:r>
     </w:p>
-    <w:bookmarkStart w:id="181" w:name="metodología-1"/>
+    <w:bookmarkStart w:id="182" w:name="metodología-1"/>
     <w:p>
       <w:pPr>
         <w:pStyle w:val="Heading4"/>
@@ -31086,8 +31357,8 @@
         <w:t xml:space="preserve">Bajo (1–2) · Medio (3–4) · Alto (6–9)</w:t>
       </w:r>
     </w:p>
-    <w:bookmarkEnd w:id="181"/>
-    <w:bookmarkStart w:id="182" w:name="X5c4b44931359586bf6fdcf229fcfeb0dad2479a"/>
+    <w:bookmarkEnd w:id="182"/>
+    <w:bookmarkStart w:id="183" w:name="X5c4b44931359586bf6fdcf229fcfeb0dad2479a"/>
     <w:p>
       <w:pPr>
         <w:pStyle w:val="Heading4"/>
@@ -33095,8 +33366,8 @@
         <w:t xml:space="preserve">. Ningún riesgo llega a 1 porque el impacto potencial del activo no cambia con la corrección; solo baja la probabilidad.</w:t>
       </w:r>
     </w:p>
-    <w:bookmarkEnd w:id="182"/>
-    <w:bookmarkStart w:id="185" w:name="análisis-gerencial-complementario"/>
+    <w:bookmarkEnd w:id="183"/>
+    <w:bookmarkStart w:id="186" w:name="análisis-gerencial-complementario"/>
     <w:p>
       <w:pPr>
         <w:pStyle w:val="Heading4"/>
@@ -33105,7 +33376,7 @@
         <w:t xml:space="preserve">Análisis gerencial complementario</w:t>
       </w:r>
     </w:p>
-    <w:bookmarkStart w:id="183" w:name="pérdida-anual-esperada-ale"/>
+    <w:bookmarkStart w:id="184" w:name="pérdida-anual-esperada-ale"/>
     <w:p>
       <w:pPr>
         <w:pStyle w:val="Heading5"/>
@@ -33787,8 +34058,8 @@
         <w:t xml:space="preserve">para el laboratorio académico (no hay un negocio real detrás) y se ajustarían con datos del contexto si el docente lo solicita. La tasa ARO «después» es una estimación del equipo tras los controles verificados.</w:t>
       </w:r>
     </w:p>
-    <w:bookmarkEnd w:id="183"/>
-    <w:bookmarkStart w:id="184" w:name="justificación-de-probabilidades"/>
+    <w:bookmarkEnd w:id="184"/>
+    <w:bookmarkStart w:id="185" w:name="justificación-de-probabilidades"/>
     <w:p>
       <w:pPr>
         <w:pStyle w:val="Heading5"/>
@@ -33944,9 +34215,9 @@
         <w:t xml:space="preserve">P=3: cualquiera puede repetir peticiones sin límite; impacto 2 (abuso del servicio como oráculo o saturación).</w:t>
       </w:r>
     </w:p>
-    <w:bookmarkEnd w:id="184"/>
     <w:bookmarkEnd w:id="185"/>
-    <w:bookmarkStart w:id="186" w:name="priorización-y-decisiones"/>
+    <w:bookmarkEnd w:id="186"/>
+    <w:bookmarkStart w:id="187" w:name="priorización-y-decisiones"/>
     <w:p>
       <w:pPr>
         <w:pStyle w:val="Heading4"/>
@@ -34007,8 +34278,8 @@
         <w:t xml:space="preserve">.</w:t>
       </w:r>
     </w:p>
-    <w:bookmarkEnd w:id="186"/>
-    <w:bookmarkStart w:id="187" w:name="riesgo-residual-aceptado"/>
+    <w:bookmarkEnd w:id="187"/>
+    <w:bookmarkStart w:id="188" w:name="riesgo-residual-aceptado"/>
     <w:p>
       <w:pPr>
         <w:pStyle w:val="Heading4"/>
@@ -34095,8 +34366,8 @@
         <w:t xml:space="preserve">: los valores de práctica siguen en el historial de git; son ficticios. En un proyecto real habría que rotarlos y reescribir el historial.</w:t>
       </w:r>
     </w:p>
-    <w:bookmarkEnd w:id="187"/>
-    <w:bookmarkStart w:id="188" w:name="nota-de-trazabilidad-2"/>
+    <w:bookmarkEnd w:id="188"/>
+    <w:bookmarkStart w:id="189" w:name="nota-de-trazabilidad-2"/>
     <w:p>
       <w:pPr>
         <w:pStyle w:val="Heading4"/>
@@ -34113,9 +34384,9 @@
         <w:t xml:space="preserve">Esta tabla alimenta: informe §16, la plantilla de diagnóstico y la Tabla 4.</w:t>
       </w:r>
     </w:p>
-    <w:bookmarkEnd w:id="188"/>
     <w:bookmarkEnd w:id="189"/>
-    <w:bookmarkStart w:id="197" w:name="tabla-6-documentación-de-pruebas"/>
+    <w:bookmarkEnd w:id="190"/>
+    <w:bookmarkStart w:id="198" w:name="tabla-6-documentación-de-pruebas"/>
     <w:p>
       <w:pPr>
         <w:pStyle w:val="Heading3"/>
@@ -34224,7 +34495,7 @@
         <w:t xml:space="preserve">0).</w:t>
       </w:r>
     </w:p>
-    <w:bookmarkStart w:id="190" w:name="pruebas-funcionales-del-servicio"/>
+    <w:bookmarkStart w:id="191" w:name="pruebas-funcionales-del-servicio"/>
     <w:p>
       <w:pPr>
         <w:pStyle w:val="Heading4"/>
@@ -35473,8 +35744,8 @@
         </w:tc>
       </w:tr>
     </w:tbl>
-    <w:bookmarkEnd w:id="190"/>
-    <w:bookmarkStart w:id="191" w:name="pruebas-del-pipeline-github-actions"/>
+    <w:bookmarkEnd w:id="191"/>
+    <w:bookmarkStart w:id="192" w:name="pruebas-del-pipeline-github-actions"/>
     <w:p>
       <w:pPr>
         <w:pStyle w:val="Heading4"/>
@@ -35960,8 +36231,8 @@
         </w:tc>
       </w:tr>
     </w:tbl>
-    <w:bookmarkEnd w:id="191"/>
-    <w:bookmarkStart w:id="192" w:name="pruebas-de-pentest-manual"/>
+    <w:bookmarkEnd w:id="192"/>
+    <w:bookmarkStart w:id="193" w:name="pruebas-de-pentest-manual"/>
     <w:p>
       <w:pPr>
         <w:pStyle w:val="Heading4"/>
@@ -36881,8 +37152,8 @@
         </w:tc>
       </w:tr>
     </w:tbl>
-    <w:bookmarkEnd w:id="192"/>
-    <w:bookmarkStart w:id="193" w:name="X207d9e294f25d3c7c9d023b75d8e86673560f2f"/>
+    <w:bookmarkEnd w:id="193"/>
+    <w:bookmarkStart w:id="194" w:name="X207d9e294f25d3c7c9d023b75d8e86673560f2f"/>
     <w:p>
       <w:pPr>
         <w:pStyle w:val="Heading4"/>
@@ -37375,8 +37646,8 @@
         </w:tc>
       </w:tr>
     </w:tbl>
-    <w:bookmarkEnd w:id="193"/>
-    <w:bookmarkStart w:id="194" w:name="ajustes-de-pruebas-realizados"/>
+    <w:bookmarkEnd w:id="194"/>
+    <w:bookmarkStart w:id="195" w:name="ajustes-de-pruebas-realizados"/>
     <w:p>
       <w:pPr>
         <w:pStyle w:val="Heading4"/>
@@ -37635,8 +37906,8 @@
         <w:t xml:space="preserve">la primera prueba de expiración esperó 8 s con tokens de 5 s y aceptó el token, porque el servicio tolera 5 s de desfase de reloj. No era un fallo del servicio: se ajustó la espera a 12 s.</w:t>
       </w:r>
     </w:p>
-    <w:bookmarkEnd w:id="194"/>
-    <w:bookmarkStart w:id="195" w:name="X267b18a9dacca8e9e870fac5000f4897318d54f"/>
+    <w:bookmarkEnd w:id="195"/>
+    <w:bookmarkStart w:id="196" w:name="X267b18a9dacca8e9e870fac5000f4897318d54f"/>
     <w:p>
       <w:pPr>
         <w:pStyle w:val="Heading4"/>
@@ -37862,8 +38133,8 @@
         </w:tc>
       </w:tr>
     </w:tbl>
-    <w:bookmarkEnd w:id="195"/>
-    <w:bookmarkStart w:id="196" w:name="nota-de-trazabilidad-3"/>
+    <w:bookmarkEnd w:id="196"/>
+    <w:bookmarkStart w:id="197" w:name="nota-de-trazabilidad-3"/>
     <w:p>
       <w:pPr>
         <w:pStyle w:val="Heading4"/>
@@ -37887,10 +38158,10 @@
         </w:pict>
       </w:r>
     </w:p>
-    <w:bookmarkEnd w:id="196"/>
     <w:bookmarkEnd w:id="197"/>
     <w:bookmarkEnd w:id="198"/>
-    <w:bookmarkStart w:id="199" w:name="anexo-b-reportes-del-pipeline"/>
+    <w:bookmarkEnd w:id="199"/>
+    <w:bookmarkStart w:id="200" w:name="anexo-b-reportes-del-pipeline"/>
     <w:p>
       <w:pPr>
         <w:pStyle w:val="Heading2"/>
@@ -38317,8 +38588,8 @@
         </w:pict>
       </w:r>
     </w:p>
-    <w:bookmarkEnd w:id="199"/>
-    <w:bookmarkStart w:id="200" w:name="anexo-c-manifiesto-sha-256"/>
+    <w:bookmarkEnd w:id="200"/>
+    <w:bookmarkStart w:id="201" w:name="anexo-c-manifiesto-sha-256"/>
     <w:p>
       <w:pPr>
         <w:pStyle w:val="Heading2"/>
@@ -38458,8 +38729,8 @@
         </w:pict>
       </w:r>
     </w:p>
-    <w:bookmarkEnd w:id="200"/>
-    <w:bookmarkStart w:id="201" w:name="X1192fa1c2e07773af67639ba7cbc366731d2a91"/>
+    <w:bookmarkEnd w:id="201"/>
+    <w:bookmarkStart w:id="202" w:name="X1192fa1c2e07773af67639ba7cbc366731d2a91"/>
     <w:p>
       <w:pPr>
         <w:pStyle w:val="Heading2"/>
@@ -39782,8 +40053,8 @@
         </w:pict>
       </w:r>
     </w:p>
-    <w:bookmarkEnd w:id="201"/>
-    <w:bookmarkStart w:id="202" w:name="anexo-e-cronograma-del-proyecto"/>
+    <w:bookmarkEnd w:id="202"/>
+    <w:bookmarkStart w:id="203" w:name="anexo-e-cronograma-del-proyecto"/>
     <w:p>
       <w:pPr>
         <w:pStyle w:val="Heading2"/>
@@ -40378,8 +40649,8 @@
         </w:pict>
       </w:r>
     </w:p>
-    <w:bookmarkEnd w:id="202"/>
-    <w:bookmarkStart w:id="206" w:name="X97195745177c874f01ad80e4dce35521f49f2f2"/>
+    <w:bookmarkEnd w:id="203"/>
+    <w:bookmarkStart w:id="207" w:name="X97195745177c874f01ad80e4dce35521f49f2f2"/>
     <w:p>
       <w:pPr>
         <w:pStyle w:val="Heading2"/>
@@ -40388,7 +40659,7 @@
         <w:t xml:space="preserve">Anexo F — Guía de lectura (evidencias, siglas y archivos)</w:t>
       </w:r>
     </w:p>
-    <w:bookmarkStart w:id="203" w:name="sistema-de-evidencias"/>
+    <w:bookmarkStart w:id="204" w:name="sistema-de-evidencias"/>
     <w:p>
       <w:pPr>
         <w:pStyle w:val="Heading3"/>
@@ -40463,8 +40734,8 @@
         <w:t xml:space="preserve">registra el SHA-256 de cada una (Anexo C).</w:t>
       </w:r>
     </w:p>
-    <w:bookmarkEnd w:id="203"/>
-    <w:bookmarkStart w:id="204" w:name="siglas-usadas"/>
+    <w:bookmarkEnd w:id="204"/>
+    <w:bookmarkStart w:id="205" w:name="siglas-usadas"/>
     <w:p>
       <w:pPr>
         <w:pStyle w:val="Heading3"/>
@@ -40826,8 +41097,8 @@
         </w:tc>
       </w:tr>
     </w:tbl>
-    <w:bookmarkEnd w:id="204"/>
-    <w:bookmarkStart w:id="205" w:name="archivos-clave"/>
+    <w:bookmarkEnd w:id="205"/>
+    <w:bookmarkStart w:id="206" w:name="archivos-clave"/>
     <w:p>
       <w:pPr>
         <w:pStyle w:val="Heading3"/>
@@ -40844,8 +41115,8 @@
         <w:jc w:val="start"/>
       </w:tblPr>
       <w:tblGrid>
-        <w:gridCol w:w="4435"/>
-        <w:gridCol w:w="3484"/>
+        <w:gridCol w:w="4118"/>
+        <w:gridCol w:w="3801"/>
       </w:tblGrid>
       <w:tr>
         <w:trPr>
@@ -41031,6 +41302,50 @@
               <w:rPr>
                 <w:rStyle w:val="VerbatimChar"/>
               </w:rPr>
+              <w:t xml:space="preserve">docs/reporte-docente-devcontainer.md</w:t>
+            </w:r>
+          </w:p>
+        </w:tc>
+        <w:tc>
+          <w:tcPr/>
+          <w:p>
+            <w:pPr>
+              <w:pStyle w:val="Compact"/>
+              <w:jc w:val="left"/>
+            </w:pPr>
+            <w:r>
+              <w:t xml:space="preserve">Reporte a la docente sobre el</w:t>
+            </w:r>
+            <w:r>
+              <w:t xml:space="preserve"> </w:t>
+            </w:r>
+            <w:r>
+              <w:rPr>
+                <w:rStyle w:val="VerbatimChar"/>
+              </w:rPr>
+              <w:t xml:space="preserve">devcontainer.json</w:t>
+            </w:r>
+            <w:r>
+              <w:t xml:space="preserve"> </w:t>
+            </w:r>
+            <w:r>
+              <w:t xml:space="preserve">del zip oficial</w:t>
+            </w:r>
+          </w:p>
+        </w:tc>
+      </w:tr>
+      <w:tr>
+        <w:tc>
+          <w:tcPr/>
+          <w:p>
+            <w:pPr>
+              <w:pStyle w:val="Compact"/>
+              <w:jc w:val="left"/>
+            </w:pPr>
+            <w:r>
+              <w:rPr>
+                <w:rStyle w:val="VerbatimChar"/>
+              </w:rPr>
               <w:t xml:space="preserve">docs/remediacion-playbook.md</w:t>
             </w:r>
           </w:p>
@@ -41254,9 +41569,9 @@
         </w:pict>
       </w:r>
     </w:p>
-    <w:bookmarkEnd w:id="205"/>
     <w:bookmarkEnd w:id="206"/>
-    <w:bookmarkStart w:id="207" w:name="anexo-g-glosario-y-convenciones"/>
+    <w:bookmarkEnd w:id="207"/>
+    <w:bookmarkStart w:id="208" w:name="anexo-g-glosario-y-convenciones"/>
     <w:p>
       <w:pPr>
         <w:pStyle w:val="Heading2"/>
@@ -41623,8 +41938,8 @@
         </w:pict>
       </w:r>
     </w:p>
-    <w:bookmarkEnd w:id="207"/>
-    <w:bookmarkStart w:id="208" w:name="anexo-h-nota-de-transparencia-ia"/>
+    <w:bookmarkEnd w:id="208"/>
+    <w:bookmarkStart w:id="209" w:name="anexo-h-nota-de-transparencia-ia"/>
     <w:p>
       <w:pPr>
         <w:pStyle w:val="Heading2"/>
@@ -41677,8 +41992,8 @@
         </w:pict>
       </w:r>
     </w:p>
-    <w:bookmarkEnd w:id="208"/>
-    <w:bookmarkStart w:id="209" w:name="Xf921bb8221ffe1af72098ef1de4d7827c2de6ff"/>
+    <w:bookmarkEnd w:id="209"/>
+    <w:bookmarkStart w:id="210" w:name="Xf921bb8221ffe1af72098ef1de4d7827c2de6ff"/>
     <w:p>
       <w:pPr>
         <w:pStyle w:val="Heading2"/>
@@ -43208,8 +43523,8 @@
         </w:pict>
       </w:r>
     </w:p>
-    <w:bookmarkEnd w:id="209"/>
-    <w:bookmarkStart w:id="210" w:name="anexo-j-cómo-verificar-este-informe"/>
+    <w:bookmarkEnd w:id="210"/>
+    <w:bookmarkStart w:id="211" w:name="anexo-j-cómo-verificar-este-informe"/>
     <w:p>
       <w:pPr>
         <w:pStyle w:val="Heading2"/>
@@ -43455,8 +43770,8 @@
         <w:t xml:space="preserve">).</w:t>
       </w:r>
     </w:p>
-    <w:bookmarkEnd w:id="210"/>
     <w:bookmarkEnd w:id="211"/>
+    <w:bookmarkEnd w:id="212"/>
     <w:sectPr/>
   </w:body>
 </w:document>

</xml_diff>

<commit_message>
docs(evidencias): EV-012, EV-013, EV-014 y EV-030 (ruleset proteger-main) incorporadas al informe
Capturas del equipo (via ChatGPT en navegador): pipeline verde run #27, alertas CodeQL
(0 abiertas, 3 cerradas) y rulesets. Configuracion real del ruleset obtenida por API.
Informe, README de evidencias, auditoria, plan y validacion actualizados; manifiesto 85 entradas.

Co-Authored-By: Claude Sonnet 5 <noreply@anthropic.com>
</commit_message>
<xml_diff>
--- a/docs/evidencias/informe-maestro.docx
+++ b/docs/evidencias/informe-maestro.docx
@@ -1439,22 +1439,40 @@
               <w:jc w:val="left"/>
             </w:pPr>
             <w:r>
-              <w:t xml:space="preserve">Alertas CodeQL (Code scanning)</w:t>
-            </w:r>
-          </w:p>
-        </w:tc>
-        <w:tc>
-          <w:tcPr/>
-          <w:p>
-            <w:pPr>
-              <w:pStyle w:val="Compact"/>
-              <w:jc w:val="left"/>
-            </w:pPr>
-            <w:r>
-              <w:rPr>
-                <w:rStyle w:val="VerbatimChar"/>
-              </w:rPr>
-              <w:t xml:space="preserve">capturas/EV-C204-025-codeql-alertas.json</w:t>
+              <w:t xml:space="preserve">Alertas CodeQL (Code scanning): 0 abiertas, 3 cerradas</w:t>
+            </w:r>
+          </w:p>
+        </w:tc>
+        <w:tc>
+          <w:tcPr/>
+          <w:p>
+            <w:pPr>
+              <w:pStyle w:val="Compact"/>
+              <w:jc w:val="left"/>
+            </w:pPr>
+            <w:r>
+              <w:rPr>
+                <w:rStyle w:val="VerbatimChar"/>
+              </w:rPr>
+              <w:t xml:space="preserve">capturas/EV-C204-012-codeql-alertas.png</w:t>
+            </w:r>
+            <w:r>
+              <w:t xml:space="preserve"> </w:t>
+            </w:r>
+            <w:r>
+              <w:t xml:space="preserve">(+ datos:</w:t>
+            </w:r>
+            <w:r>
+              <w:t xml:space="preserve"> </w:t>
+            </w:r>
+            <w:r>
+              <w:rPr>
+                <w:rStyle w:val="VerbatimChar"/>
+              </w:rPr>
+              <w:t xml:space="preserve">EV-C204-025-codeql-alertas.json</w:t>
+            </w:r>
+            <w:r>
+              <w:t xml:space="preserve">)</w:t>
             </w:r>
           </w:p>
         </w:tc>
@@ -1492,34 +1510,52 @@
               <w:jc w:val="left"/>
             </w:pPr>
             <w:r>
-              <w:t xml:space="preserve">Pipeline Fase 2 (todo verde)</w:t>
-            </w:r>
-          </w:p>
-        </w:tc>
-        <w:tc>
-          <w:tcPr/>
-          <w:p>
-            <w:pPr>
-              <w:pStyle w:val="Compact"/>
-              <w:jc w:val="left"/>
-            </w:pPr>
-            <w:r>
-              <w:rPr>
-                <w:rStyle w:val="VerbatimChar"/>
-              </w:rPr>
-              <w:t xml:space="preserve">capturas/EV-C204-026-run-verde.txt</w:t>
-            </w:r>
-          </w:p>
-        </w:tc>
-        <w:tc>
-          <w:tcPr/>
-          <w:p>
-            <w:pPr>
-              <w:pStyle w:val="Compact"/>
-              <w:jc w:val="left"/>
-            </w:pPr>
-            <w:r>
-              <w:t xml:space="preserve">✅ transcripción; captura de pantalla: pendiente del equipo</w:t>
+              <w:t xml:space="preserve">Pipeline Fase 2 (todo verde), run #27 (35442482331)</w:t>
+            </w:r>
+          </w:p>
+        </w:tc>
+        <w:tc>
+          <w:tcPr/>
+          <w:p>
+            <w:pPr>
+              <w:pStyle w:val="Compact"/>
+              <w:jc w:val="left"/>
+            </w:pPr>
+            <w:r>
+              <w:rPr>
+                <w:rStyle w:val="VerbatimChar"/>
+              </w:rPr>
+              <w:t xml:space="preserve">capturas/EV-C204-013-pipeline-verde.png</w:t>
+            </w:r>
+            <w:r>
+              <w:t xml:space="preserve"> </w:t>
+            </w:r>
+            <w:r>
+              <w:t xml:space="preserve">(+ transcripción:</w:t>
+            </w:r>
+            <w:r>
+              <w:t xml:space="preserve"> </w:t>
+            </w:r>
+            <w:r>
+              <w:rPr>
+                <w:rStyle w:val="VerbatimChar"/>
+              </w:rPr>
+              <w:t xml:space="preserve">EV-C204-026-run-verde.txt</w:t>
+            </w:r>
+            <w:r>
+              <w:t xml:space="preserve">)</w:t>
+            </w:r>
+          </w:p>
+        </w:tc>
+        <w:tc>
+          <w:tcPr/>
+          <w:p>
+            <w:pPr>
+              <w:pStyle w:val="Compact"/>
+              <w:jc w:val="left"/>
+            </w:pPr>
+            <w:r>
+              <w:t xml:space="preserve">✅</w:t>
             </w:r>
           </w:p>
         </w:tc>
@@ -1560,31 +1596,329 @@
               <w:t xml:space="preserve"> </w:t>
             </w:r>
             <w:r>
-              <w:t xml:space="preserve">protegida</w:t>
-            </w:r>
-          </w:p>
-        </w:tc>
-        <w:tc>
-          <w:tcPr/>
-          <w:p>
-            <w:pPr>
-              <w:pStyle w:val="Compact"/>
-              <w:jc w:val="left"/>
-            </w:pPr>
-            <w:r>
-              <w:t xml:space="preserve">—</w:t>
-            </w:r>
-          </w:p>
-        </w:tc>
-        <w:tc>
-          <w:tcPr/>
-          <w:p>
-            <w:pPr>
-              <w:pStyle w:val="Compact"/>
-              <w:jc w:val="left"/>
-            </w:pPr>
-            <w:r>
-              <w:t xml:space="preserve">⏳</w:t>
+              <w:t xml:space="preserve">protegida (ruleset</w:t>
+            </w:r>
+            <w:r>
+              <w:t xml:space="preserve"> </w:t>
+            </w:r>
+            <w:r>
+              <w:rPr>
+                <w:rStyle w:val="VerbatimChar"/>
+              </w:rPr>
+              <w:t xml:space="preserve">proteger-main</w:t>
+            </w:r>
+            <w:r>
+              <w:t xml:space="preserve">)</w:t>
+            </w:r>
+          </w:p>
+        </w:tc>
+        <w:tc>
+          <w:tcPr/>
+          <w:p>
+            <w:pPr>
+              <w:pStyle w:val="Compact"/>
+              <w:jc w:val="left"/>
+            </w:pPr>
+            <w:r>
+              <w:rPr>
+                <w:rStyle w:val="VerbatimChar"/>
+              </w:rPr>
+              <w:t xml:space="preserve">capturas/EV-C204-014-proteccion.png</w:t>
+            </w:r>
+            <w:r>
+              <w:t xml:space="preserve"> </w:t>
+            </w:r>
+            <w:r>
+              <w:t xml:space="preserve">(+ configuración:</w:t>
+            </w:r>
+            <w:r>
+              <w:t xml:space="preserve"> </w:t>
+            </w:r>
+            <w:r>
+              <w:rPr>
+                <w:rStyle w:val="VerbatimChar"/>
+              </w:rPr>
+              <w:t xml:space="preserve">EV-C204-030-ruleset-main.json</w:t>
+            </w:r>
+            <w:r>
+              <w:t xml:space="preserve">)</w:t>
+            </w:r>
+          </w:p>
+        </w:tc>
+        <w:tc>
+          <w:tcPr/>
+          <w:p>
+            <w:pPr>
+              <w:pStyle w:val="Compact"/>
+              <w:jc w:val="left"/>
+            </w:pPr>
+            <w:r>
+              <w:t xml:space="preserve">✅</w:t>
+            </w:r>
+          </w:p>
+        </w:tc>
+      </w:tr>
+      <w:tr>
+        <w:tc>
+          <w:tcPr/>
+          <w:p>
+            <w:pPr>
+              <w:pStyle w:val="Compact"/>
+              <w:jc w:val="left"/>
+            </w:pPr>
+            <w:r>
+              <w:t xml:space="preserve">EV-C204-015</w:t>
+            </w:r>
+          </w:p>
+        </w:tc>
+        <w:tc>
+          <w:tcPr/>
+          <w:p>
+            <w:pPr>
+              <w:pStyle w:val="Compact"/>
+              <w:jc w:val="left"/>
+            </w:pPr>
+            <w:r>
+              <w:t xml:space="preserve">Figura 1. Contexto de la aplicación</w:t>
+            </w:r>
+          </w:p>
+        </w:tc>
+        <w:tc>
+          <w:tcPr/>
+          <w:p>
+            <w:pPr>
+              <w:pStyle w:val="Compact"/>
+              <w:jc w:val="left"/>
+            </w:pPr>
+            <w:r>
+              <w:rPr>
+                <w:rStyle w:val="VerbatimChar"/>
+              </w:rPr>
+              <w:t xml:space="preserve">figuras/figura-1-contexto.svg</w:t>
+            </w:r>
+          </w:p>
+        </w:tc>
+        <w:tc>
+          <w:tcPr/>
+          <w:p>
+            <w:pPr>
+              <w:pStyle w:val="Compact"/>
+              <w:jc w:val="left"/>
+            </w:pPr>
+            <w:r>
+              <w:t xml:space="preserve">✅</w:t>
+            </w:r>
+          </w:p>
+        </w:tc>
+      </w:tr>
+      <w:tr>
+        <w:tc>
+          <w:tcPr/>
+          <w:p>
+            <w:pPr>
+              <w:pStyle w:val="Compact"/>
+              <w:jc w:val="left"/>
+            </w:pPr>
+            <w:r>
+              <w:t xml:space="preserve">EV-C204-016</w:t>
+            </w:r>
+          </w:p>
+        </w:tc>
+        <w:tc>
+          <w:tcPr/>
+          <w:p>
+            <w:pPr>
+              <w:pStyle w:val="Compact"/>
+              <w:jc w:val="left"/>
+            </w:pPr>
+            <w:r>
+              <w:t xml:space="preserve">Figura 2. Arquitectura y límites de confianza</w:t>
+            </w:r>
+          </w:p>
+        </w:tc>
+        <w:tc>
+          <w:tcPr/>
+          <w:p>
+            <w:pPr>
+              <w:pStyle w:val="Compact"/>
+              <w:jc w:val="left"/>
+            </w:pPr>
+            <w:r>
+              <w:rPr>
+                <w:rStyle w:val="VerbatimChar"/>
+              </w:rPr>
+              <w:t xml:space="preserve">figuras/figura-2-arquitectura.svg</w:t>
+            </w:r>
+          </w:p>
+        </w:tc>
+        <w:tc>
+          <w:tcPr/>
+          <w:p>
+            <w:pPr>
+              <w:pStyle w:val="Compact"/>
+              <w:jc w:val="left"/>
+            </w:pPr>
+            <w:r>
+              <w:t xml:space="preserve">✅</w:t>
+            </w:r>
+          </w:p>
+        </w:tc>
+      </w:tr>
+      <w:tr>
+        <w:tc>
+          <w:tcPr/>
+          <w:p>
+            <w:pPr>
+              <w:pStyle w:val="Compact"/>
+              <w:jc w:val="left"/>
+            </w:pPr>
+            <w:r>
+              <w:t xml:space="preserve">EV-C204-017</w:t>
+            </w:r>
+          </w:p>
+        </w:tc>
+        <w:tc>
+          <w:tcPr/>
+          <w:p>
+            <w:pPr>
+              <w:pStyle w:val="Compact"/>
+              <w:jc w:val="left"/>
+            </w:pPr>
+            <w:r>
+              <w:t xml:space="preserve">Figura 3. Flujo de cifrado con identidad</w:t>
+            </w:r>
+          </w:p>
+        </w:tc>
+        <w:tc>
+          <w:tcPr/>
+          <w:p>
+            <w:pPr>
+              <w:pStyle w:val="Compact"/>
+              <w:jc w:val="left"/>
+            </w:pPr>
+            <w:r>
+              <w:rPr>
+                <w:rStyle w:val="VerbatimChar"/>
+              </w:rPr>
+              <w:t xml:space="preserve">figuras/figura-3-flujo.svg</w:t>
+            </w:r>
+          </w:p>
+        </w:tc>
+        <w:tc>
+          <w:tcPr/>
+          <w:p>
+            <w:pPr>
+              <w:pStyle w:val="Compact"/>
+              <w:jc w:val="left"/>
+            </w:pPr>
+            <w:r>
+              <w:t xml:space="preserve">✅</w:t>
+            </w:r>
+          </w:p>
+        </w:tc>
+      </w:tr>
+      <w:tr>
+        <w:tc>
+          <w:tcPr/>
+          <w:p>
+            <w:pPr>
+              <w:pStyle w:val="Compact"/>
+              <w:jc w:val="left"/>
+            </w:pPr>
+            <w:r>
+              <w:t xml:space="preserve">EV-C204-018 / 019</w:t>
+            </w:r>
+          </w:p>
+        </w:tc>
+        <w:tc>
+          <w:tcPr/>
+          <w:p>
+            <w:pPr>
+              <w:pStyle w:val="Compact"/>
+              <w:jc w:val="left"/>
+            </w:pPr>
+            <w:r>
+              <w:t xml:space="preserve">Capturas de consola del equipo (PPTX y PDF originales)</w:t>
+            </w:r>
+          </w:p>
+        </w:tc>
+        <w:tc>
+          <w:tcPr/>
+          <w:p>
+            <w:pPr>
+              <w:pStyle w:val="Compact"/>
+              <w:jc w:val="left"/>
+            </w:pPr>
+            <w:r>
+              <w:rPr>
+                <w:rStyle w:val="VerbatimChar"/>
+              </w:rPr>
+              <w:t xml:space="preserve">capturas/EV-C204-018-…pptx</w:t>
+            </w:r>
+            <w:r>
+              <w:t xml:space="preserve">,</w:t>
+            </w:r>
+            <w:r>
+              <w:t xml:space="preserve"> </w:t>
+            </w:r>
+            <w:r>
+              <w:rPr>
+                <w:rStyle w:val="VerbatimChar"/>
+              </w:rPr>
+              <w:t xml:space="preserve">EV-C204-019-…pdf</w:t>
+            </w:r>
+          </w:p>
+        </w:tc>
+        <w:tc>
+          <w:tcPr/>
+          <w:p>
+            <w:pPr>
+              <w:pStyle w:val="Compact"/>
+              <w:jc w:val="left"/>
+            </w:pPr>
+            <w:r>
+              <w:t xml:space="preserve">✅</w:t>
+            </w:r>
+          </w:p>
+        </w:tc>
+      </w:tr>
+      <w:tr>
+        <w:tc>
+          <w:tcPr/>
+          <w:p>
+            <w:pPr>
+              <w:pStyle w:val="Compact"/>
+              <w:jc w:val="left"/>
+            </w:pPr>
+            <w:r>
+              <w:t xml:space="preserve">EV-C204-020</w:t>
+            </w:r>
+          </w:p>
+        </w:tc>
+        <w:tc>
+          <w:tcPr/>
+          <w:p>
+            <w:pPr>
+              <w:pStyle w:val="Compact"/>
+              <w:jc w:val="left"/>
+            </w:pPr>
+            <w:r>
+              <w:t xml:space="preserve">Artefacto</w:t>
+            </w:r>
+            <w:r>
+              <w:t xml:space="preserve"> </w:t>
+            </w:r>
+            <w:r>
+              <w:rPr>
+                <w:rStyle w:val="VerbatimChar"/>
+              </w:rPr>
+              <w:t xml:space="preserve">reporte-gitleaks</w:t>
+            </w:r>
+            <w:r>
+              <w:t xml:space="preserve"> </w:t>
+            </w:r>
+            <w:r>
+              <w:t xml:space="preserve">de la</w:t>
             </w:r>
             <w:r>
               <w:t xml:space="preserve"> </w:t>
@@ -1594,54 +1928,28 @@
                 <w:bCs/>
                 <w:b/>
               </w:rPr>
-              <w:t xml:space="preserve">pendiente del equipo</w:t>
+              <w:t xml:space="preserve">Fase 1</w:t>
             </w:r>
             <w:r>
               <w:t xml:space="preserve"> </w:t>
             </w:r>
             <w:r>
-              <w:t xml:space="preserve">(§15)</w:t>
-            </w:r>
-          </w:p>
-        </w:tc>
-      </w:tr>
-      <w:tr>
-        <w:tc>
-          <w:tcPr/>
-          <w:p>
-            <w:pPr>
-              <w:pStyle w:val="Compact"/>
-              <w:jc w:val="left"/>
-            </w:pPr>
-            <w:r>
-              <w:t xml:space="preserve">EV-C204-015</w:t>
-            </w:r>
-          </w:p>
-        </w:tc>
-        <w:tc>
-          <w:tcPr/>
-          <w:p>
-            <w:pPr>
-              <w:pStyle w:val="Compact"/>
-              <w:jc w:val="left"/>
-            </w:pPr>
-            <w:r>
-              <w:t xml:space="preserve">Figura 1. Contexto de la aplicación</w:t>
-            </w:r>
-          </w:p>
-        </w:tc>
-        <w:tc>
-          <w:tcPr/>
-          <w:p>
-            <w:pPr>
-              <w:pStyle w:val="Compact"/>
-              <w:jc w:val="left"/>
-            </w:pPr>
-            <w:r>
-              <w:rPr>
-                <w:rStyle w:val="VerbatimChar"/>
-              </w:rPr>
-              <w:t xml:space="preserve">figuras/figura-1-contexto.svg</w:t>
+              <w:t xml:space="preserve">(run 35365578175)</w:t>
+            </w:r>
+          </w:p>
+        </w:tc>
+        <w:tc>
+          <w:tcPr/>
+          <w:p>
+            <w:pPr>
+              <w:pStyle w:val="Compact"/>
+              <w:jc w:val="left"/>
+            </w:pPr>
+            <w:r>
+              <w:rPr>
+                <w:rStyle w:val="VerbatimChar"/>
+              </w:rPr>
+              <w:t xml:space="preserve">capturas/EV-C204-020-reporte-gitleaks.zip</w:t>
             </w:r>
           </w:p>
         </w:tc>
@@ -1667,143 +1975,19 @@
               <w:jc w:val="left"/>
             </w:pPr>
             <w:r>
-              <w:t xml:space="preserve">EV-C204-016</w:t>
-            </w:r>
-          </w:p>
-        </w:tc>
-        <w:tc>
-          <w:tcPr/>
-          <w:p>
-            <w:pPr>
-              <w:pStyle w:val="Compact"/>
-              <w:jc w:val="left"/>
-            </w:pPr>
-            <w:r>
-              <w:t xml:space="preserve">Figura 2. Arquitectura y límites de confianza</w:t>
-            </w:r>
-          </w:p>
-        </w:tc>
-        <w:tc>
-          <w:tcPr/>
-          <w:p>
-            <w:pPr>
-              <w:pStyle w:val="Compact"/>
-              <w:jc w:val="left"/>
-            </w:pPr>
-            <w:r>
-              <w:rPr>
-                <w:rStyle w:val="VerbatimChar"/>
-              </w:rPr>
-              <w:t xml:space="preserve">figuras/figura-2-arquitectura.svg</w:t>
-            </w:r>
-          </w:p>
-        </w:tc>
-        <w:tc>
-          <w:tcPr/>
-          <w:p>
-            <w:pPr>
-              <w:pStyle w:val="Compact"/>
-              <w:jc w:val="left"/>
-            </w:pPr>
-            <w:r>
-              <w:t xml:space="preserve">✅</w:t>
-            </w:r>
-          </w:p>
-        </w:tc>
-      </w:tr>
-      <w:tr>
-        <w:tc>
-          <w:tcPr/>
-          <w:p>
-            <w:pPr>
-              <w:pStyle w:val="Compact"/>
-              <w:jc w:val="left"/>
-            </w:pPr>
-            <w:r>
-              <w:t xml:space="preserve">EV-C204-017</w:t>
-            </w:r>
-          </w:p>
-        </w:tc>
-        <w:tc>
-          <w:tcPr/>
-          <w:p>
-            <w:pPr>
-              <w:pStyle w:val="Compact"/>
-              <w:jc w:val="left"/>
-            </w:pPr>
-            <w:r>
-              <w:t xml:space="preserve">Figura 3. Flujo de cifrado con identidad</w:t>
-            </w:r>
-          </w:p>
-        </w:tc>
-        <w:tc>
-          <w:tcPr/>
-          <w:p>
-            <w:pPr>
-              <w:pStyle w:val="Compact"/>
-              <w:jc w:val="left"/>
-            </w:pPr>
-            <w:r>
-              <w:rPr>
-                <w:rStyle w:val="VerbatimChar"/>
-              </w:rPr>
-              <w:t xml:space="preserve">figuras/figura-3-flujo.svg</w:t>
-            </w:r>
-          </w:p>
-        </w:tc>
-        <w:tc>
-          <w:tcPr/>
-          <w:p>
-            <w:pPr>
-              <w:pStyle w:val="Compact"/>
-              <w:jc w:val="left"/>
-            </w:pPr>
-            <w:r>
-              <w:t xml:space="preserve">✅</w:t>
-            </w:r>
-          </w:p>
-        </w:tc>
-      </w:tr>
-      <w:tr>
-        <w:tc>
-          <w:tcPr/>
-          <w:p>
-            <w:pPr>
-              <w:pStyle w:val="Compact"/>
-              <w:jc w:val="left"/>
-            </w:pPr>
-            <w:r>
-              <w:t xml:space="preserve">EV-C204-018 / 019</w:t>
-            </w:r>
-          </w:p>
-        </w:tc>
-        <w:tc>
-          <w:tcPr/>
-          <w:p>
-            <w:pPr>
-              <w:pStyle w:val="Compact"/>
-              <w:jc w:val="left"/>
-            </w:pPr>
-            <w:r>
-              <w:t xml:space="preserve">Capturas de consola del equipo (PPTX y PDF originales)</w:t>
-            </w:r>
-          </w:p>
-        </w:tc>
-        <w:tc>
-          <w:tcPr/>
-          <w:p>
-            <w:pPr>
-              <w:pStyle w:val="Compact"/>
-              <w:jc w:val="left"/>
-            </w:pPr>
-            <w:r>
-              <w:rPr>
-                <w:rStyle w:val="VerbatimChar"/>
-              </w:rPr>
-              <w:t xml:space="preserve">capturas/EV-C204-018-…pptx</w:t>
-            </w:r>
-            <w:r>
-              <w:t xml:space="preserve">,</w:t>
+              <w:t xml:space="preserve">EV-C204-021</w:t>
+            </w:r>
+          </w:p>
+        </w:tc>
+        <w:tc>
+          <w:tcPr/>
+          <w:p>
+            <w:pPr>
+              <w:pStyle w:val="Compact"/>
+              <w:jc w:val="left"/>
+            </w:pPr>
+            <w:r>
+              <w:t xml:space="preserve">Artefacto</w:t>
             </w:r>
             <w:r>
               <w:t xml:space="preserve"> </w:t>
@@ -1812,54 +1996,7 @@
               <w:rPr>
                 <w:rStyle w:val="VerbatimChar"/>
               </w:rPr>
-              <w:t xml:space="preserve">EV-C204-019-…pdf</w:t>
-            </w:r>
-          </w:p>
-        </w:tc>
-        <w:tc>
-          <w:tcPr/>
-          <w:p>
-            <w:pPr>
-              <w:pStyle w:val="Compact"/>
-              <w:jc w:val="left"/>
-            </w:pPr>
-            <w:r>
-              <w:t xml:space="preserve">✅</w:t>
-            </w:r>
-          </w:p>
-        </w:tc>
-      </w:tr>
-      <w:tr>
-        <w:tc>
-          <w:tcPr/>
-          <w:p>
-            <w:pPr>
-              <w:pStyle w:val="Compact"/>
-              <w:jc w:val="left"/>
-            </w:pPr>
-            <w:r>
-              <w:t xml:space="preserve">EV-C204-020</w:t>
-            </w:r>
-          </w:p>
-        </w:tc>
-        <w:tc>
-          <w:tcPr/>
-          <w:p>
-            <w:pPr>
-              <w:pStyle w:val="Compact"/>
-              <w:jc w:val="left"/>
-            </w:pPr>
-            <w:r>
-              <w:t xml:space="preserve">Artefacto</w:t>
-            </w:r>
-            <w:r>
-              <w:t xml:space="preserve"> </w:t>
-            </w:r>
-            <w:r>
-              <w:rPr>
-                <w:rStyle w:val="VerbatimChar"/>
-              </w:rPr>
-              <w:t xml:space="preserve">reporte-gitleaks</w:t>
+              <w:t xml:space="preserve">reporte-semgrep</w:t>
             </w:r>
             <w:r>
               <w:t xml:space="preserve"> </w:t>
@@ -1877,73 +2014,67 @@
               </w:rPr>
               <w:t xml:space="preserve">Fase 1</w:t>
             </w:r>
+          </w:p>
+        </w:tc>
+        <w:tc>
+          <w:tcPr/>
+          <w:p>
+            <w:pPr>
+              <w:pStyle w:val="Compact"/>
+              <w:jc w:val="left"/>
+            </w:pPr>
+            <w:r>
+              <w:rPr>
+                <w:rStyle w:val="VerbatimChar"/>
+              </w:rPr>
+              <w:t xml:space="preserve">capturas/EV-C204-021-reporte-semgrep.zip</w:t>
+            </w:r>
+          </w:p>
+        </w:tc>
+        <w:tc>
+          <w:tcPr/>
+          <w:p>
+            <w:pPr>
+              <w:pStyle w:val="Compact"/>
+              <w:jc w:val="left"/>
+            </w:pPr>
+            <w:r>
+              <w:t xml:space="preserve">✅</w:t>
+            </w:r>
+          </w:p>
+        </w:tc>
+      </w:tr>
+      <w:tr>
+        <w:tc>
+          <w:tcPr/>
+          <w:p>
+            <w:pPr>
+              <w:pStyle w:val="Compact"/>
+              <w:jc w:val="left"/>
+            </w:pPr>
+            <w:r>
+              <w:t xml:space="preserve">EV-C204-022</w:t>
+            </w:r>
+          </w:p>
+        </w:tc>
+        <w:tc>
+          <w:tcPr/>
+          <w:p>
+            <w:pPr>
+              <w:pStyle w:val="Compact"/>
+              <w:jc w:val="left"/>
+            </w:pPr>
+            <w:r>
+              <w:t xml:space="preserve">Artefacto</w:t>
+            </w:r>
             <w:r>
               <w:t xml:space="preserve"> </w:t>
             </w:r>
             <w:r>
-              <w:t xml:space="preserve">(run 35365578175)</w:t>
-            </w:r>
-          </w:p>
-        </w:tc>
-        <w:tc>
-          <w:tcPr/>
-          <w:p>
-            <w:pPr>
-              <w:pStyle w:val="Compact"/>
-              <w:jc w:val="left"/>
-            </w:pPr>
-            <w:r>
-              <w:rPr>
-                <w:rStyle w:val="VerbatimChar"/>
-              </w:rPr>
-              <w:t xml:space="preserve">capturas/EV-C204-020-reporte-gitleaks.zip</w:t>
-            </w:r>
-          </w:p>
-        </w:tc>
-        <w:tc>
-          <w:tcPr/>
-          <w:p>
-            <w:pPr>
-              <w:pStyle w:val="Compact"/>
-              <w:jc w:val="left"/>
-            </w:pPr>
-            <w:r>
-              <w:t xml:space="preserve">✅</w:t>
-            </w:r>
-          </w:p>
-        </w:tc>
-      </w:tr>
-      <w:tr>
-        <w:tc>
-          <w:tcPr/>
-          <w:p>
-            <w:pPr>
-              <w:pStyle w:val="Compact"/>
-              <w:jc w:val="left"/>
-            </w:pPr>
-            <w:r>
-              <w:t xml:space="preserve">EV-C204-021</w:t>
-            </w:r>
-          </w:p>
-        </w:tc>
-        <w:tc>
-          <w:tcPr/>
-          <w:p>
-            <w:pPr>
-              <w:pStyle w:val="Compact"/>
-              <w:jc w:val="left"/>
-            </w:pPr>
-            <w:r>
-              <w:t xml:space="preserve">Artefacto</w:t>
-            </w:r>
-            <w:r>
-              <w:t xml:space="preserve"> </w:t>
-            </w:r>
-            <w:r>
-              <w:rPr>
-                <w:rStyle w:val="VerbatimChar"/>
-              </w:rPr>
-              <w:t xml:space="preserve">reporte-semgrep</w:t>
+              <w:rPr>
+                <w:rStyle w:val="VerbatimChar"/>
+              </w:rPr>
+              <w:t xml:space="preserve">reporte-zap</w:t>
             </w:r>
             <w:r>
               <w:t xml:space="preserve"> </w:t>
@@ -1974,7 +2105,7 @@
               <w:rPr>
                 <w:rStyle w:val="VerbatimChar"/>
               </w:rPr>
-              <w:t xml:space="preserve">capturas/EV-C204-021-reporte-semgrep.zip</w:t>
+              <w:t xml:space="preserve">capturas/EV-C204-022-reporte-zap.zip</w:t>
             </w:r>
           </w:p>
         </w:tc>
@@ -2000,19 +2131,72 @@
               <w:jc w:val="left"/>
             </w:pPr>
             <w:r>
-              <w:t xml:space="preserve">EV-C204-022</w:t>
-            </w:r>
-          </w:p>
-        </w:tc>
-        <w:tc>
-          <w:tcPr/>
-          <w:p>
-            <w:pPr>
-              <w:pStyle w:val="Compact"/>
-              <w:jc w:val="left"/>
-            </w:pPr>
-            <w:r>
-              <w:t xml:space="preserve">Artefacto</w:t>
+              <w:t xml:space="preserve">EV-C204-023</w:t>
+            </w:r>
+          </w:p>
+        </w:tc>
+        <w:tc>
+          <w:tcPr/>
+          <w:p>
+            <w:pPr>
+              <w:pStyle w:val="Compact"/>
+              <w:jc w:val="left"/>
+            </w:pPr>
+            <w:r>
+              <w:t xml:space="preserve">Pruebas extremo a extremo con Keycloak real (25 comprobaciones)</w:t>
+            </w:r>
+          </w:p>
+        </w:tc>
+        <w:tc>
+          <w:tcPr/>
+          <w:p>
+            <w:pPr>
+              <w:pStyle w:val="Compact"/>
+              <w:jc w:val="left"/>
+            </w:pPr>
+            <w:r>
+              <w:rPr>
+                <w:rStyle w:val="VerbatimChar"/>
+              </w:rPr>
+              <w:t xml:space="preserve">capturas/EV-C204-023-pruebas-e2e-keycloak.txt</w:t>
+            </w:r>
+          </w:p>
+        </w:tc>
+        <w:tc>
+          <w:tcPr/>
+          <w:p>
+            <w:pPr>
+              <w:pStyle w:val="Compact"/>
+              <w:jc w:val="left"/>
+            </w:pPr>
+            <w:r>
+              <w:t xml:space="preserve">✅</w:t>
+            </w:r>
+          </w:p>
+        </w:tc>
+      </w:tr>
+      <w:tr>
+        <w:tc>
+          <w:tcPr/>
+          <w:p>
+            <w:pPr>
+              <w:pStyle w:val="Compact"/>
+              <w:jc w:val="left"/>
+            </w:pPr>
+            <w:r>
+              <w:t xml:space="preserve">EV-C204-024</w:t>
+            </w:r>
+          </w:p>
+        </w:tc>
+        <w:tc>
+          <w:tcPr/>
+          <w:p>
+            <w:pPr>
+              <w:pStyle w:val="Compact"/>
+              <w:jc w:val="left"/>
+            </w:pPr>
+            <w:r>
+              <w:t xml:space="preserve">Pruebas Jest (22), ESLint y</w:t>
             </w:r>
             <w:r>
               <w:t xml:space="preserve"> </w:t>
@@ -2021,13 +2205,166 @@
               <w:rPr>
                 <w:rStyle w:val="VerbatimChar"/>
               </w:rPr>
-              <w:t xml:space="preserve">reporte-zap</w:t>
-            </w:r>
-            <w:r>
-              <w:t xml:space="preserve"> </w:t>
-            </w:r>
-            <w:r>
-              <w:t xml:space="preserve">de la</w:t>
+              <w:t xml:space="preserve">npm audit</w:t>
+            </w:r>
+          </w:p>
+        </w:tc>
+        <w:tc>
+          <w:tcPr/>
+          <w:p>
+            <w:pPr>
+              <w:pStyle w:val="Compact"/>
+              <w:jc w:val="left"/>
+            </w:pPr>
+            <w:r>
+              <w:rPr>
+                <w:rStyle w:val="VerbatimChar"/>
+              </w:rPr>
+              <w:t xml:space="preserve">capturas/EV-C204-024-pruebas-unitarias.txt</w:t>
+            </w:r>
+          </w:p>
+        </w:tc>
+        <w:tc>
+          <w:tcPr/>
+          <w:p>
+            <w:pPr>
+              <w:pStyle w:val="Compact"/>
+              <w:jc w:val="left"/>
+            </w:pPr>
+            <w:r>
+              <w:t xml:space="preserve">✅</w:t>
+            </w:r>
+          </w:p>
+        </w:tc>
+      </w:tr>
+      <w:tr>
+        <w:tc>
+          <w:tcPr/>
+          <w:p>
+            <w:pPr>
+              <w:pStyle w:val="Compact"/>
+              <w:jc w:val="left"/>
+            </w:pPr>
+            <w:r>
+              <w:t xml:space="preserve">EV-C204-025</w:t>
+            </w:r>
+          </w:p>
+        </w:tc>
+        <w:tc>
+          <w:tcPr/>
+          <w:p>
+            <w:pPr>
+              <w:pStyle w:val="Compact"/>
+              <w:jc w:val="left"/>
+            </w:pPr>
+            <w:r>
+              <w:t xml:space="preserve">Alertas y análisis de CodeQL</w:t>
+            </w:r>
+          </w:p>
+        </w:tc>
+        <w:tc>
+          <w:tcPr/>
+          <w:p>
+            <w:pPr>
+              <w:pStyle w:val="Compact"/>
+              <w:jc w:val="left"/>
+            </w:pPr>
+            <w:r>
+              <w:rPr>
+                <w:rStyle w:val="VerbatimChar"/>
+              </w:rPr>
+              <w:t xml:space="preserve">capturas/EV-C204-025-codeql-alertas.json</w:t>
+            </w:r>
+          </w:p>
+        </w:tc>
+        <w:tc>
+          <w:tcPr/>
+          <w:p>
+            <w:pPr>
+              <w:pStyle w:val="Compact"/>
+              <w:jc w:val="left"/>
+            </w:pPr>
+            <w:r>
+              <w:t xml:space="preserve">✅</w:t>
+            </w:r>
+          </w:p>
+        </w:tc>
+      </w:tr>
+      <w:tr>
+        <w:tc>
+          <w:tcPr/>
+          <w:p>
+            <w:pPr>
+              <w:pStyle w:val="Compact"/>
+              <w:jc w:val="left"/>
+            </w:pPr>
+            <w:r>
+              <w:t xml:space="preserve">EV-C204-026</w:t>
+            </w:r>
+          </w:p>
+        </w:tc>
+        <w:tc>
+          <w:tcPr/>
+          <w:p>
+            <w:pPr>
+              <w:pStyle w:val="Compact"/>
+              <w:jc w:val="left"/>
+            </w:pPr>
+            <w:r>
+              <w:t xml:space="preserve">Run verde de referencia (jobs, artefactos, CodeQL)</w:t>
+            </w:r>
+          </w:p>
+        </w:tc>
+        <w:tc>
+          <w:tcPr/>
+          <w:p>
+            <w:pPr>
+              <w:pStyle w:val="Compact"/>
+              <w:jc w:val="left"/>
+            </w:pPr>
+            <w:r>
+              <w:rPr>
+                <w:rStyle w:val="VerbatimChar"/>
+              </w:rPr>
+              <w:t xml:space="preserve">capturas/EV-C204-026-run-verde.txt</w:t>
+            </w:r>
+          </w:p>
+        </w:tc>
+        <w:tc>
+          <w:tcPr/>
+          <w:p>
+            <w:pPr>
+              <w:pStyle w:val="Compact"/>
+              <w:jc w:val="left"/>
+            </w:pPr>
+            <w:r>
+              <w:t xml:space="preserve">✅</w:t>
+            </w:r>
+          </w:p>
+        </w:tc>
+      </w:tr>
+      <w:tr>
+        <w:tc>
+          <w:tcPr/>
+          <w:p>
+            <w:pPr>
+              <w:pStyle w:val="Compact"/>
+              <w:jc w:val="left"/>
+            </w:pPr>
+            <w:r>
+              <w:t xml:space="preserve">EV-C204-027</w:t>
+            </w:r>
+          </w:p>
+        </w:tc>
+        <w:tc>
+          <w:tcPr/>
+          <w:p>
+            <w:pPr>
+              <w:pStyle w:val="Compact"/>
+              <w:jc w:val="left"/>
+            </w:pPr>
+            <w:r>
+              <w:t xml:space="preserve">SBOM de la</w:t>
             </w:r>
             <w:r>
               <w:t xml:space="preserve"> </w:t>
@@ -2039,20 +2376,26 @@
               </w:rPr>
               <w:t xml:space="preserve">Fase 1</w:t>
             </w:r>
-          </w:p>
-        </w:tc>
-        <w:tc>
-          <w:tcPr/>
-          <w:p>
-            <w:pPr>
-              <w:pStyle w:val="Compact"/>
-              <w:jc w:val="left"/>
-            </w:pPr>
-            <w:r>
-              <w:rPr>
-                <w:rStyle w:val="VerbatimChar"/>
-              </w:rPr>
-              <w:t xml:space="preserve">capturas/EV-C204-022-reporte-zap.zip</w:t>
+            <w:r>
+              <w:t xml:space="preserve"> </w:t>
+            </w:r>
+            <w:r>
+              <w:t xml:space="preserve">(comprimido)</w:t>
+            </w:r>
+          </w:p>
+        </w:tc>
+        <w:tc>
+          <w:tcPr/>
+          <w:p>
+            <w:pPr>
+              <w:pStyle w:val="Compact"/>
+              <w:jc w:val="left"/>
+            </w:pPr>
+            <w:r>
+              <w:rPr>
+                <w:rStyle w:val="VerbatimChar"/>
+              </w:rPr>
+              <w:t xml:space="preserve">capturas/EV-C204-027-sbom-fase1.zip</w:t>
             </w:r>
           </w:p>
         </w:tc>
@@ -2078,34 +2421,34 @@
               <w:jc w:val="left"/>
             </w:pPr>
             <w:r>
-              <w:t xml:space="preserve">EV-C204-023</w:t>
-            </w:r>
-          </w:p>
-        </w:tc>
-        <w:tc>
-          <w:tcPr/>
-          <w:p>
-            <w:pPr>
-              <w:pStyle w:val="Compact"/>
-              <w:jc w:val="left"/>
-            </w:pPr>
-            <w:r>
-              <w:t xml:space="preserve">Pruebas extremo a extremo con Keycloak real (25 comprobaciones)</w:t>
-            </w:r>
-          </w:p>
-        </w:tc>
-        <w:tc>
-          <w:tcPr/>
-          <w:p>
-            <w:pPr>
-              <w:pStyle w:val="Compact"/>
-              <w:jc w:val="left"/>
-            </w:pPr>
-            <w:r>
-              <w:rPr>
-                <w:rStyle w:val="VerbatimChar"/>
-              </w:rPr>
-              <w:t xml:space="preserve">capturas/EV-C204-023-pruebas-e2e-keycloak.txt</w:t>
+              <w:t xml:space="preserve">EV-C204-028</w:t>
+            </w:r>
+          </w:p>
+        </w:tc>
+        <w:tc>
+          <w:tcPr/>
+          <w:p>
+            <w:pPr>
+              <w:pStyle w:val="Compact"/>
+              <w:jc w:val="left"/>
+            </w:pPr>
+            <w:r>
+              <w:t xml:space="preserve">Log de los jobs en rojo de la Fase 1 (secretos redactados)</w:t>
+            </w:r>
+          </w:p>
+        </w:tc>
+        <w:tc>
+          <w:tcPr/>
+          <w:p>
+            <w:pPr>
+              <w:pStyle w:val="Compact"/>
+              <w:jc w:val="left"/>
+            </w:pPr>
+            <w:r>
+              <w:rPr>
+                <w:rStyle w:val="VerbatimChar"/>
+              </w:rPr>
+              <w:t xml:space="preserve">capturas/EV-C204-028-log-fase1-jobs-rojos.txt</w:t>
             </w:r>
           </w:p>
         </w:tc>
@@ -2131,43 +2474,93 @@
               <w:jc w:val="left"/>
             </w:pPr>
             <w:r>
-              <w:t xml:space="preserve">EV-C204-024</w:t>
-            </w:r>
-          </w:p>
-        </w:tc>
-        <w:tc>
-          <w:tcPr/>
-          <w:p>
-            <w:pPr>
-              <w:pStyle w:val="Compact"/>
-              <w:jc w:val="left"/>
-            </w:pPr>
-            <w:r>
-              <w:t xml:space="preserve">Pruebas Jest (22), ESLint y</w:t>
+              <w:t xml:space="preserve">EV-C204-029</w:t>
+            </w:r>
+          </w:p>
+        </w:tc>
+        <w:tc>
+          <w:tcPr/>
+          <w:p>
+            <w:pPr>
+              <w:pStyle w:val="Compact"/>
+              <w:jc w:val="left"/>
+            </w:pPr>
+            <w:r>
+              <w:t xml:space="preserve">Historial de las 22+ ejecuciones del pipeline</w:t>
+            </w:r>
+          </w:p>
+        </w:tc>
+        <w:tc>
+          <w:tcPr/>
+          <w:p>
+            <w:pPr>
+              <w:pStyle w:val="Compact"/>
+              <w:jc w:val="left"/>
+            </w:pPr>
+            <w:r>
+              <w:rPr>
+                <w:rStyle w:val="VerbatimChar"/>
+              </w:rPr>
+              <w:t xml:space="preserve">capturas/EV-C204-029-historial-runs.txt</w:t>
+            </w:r>
+          </w:p>
+        </w:tc>
+        <w:tc>
+          <w:tcPr/>
+          <w:p>
+            <w:pPr>
+              <w:pStyle w:val="Compact"/>
+              <w:jc w:val="left"/>
+            </w:pPr>
+            <w:r>
+              <w:t xml:space="preserve">✅</w:t>
+            </w:r>
+          </w:p>
+        </w:tc>
+      </w:tr>
+      <w:tr>
+        <w:tc>
+          <w:tcPr/>
+          <w:p>
+            <w:pPr>
+              <w:pStyle w:val="Compact"/>
+              <w:jc w:val="left"/>
+            </w:pPr>
+            <w:r>
+              <w:t xml:space="preserve">EV-C204-033 … 051</w:t>
+            </w:r>
+          </w:p>
+        </w:tc>
+        <w:tc>
+          <w:tcPr/>
+          <w:p>
+            <w:pPr>
+              <w:pStyle w:val="Compact"/>
+              <w:jc w:val="left"/>
+            </w:pPr>
+            <w:r>
+              <w:t xml:space="preserve">19 capturas de pantalla del equipo, individualizadas</w:t>
+            </w:r>
+          </w:p>
+        </w:tc>
+        <w:tc>
+          <w:tcPr/>
+          <w:p>
+            <w:pPr>
+              <w:pStyle w:val="Compact"/>
+              <w:jc w:val="left"/>
+            </w:pPr>
+            <w:r>
+              <w:rPr>
+                <w:rStyle w:val="VerbatimChar"/>
+              </w:rPr>
+              <w:t xml:space="preserve">capturas/consola-git/</w:t>
             </w:r>
             <w:r>
               <w:t xml:space="preserve"> </w:t>
             </w:r>
             <w:r>
-              <w:rPr>
-                <w:rStyle w:val="VerbatimChar"/>
-              </w:rPr>
-              <w:t xml:space="preserve">npm audit</w:t>
-            </w:r>
-          </w:p>
-        </w:tc>
-        <w:tc>
-          <w:tcPr/>
-          <w:p>
-            <w:pPr>
-              <w:pStyle w:val="Compact"/>
-              <w:jc w:val="left"/>
-            </w:pPr>
-            <w:r>
-              <w:rPr>
-                <w:rStyle w:val="VerbatimChar"/>
-              </w:rPr>
-              <w:t xml:space="preserve">capturas/EV-C204-024-pruebas-unitarias.txt</w:t>
+              <w:t xml:space="preserve">(Anexo I)</w:t>
             </w:r>
           </w:p>
         </w:tc>
@@ -2193,321 +2586,49 @@
               <w:jc w:val="left"/>
             </w:pPr>
             <w:r>
-              <w:t xml:space="preserve">EV-C204-025</w:t>
-            </w:r>
-          </w:p>
-        </w:tc>
-        <w:tc>
-          <w:tcPr/>
-          <w:p>
-            <w:pPr>
-              <w:pStyle w:val="Compact"/>
-              <w:jc w:val="left"/>
-            </w:pPr>
-            <w:r>
-              <w:t xml:space="preserve">Alertas y análisis de CodeQL</w:t>
-            </w:r>
-          </w:p>
-        </w:tc>
-        <w:tc>
-          <w:tcPr/>
-          <w:p>
-            <w:pPr>
-              <w:pStyle w:val="Compact"/>
-              <w:jc w:val="left"/>
-            </w:pPr>
-            <w:r>
-              <w:rPr>
-                <w:rStyle w:val="VerbatimChar"/>
-              </w:rPr>
-              <w:t xml:space="preserve">capturas/EV-C204-025-codeql-alertas.json</w:t>
-            </w:r>
-          </w:p>
-        </w:tc>
-        <w:tc>
-          <w:tcPr/>
-          <w:p>
-            <w:pPr>
-              <w:pStyle w:val="Compact"/>
-              <w:jc w:val="left"/>
-            </w:pPr>
-            <w:r>
-              <w:t xml:space="preserve">✅</w:t>
-            </w:r>
-          </w:p>
-        </w:tc>
-      </w:tr>
-      <w:tr>
-        <w:tc>
-          <w:tcPr/>
-          <w:p>
-            <w:pPr>
-              <w:pStyle w:val="Compact"/>
-              <w:jc w:val="left"/>
-            </w:pPr>
-            <w:r>
-              <w:t xml:space="preserve">EV-C204-026</w:t>
-            </w:r>
-          </w:p>
-        </w:tc>
-        <w:tc>
-          <w:tcPr/>
-          <w:p>
-            <w:pPr>
-              <w:pStyle w:val="Compact"/>
-              <w:jc w:val="left"/>
-            </w:pPr>
-            <w:r>
-              <w:t xml:space="preserve">Run verde de referencia (jobs, artefactos, CodeQL)</w:t>
-            </w:r>
-          </w:p>
-        </w:tc>
-        <w:tc>
-          <w:tcPr/>
-          <w:p>
-            <w:pPr>
-              <w:pStyle w:val="Compact"/>
-              <w:jc w:val="left"/>
-            </w:pPr>
-            <w:r>
-              <w:rPr>
-                <w:rStyle w:val="VerbatimChar"/>
-              </w:rPr>
-              <w:t xml:space="preserve">capturas/EV-C204-026-run-verde.txt</w:t>
-            </w:r>
-          </w:p>
-        </w:tc>
-        <w:tc>
-          <w:tcPr/>
-          <w:p>
-            <w:pPr>
-              <w:pStyle w:val="Compact"/>
-              <w:jc w:val="left"/>
-            </w:pPr>
-            <w:r>
-              <w:t xml:space="preserve">✅</w:t>
-            </w:r>
-          </w:p>
-        </w:tc>
-      </w:tr>
-      <w:tr>
-        <w:tc>
-          <w:tcPr/>
-          <w:p>
-            <w:pPr>
-              <w:pStyle w:val="Compact"/>
-              <w:jc w:val="left"/>
-            </w:pPr>
-            <w:r>
-              <w:t xml:space="preserve">EV-C204-027</w:t>
-            </w:r>
-          </w:p>
-        </w:tc>
-        <w:tc>
-          <w:tcPr/>
-          <w:p>
-            <w:pPr>
-              <w:pStyle w:val="Compact"/>
-              <w:jc w:val="left"/>
-            </w:pPr>
-            <w:r>
-              <w:t xml:space="preserve">SBOM de la</w:t>
+              <w:t xml:space="preserve">EV-C204-030</w:t>
+            </w:r>
+          </w:p>
+        </w:tc>
+        <w:tc>
+          <w:tcPr/>
+          <w:p>
+            <w:pPr>
+              <w:pStyle w:val="Compact"/>
+              <w:jc w:val="left"/>
+            </w:pPr>
+            <w:r>
+              <w:t xml:space="preserve">Configuración real del ruleset</w:t>
             </w:r>
             <w:r>
               <w:t xml:space="preserve"> </w:t>
             </w:r>
             <w:r>
               <w:rPr>
-                <w:bCs/>
-                <w:b/>
-              </w:rPr>
-              <w:t xml:space="preserve">Fase 1</w:t>
+                <w:rStyle w:val="VerbatimChar"/>
+              </w:rPr>
+              <w:t xml:space="preserve">proteger-main</w:t>
             </w:r>
             <w:r>
               <w:t xml:space="preserve"> </w:t>
             </w:r>
             <w:r>
-              <w:t xml:space="preserve">(comprimido)</w:t>
-            </w:r>
-          </w:p>
-        </w:tc>
-        <w:tc>
-          <w:tcPr/>
-          <w:p>
-            <w:pPr>
-              <w:pStyle w:val="Compact"/>
-              <w:jc w:val="left"/>
-            </w:pPr>
-            <w:r>
-              <w:rPr>
-                <w:rStyle w:val="VerbatimChar"/>
-              </w:rPr>
-              <w:t xml:space="preserve">capturas/EV-C204-027-sbom-fase1.zip</w:t>
-            </w:r>
-          </w:p>
-        </w:tc>
-        <w:tc>
-          <w:tcPr/>
-          <w:p>
-            <w:pPr>
-              <w:pStyle w:val="Compact"/>
-              <w:jc w:val="left"/>
-            </w:pPr>
-            <w:r>
-              <w:t xml:space="preserve">✅</w:t>
-            </w:r>
-          </w:p>
-        </w:tc>
-      </w:tr>
-      <w:tr>
-        <w:tc>
-          <w:tcPr/>
-          <w:p>
-            <w:pPr>
-              <w:pStyle w:val="Compact"/>
-              <w:jc w:val="left"/>
-            </w:pPr>
-            <w:r>
-              <w:t xml:space="preserve">EV-C204-028</w:t>
-            </w:r>
-          </w:p>
-        </w:tc>
-        <w:tc>
-          <w:tcPr/>
-          <w:p>
-            <w:pPr>
-              <w:pStyle w:val="Compact"/>
-              <w:jc w:val="left"/>
-            </w:pPr>
-            <w:r>
-              <w:t xml:space="preserve">Log de los jobs en rojo de la Fase 1 (secretos redactados)</w:t>
-            </w:r>
-          </w:p>
-        </w:tc>
-        <w:tc>
-          <w:tcPr/>
-          <w:p>
-            <w:pPr>
-              <w:pStyle w:val="Compact"/>
-              <w:jc w:val="left"/>
-            </w:pPr>
-            <w:r>
-              <w:rPr>
-                <w:rStyle w:val="VerbatimChar"/>
-              </w:rPr>
-              <w:t xml:space="preserve">capturas/EV-C204-028-log-fase1-jobs-rojos.txt</w:t>
-            </w:r>
-          </w:p>
-        </w:tc>
-        <w:tc>
-          <w:tcPr/>
-          <w:p>
-            <w:pPr>
-              <w:pStyle w:val="Compact"/>
-              <w:jc w:val="left"/>
-            </w:pPr>
-            <w:r>
-              <w:t xml:space="preserve">✅</w:t>
-            </w:r>
-          </w:p>
-        </w:tc>
-      </w:tr>
-      <w:tr>
-        <w:tc>
-          <w:tcPr/>
-          <w:p>
-            <w:pPr>
-              <w:pStyle w:val="Compact"/>
-              <w:jc w:val="left"/>
-            </w:pPr>
-            <w:r>
-              <w:t xml:space="preserve">EV-C204-029</w:t>
-            </w:r>
-          </w:p>
-        </w:tc>
-        <w:tc>
-          <w:tcPr/>
-          <w:p>
-            <w:pPr>
-              <w:pStyle w:val="Compact"/>
-              <w:jc w:val="left"/>
-            </w:pPr>
-            <w:r>
-              <w:t xml:space="preserve">Historial de las 22+ ejecuciones del pipeline</w:t>
-            </w:r>
-          </w:p>
-        </w:tc>
-        <w:tc>
-          <w:tcPr/>
-          <w:p>
-            <w:pPr>
-              <w:pStyle w:val="Compact"/>
-              <w:jc w:val="left"/>
-            </w:pPr>
-            <w:r>
-              <w:rPr>
-                <w:rStyle w:val="VerbatimChar"/>
-              </w:rPr>
-              <w:t xml:space="preserve">capturas/EV-C204-029-historial-runs.txt</w:t>
-            </w:r>
-          </w:p>
-        </w:tc>
-        <w:tc>
-          <w:tcPr/>
-          <w:p>
-            <w:pPr>
-              <w:pStyle w:val="Compact"/>
-              <w:jc w:val="left"/>
-            </w:pPr>
-            <w:r>
-              <w:t xml:space="preserve">✅</w:t>
-            </w:r>
-          </w:p>
-        </w:tc>
-      </w:tr>
-      <w:tr>
-        <w:tc>
-          <w:tcPr/>
-          <w:p>
-            <w:pPr>
-              <w:pStyle w:val="Compact"/>
-              <w:jc w:val="left"/>
-            </w:pPr>
-            <w:r>
-              <w:t xml:space="preserve">EV-C204-033 … 051</w:t>
-            </w:r>
-          </w:p>
-        </w:tc>
-        <w:tc>
-          <w:tcPr/>
-          <w:p>
-            <w:pPr>
-              <w:pStyle w:val="Compact"/>
-              <w:jc w:val="left"/>
-            </w:pPr>
-            <w:r>
-              <w:t xml:space="preserve">19 capturas de pantalla del equipo, individualizadas</w:t>
-            </w:r>
-          </w:p>
-        </w:tc>
-        <w:tc>
-          <w:tcPr/>
-          <w:p>
-            <w:pPr>
-              <w:pStyle w:val="Compact"/>
-              <w:jc w:val="left"/>
-            </w:pPr>
-            <w:r>
-              <w:rPr>
-                <w:rStyle w:val="VerbatimChar"/>
-              </w:rPr>
-              <w:t xml:space="preserve">capturas/consola-git/</w:t>
-            </w:r>
-            <w:r>
-              <w:t xml:space="preserve"> </w:t>
-            </w:r>
-            <w:r>
-              <w:t xml:space="preserve">(Anexo I)</w:t>
+              <w:t xml:space="preserve">(API de GitHub)</w:t>
+            </w:r>
+          </w:p>
+        </w:tc>
+        <w:tc>
+          <w:tcPr/>
+          <w:p>
+            <w:pPr>
+              <w:pStyle w:val="Compact"/>
+              <w:jc w:val="left"/>
+            </w:pPr>
+            <w:r>
+              <w:rPr>
+                <w:rStyle w:val="VerbatimChar"/>
+              </w:rPr>
+              <w:t xml:space="preserve">capturas/EV-C204-030-ruleset-main.json</w:t>
             </w:r>
           </w:p>
         </w:tc>
@@ -2592,7 +2713,7 @@
         <w:pStyle w:val="BlockText"/>
       </w:pPr>
       <w:r>
-        <w:t xml:space="preserve">Los identificadores 030–032 no se usan. Las etiquetas «EV-C204-006 … 011» que aparecen dentro de las diapositivas del PPTX original son notas internas del equipo y</w:t>
+        <w:t xml:space="preserve">Los identificadores 031–032 no se usan. Las etiquetas «EV-C204-006 … 011» que aparecen dentro de las diapositivas del PPTX original son notas internas del equipo y</w:t>
       </w:r>
       <w:r>
         <w:t xml:space="preserve"> </w:t>
@@ -13927,7 +14048,7 @@
     <w:bookmarkEnd w:id="91"/>
     <w:bookmarkEnd w:id="92"/>
     <w:bookmarkEnd w:id="93"/>
-    <w:bookmarkStart w:id="147" w:name="parte-iii-diagnóstico-y-remediación"/>
+    <w:bookmarkStart w:id="156" w:name="parte-iii-diagnóstico-y-remediación"/>
     <w:p>
       <w:pPr>
         <w:pStyle w:val="Heading1"/>
@@ -16626,7 +16747,7 @@
     </w:p>
     <w:bookmarkEnd w:id="137"/>
     <w:bookmarkEnd w:id="138"/>
-    <w:bookmarkStart w:id="145" w:name="fase-2-remediación-de-rojo-a-verde"/>
+    <w:bookmarkStart w:id="151" w:name="fase-2-remediación-de-rojo-a-verde"/>
     <w:p>
       <w:pPr>
         <w:pStyle w:val="Heading2"/>
@@ -18168,7 +18289,7 @@
       </w:r>
     </w:p>
     <w:bookmarkEnd w:id="142"/>
-    <w:bookmarkStart w:id="143" w:name="X802f1d2677ce5a199922dbac06914387fda5134"/>
+    <w:bookmarkStart w:id="149" w:name="X802f1d2677ce5a199922dbac06914387fda5134"/>
     <w:p>
       <w:pPr>
         <w:pStyle w:val="Heading3"/>
@@ -18594,7 +18715,127 @@
         <w:pStyle w:val="BodyText"/>
       </w:pPr>
       <w:r>
-        <w:t xml:space="preserve">Evidencia: EV-C204-008 a 011 (reportes del run verde), EV-C204-025 y 026. El script</w:t>
+        <w:t xml:space="preserve">Evidencia: EV-C204-008 a 011 (reportes del run verde), EV-C204-012, EV-C204-013, EV-C204-025 y 026.</w:t>
+      </w:r>
+    </w:p>
+    <w:p>
+      <w:pPr>
+        <w:pStyle w:val="CaptionedFigure"/>
+      </w:pPr>
+      <w:r>
+        <w:drawing>
+          <wp:inline>
+            <wp:extent cx="5067300" cy="5595496"/>
+            <wp:effectExtent b="0" l="0" r="0" t="0"/>
+            <wp:docPr descr="EV-C204-013 — Run #27 (35442482331, commit 0fc1c11): los 5 jobs en verde y 5 artefactos con su huella SHA-256" title="" id="144" name="Picture"/>
+            <a:graphic>
+              <a:graphicData uri="http://schemas.openxmlformats.org/drawingml/2006/picture">
+                <pic:pic>
+                  <pic:nvPicPr>
+                    <pic:cNvPr descr="evidencias/capturas/EV-C204-013-pipeline-verde.png" id="145" name="Picture"/>
+                    <pic:cNvPicPr>
+                      <a:picLocks noChangeArrowheads="1" noChangeAspect="1"/>
+                    </pic:cNvPicPr>
+                  </pic:nvPicPr>
+                  <pic:blipFill>
+                    <a:blip r:embed="rId143"/>
+                    <a:stretch>
+                      <a:fillRect/>
+                    </a:stretch>
+                  </pic:blipFill>
+                  <pic:spPr bwMode="auto">
+                    <a:xfrm>
+                      <a:off x="0" y="0"/>
+                      <a:ext cx="5067300" cy="5595496"/>
+                    </a:xfrm>
+                    <a:prstGeom prst="rect">
+                      <a:avLst/>
+                    </a:prstGeom>
+                    <a:noFill/>
+                    <a:ln w="9525">
+                      <a:noFill/>
+                      <a:headEnd/>
+                      <a:tailEnd/>
+                    </a:ln>
+                  </pic:spPr>
+                </pic:pic>
+              </a:graphicData>
+            </a:graphic>
+          </wp:inline>
+        </w:drawing>
+      </w:r>
+    </w:p>
+    <w:p>
+      <w:pPr>
+        <w:pStyle w:val="ImageCaption"/>
+      </w:pPr>
+      <w:r>
+        <w:t xml:space="preserve">EV-C204-013 — Run #27 (35442482331, commit</w:t>
+      </w:r>
+      <w:r>
+        <w:t xml:space="preserve"> </w:t>
+      </w:r>
+      <w:r>
+        <w:rPr>
+          <w:rStyle w:val="VerbatimChar"/>
+        </w:rPr>
+        <w:t xml:space="preserve">0fc1c11</w:t>
+      </w:r>
+      <w:r>
+        <w:t xml:space="preserve">): los 5 jobs en verde y 5 artefactos con su huella SHA-256</w:t>
+      </w:r>
+    </w:p>
+    <w:p>
+      <w:pPr>
+        <w:pStyle w:val="BodyText"/>
+      </w:pPr>
+      <w:r>
+        <w:drawing>
+          <wp:inline>
+            <wp:extent cx="5067300" cy="2352876"/>
+            <wp:effectExtent b="0" l="0" r="0" t="0"/>
+            <wp:docPr descr="EV-C204-012 — Code scanning (CodeQL): 0 alertas abiertas y 3 cerradas como corregidas («Missing rate limiting», servidor/servidor.js líneas 57, 72 y 86). El aviso rojo «CodeQL is reporting errors» es un mensaje de estado de GitHub visible en ese momento; los datos del repositorio (EV-C204-025) no muestran ningún error en los análisis" title="" id="147" name="Picture"/>
+            <a:graphic>
+              <a:graphicData uri="http://schemas.openxmlformats.org/drawingml/2006/picture">
+                <pic:pic>
+                  <pic:nvPicPr>
+                    <pic:cNvPr descr="evidencias/capturas/EV-C204-012-codeql-alertas.png" id="148" name="Picture"/>
+                    <pic:cNvPicPr>
+                      <a:picLocks noChangeArrowheads="1" noChangeAspect="1"/>
+                    </pic:cNvPicPr>
+                  </pic:nvPicPr>
+                  <pic:blipFill>
+                    <a:blip r:embed="rId146"/>
+                    <a:stretch>
+                      <a:fillRect/>
+                    </a:stretch>
+                  </pic:blipFill>
+                  <pic:spPr bwMode="auto">
+                    <a:xfrm>
+                      <a:off x="0" y="0"/>
+                      <a:ext cx="5067300" cy="2352876"/>
+                    </a:xfrm>
+                    <a:prstGeom prst="rect">
+                      <a:avLst/>
+                    </a:prstGeom>
+                    <a:noFill/>
+                    <a:ln w="9525">
+                      <a:noFill/>
+                      <a:headEnd/>
+                      <a:tailEnd/>
+                    </a:ln>
+                  </pic:spPr>
+                </pic:pic>
+              </a:graphicData>
+            </a:graphic>
+          </wp:inline>
+        </w:drawing>
+      </w:r>
+      <w:r>
+        <w:t xml:space="preserve"> </w:t>
+      </w:r>
+      <w:r>
+        <w:t xml:space="preserve">El script</w:t>
       </w:r>
       <w:r>
         <w:t xml:space="preserve"> </w:t>
@@ -18628,8 +18869,8 @@
         <w:t xml:space="preserve">a los artefactos del run.</w:t>
       </w:r>
     </w:p>
-    <w:bookmarkEnd w:id="143"/>
-    <w:bookmarkStart w:id="144" w:name="X90c915205735c26bb30e51af496094beb9c6e7a"/>
+    <w:bookmarkEnd w:id="149"/>
+    <w:bookmarkStart w:id="150" w:name="X90c915205735c26bb30e51af496094beb9c6e7a"/>
     <w:p>
       <w:pPr>
         <w:pStyle w:val="Heading3"/>
@@ -18904,9 +19145,9 @@
         </w:tc>
       </w:tr>
     </w:tbl>
-    <w:bookmarkEnd w:id="144"/>
-    <w:bookmarkEnd w:id="145"/>
-    <w:bookmarkStart w:id="146" w:name="protección-de-la-rama-principal"/>
+    <w:bookmarkEnd w:id="150"/>
+    <w:bookmarkEnd w:id="151"/>
+    <w:bookmarkStart w:id="155" w:name="protección-de-la-rama-principal"/>
     <w:p>
       <w:pPr>
         <w:pStyle w:val="Heading2"/>
@@ -18924,13 +19165,13 @@
           <w:bCs/>
           <w:b/>
         </w:rPr>
-        <w:t xml:space="preserve">Estado: pendiente de activar por el titular del repositorio.</w:t>
-      </w:r>
-      <w:r>
-        <w:t xml:space="preserve"> </w:t>
-      </w:r>
-      <w:r>
-        <w:t xml:space="preserve">Cambiar la configuración de seguridad de un repositorio es una decisión de quien lo administra, por lo que no se aplicó automáticamente. La guía (paso 14) pide proteger</w:t>
+        <w:t xml:space="preserve">Estado: activada el 19-sep-2026 por el titular del repositorio</w:t>
+      </w:r>
+      <w:r>
+        <w:t xml:space="preserve"> </w:t>
+      </w:r>
+      <w:r>
+        <w:t xml:space="preserve">(cambiar la configuración de seguridad de un repositorio es decisión de quien lo administra, por lo que no se aplicó automáticamente). La guía (paso 14) pide proteger</w:t>
       </w:r>
       <w:r>
         <w:t xml:space="preserve"> </w:t>
@@ -18950,7 +19191,31 @@
         <w:pStyle w:val="BodyText"/>
       </w:pPr>
       <w:r>
-        <w:t xml:space="preserve">Configuración recomendada (Settings → Rules → Rulesets →</w:t>
+        <w:t xml:space="preserve">Configuración aplicada (Settings → Rules → Rulesets → ruleset</w:t>
+      </w:r>
+      <w:r>
+        <w:t xml:space="preserve"> </w:t>
+      </w:r>
+      <w:r>
+        <w:rPr>
+          <w:rStyle w:val="VerbatimChar"/>
+        </w:rPr>
+        <w:t xml:space="preserve">proteger-main</w:t>
+      </w:r>
+      <w:r>
+        <w:t xml:space="preserve">, activo, objetivo: rama por defecto</w:t>
+      </w:r>
+      <w:r>
+        <w:t xml:space="preserve"> </w:t>
+      </w:r>
+      <w:r>
+        <w:rPr>
+          <w:rStyle w:val="VerbatimChar"/>
+        </w:rPr>
+        <w:t xml:space="preserve">main</w:t>
+      </w:r>
+      <w:r>
+        <w:t xml:space="preserve">, sin excepciones de</w:t>
       </w:r>
       <w:r>
         <w:t xml:space="preserve"> </w:t>
@@ -18960,19 +19225,7 @@
           <w:iCs/>
           <w:i/>
         </w:rPr>
-        <w:t xml:space="preserve">New branch ruleset</w:t>
-      </w:r>
-      <w:r>
-        <w:t xml:space="preserve">, rama objetivo</w:t>
-      </w:r>
-      <w:r>
-        <w:t xml:space="preserve"> </w:t>
-      </w:r>
-      <w:r>
-        <w:rPr>
-          <w:rStyle w:val="VerbatimChar"/>
-        </w:rPr>
-        <w:t xml:space="preserve">main</w:t>
+        <w:t xml:space="preserve">bypass</w:t>
       </w:r>
       <w:r>
         <w:t xml:space="preserve">):</w:t>
@@ -19119,19 +19372,70 @@
         <w:pStyle w:val="FirstParagraph"/>
       </w:pPr>
       <w:r>
-        <w:t xml:space="preserve">El paso a paso con capturas está en</w:t>
-      </w:r>
-      <w:r>
-        <w:t xml:space="preserve"> </w:t>
+        <w:t xml:space="preserve">Se verificó la configuración real con la API de GitHub (</w:t>
       </w:r>
       <w:r>
         <w:rPr>
           <w:rStyle w:val="VerbatimChar"/>
         </w:rPr>
-        <w:t xml:space="preserve">docs/evidencias/INSTRUCCIONES-CAPTURA.md</w:t>
-      </w:r>
-      <w:r>
-        <w:t xml:space="preserve">. Al activarlo, guardar la captura como</w:t>
+        <w:t xml:space="preserve">EV-C204-030-ruleset-main.json</w:t>
+      </w:r>
+      <w:r>
+        <w:t xml:space="preserve">): reglas</w:t>
+      </w:r>
+      <w:r>
+        <w:t xml:space="preserve"> </w:t>
+      </w:r>
+      <w:r>
+        <w:rPr>
+          <w:rStyle w:val="VerbatimChar"/>
+        </w:rPr>
+        <w:t xml:space="preserve">deletion</w:t>
+      </w:r>
+      <w:r>
+        <w:t xml:space="preserve">,</w:t>
+      </w:r>
+      <w:r>
+        <w:t xml:space="preserve"> </w:t>
+      </w:r>
+      <w:r>
+        <w:rPr>
+          <w:rStyle w:val="VerbatimChar"/>
+        </w:rPr>
+        <w:t xml:space="preserve">non_fast_forward</w:t>
+      </w:r>
+      <w:r>
+        <w:t xml:space="preserve">,</w:t>
+      </w:r>
+      <w:r>
+        <w:t xml:space="preserve"> </w:t>
+      </w:r>
+      <w:r>
+        <w:rPr>
+          <w:rStyle w:val="VerbatimChar"/>
+        </w:rPr>
+        <w:t xml:space="preserve">pull_request</w:t>
+      </w:r>
+      <w:r>
+        <w:t xml:space="preserve"> </w:t>
+      </w:r>
+      <w:r>
+        <w:t xml:space="preserve">(0 aprobaciones) y</w:t>
+      </w:r>
+      <w:r>
+        <w:t xml:space="preserve"> </w:t>
+      </w:r>
+      <w:r>
+        <w:rPr>
+          <w:rStyle w:val="VerbatimChar"/>
+        </w:rPr>
+        <w:t xml:space="preserve">required_status_checks</w:t>
+      </w:r>
+      <w:r>
+        <w:t xml:space="preserve"> </w:t>
+      </w:r>
+      <w:r>
+        <w:t xml:space="preserve">con los cinco nombres exactos del pipeline.</w:t>
       </w:r>
       <w:r>
         <w:t xml:space="preserve"> </w:t>
@@ -19141,10 +19445,114 @@
           <w:bCs/>
           <w:b/>
         </w:rPr>
-        <w:t xml:space="preserve">EV-C204-014</w:t>
-      </w:r>
-      <w:r>
-        <w:t xml:space="preserve">.</w:t>
+        <w:t xml:space="preserve">Consecuencia:</w:t>
+      </w:r>
+      <w:r>
+        <w:t xml:space="preserve"> </w:t>
+      </w:r>
+      <w:r>
+        <w:t xml:space="preserve">desde este momento todo cambio a</w:t>
+      </w:r>
+      <w:r>
+        <w:t xml:space="preserve"> </w:t>
+      </w:r>
+      <w:r>
+        <w:rPr>
+          <w:rStyle w:val="VerbatimChar"/>
+        </w:rPr>
+        <w:t xml:space="preserve">main</w:t>
+      </w:r>
+      <w:r>
+        <w:t xml:space="preserve"> </w:t>
+      </w:r>
+      <w:r>
+        <w:t xml:space="preserve">entra por</w:t>
+      </w:r>
+      <w:r>
+        <w:t xml:space="preserve"> </w:t>
+      </w:r>
+      <w:r>
+        <w:rPr>
+          <w:iCs/>
+          <w:i/>
+        </w:rPr>
+        <w:t xml:space="preserve">pull request</w:t>
+      </w:r>
+      <w:r>
+        <w:t xml:space="preserve"> </w:t>
+      </w:r>
+      <w:r>
+        <w:t xml:space="preserve">y solo se puede fusionar con las cinco pruebas en verde.</w:t>
+      </w:r>
+    </w:p>
+    <w:p>
+      <w:pPr>
+        <w:pStyle w:val="CaptionedFigure"/>
+      </w:pPr>
+      <w:r>
+        <w:drawing>
+          <wp:inline>
+            <wp:extent cx="4800600" cy="2686623"/>
+            <wp:effectExtent b="0" l="0" r="0" t="0"/>
+            <wp:docPr descr="EV-C204-014 — Rulesets del repositorio: proteger-main activo, 4 reglas, 1 rama" title="" id="153" name="Picture"/>
+            <a:graphic>
+              <a:graphicData uri="http://schemas.openxmlformats.org/drawingml/2006/picture">
+                <pic:pic>
+                  <pic:nvPicPr>
+                    <pic:cNvPr descr="evidencias/capturas/EV-C204-014-proteccion.png" id="154" name="Picture"/>
+                    <pic:cNvPicPr>
+                      <a:picLocks noChangeArrowheads="1" noChangeAspect="1"/>
+                    </pic:cNvPicPr>
+                  </pic:nvPicPr>
+                  <pic:blipFill>
+                    <a:blip r:embed="rId152"/>
+                    <a:stretch>
+                      <a:fillRect/>
+                    </a:stretch>
+                  </pic:blipFill>
+                  <pic:spPr bwMode="auto">
+                    <a:xfrm>
+                      <a:off x="0" y="0"/>
+                      <a:ext cx="4800600" cy="2686623"/>
+                    </a:xfrm>
+                    <a:prstGeom prst="rect">
+                      <a:avLst/>
+                    </a:prstGeom>
+                    <a:noFill/>
+                    <a:ln w="9525">
+                      <a:noFill/>
+                      <a:headEnd/>
+                      <a:tailEnd/>
+                    </a:ln>
+                  </pic:spPr>
+                </pic:pic>
+              </a:graphicData>
+            </a:graphic>
+          </wp:inline>
+        </w:drawing>
+      </w:r>
+    </w:p>
+    <w:p>
+      <w:pPr>
+        <w:pStyle w:val="ImageCaption"/>
+      </w:pPr>
+      <w:r>
+        <w:t xml:space="preserve">EV-C204-014 — Rulesets del repositorio:</w:t>
+      </w:r>
+      <w:r>
+        <w:t xml:space="preserve"> </w:t>
+      </w:r>
+      <w:r>
+        <w:rPr>
+          <w:rStyle w:val="VerbatimChar"/>
+        </w:rPr>
+        <w:t xml:space="preserve">proteger-main</w:t>
+      </w:r>
+      <w:r>
+        <w:t xml:space="preserve"> </w:t>
+      </w:r>
+      <w:r>
+        <w:t xml:space="preserve">activo, 4 reglas, 1 rama</w:t>
       </w:r>
     </w:p>
     <w:p>
@@ -19162,20 +19570,7 @@
         <w:t xml:space="preserve"> </w:t>
       </w:r>
       <w:r>
-        <w:t xml:space="preserve">EV-C204-014 —</w:t>
-      </w:r>
-      <w:r>
-        <w:t xml:space="preserve"> </w:t>
-      </w:r>
-      <w:r>
-        <w:rPr>
-          <w:bCs/>
-          <w:b/>
-        </w:rPr>
-        <w:t xml:space="preserve">pendiente del equipo</w:t>
-      </w:r>
-      <w:r>
-        <w:t xml:space="preserve">.</w:t>
+        <w:t xml:space="preserve">EV-C204-014 y EV-C204-030.</w:t>
       </w:r>
     </w:p>
     <w:p>
@@ -19185,9 +19580,9 @@
         </w:pict>
       </w:r>
     </w:p>
-    <w:bookmarkEnd w:id="146"/>
-    <w:bookmarkEnd w:id="147"/>
-    <w:bookmarkStart w:id="154" w:name="parte-iv-pruebas-y-riesgos"/>
+    <w:bookmarkEnd w:id="155"/>
+    <w:bookmarkEnd w:id="156"/>
+    <w:bookmarkStart w:id="163" w:name="parte-iv-pruebas-y-riesgos"/>
     <w:p>
       <w:pPr>
         <w:pStyle w:val="Heading1"/>
@@ -19196,7 +19591,7 @@
         <w:t xml:space="preserve">PARTE IV — PRUEBAS Y RIESGOS</w:t>
       </w:r>
     </w:p>
-    <w:bookmarkStart w:id="149" w:name="cálculo-de-riesgo"/>
+    <w:bookmarkStart w:id="158" w:name="cálculo-de-riesgo"/>
     <w:p>
       <w:pPr>
         <w:pStyle w:val="Heading2"/>
@@ -19231,7 +19626,7 @@
       <w:r>
         <w:t xml:space="preserve"> </w:t>
       </w:r>
-      <w:hyperlink r:id="rId148">
+      <w:hyperlink r:id="rId157">
         <w:r>
           <w:rPr>
             <w:rStyle w:val="VerbatimChar"/>
@@ -19488,8 +19883,8 @@
         <w:t xml:space="preserve">Riesgo residual aceptado: CVEs de util-linux sin parche, falso positivo de ZAP en respuestas 404 y secretos ficticios que permanecen en el historial de git.</w:t>
       </w:r>
     </w:p>
-    <w:bookmarkEnd w:id="149"/>
-    <w:bookmarkStart w:id="151" w:name="documentación-de-pruebas"/>
+    <w:bookmarkEnd w:id="158"/>
+    <w:bookmarkStart w:id="160" w:name="documentación-de-pruebas"/>
     <w:p>
       <w:pPr>
         <w:pStyle w:val="Heading2"/>
@@ -19524,7 +19919,7 @@
       <w:r>
         <w:t xml:space="preserve"> </w:t>
       </w:r>
-      <w:hyperlink r:id="rId150">
+      <w:hyperlink r:id="rId159">
         <w:r>
           <w:rPr>
             <w:rStyle w:val="VerbatimChar"/>
@@ -19886,8 +20281,8 @@
         <w:t xml:space="preserve">P-27 (app móvil) y P-28 (consola de Keycloak en el Codespace).</w:t>
       </w:r>
     </w:p>
-    <w:bookmarkEnd w:id="151"/>
-    <w:bookmarkStart w:id="153" w:name="plantilla-de-diagnóstico-del-curso"/>
+    <w:bookmarkEnd w:id="160"/>
+    <w:bookmarkStart w:id="162" w:name="plantilla-de-diagnóstico-del-curso"/>
     <w:p>
       <w:pPr>
         <w:pStyle w:val="Heading2"/>
@@ -19906,7 +20301,7 @@
       <w:r>
         <w:t xml:space="preserve"> </w:t>
       </w:r>
-      <w:hyperlink r:id="rId152">
+      <w:hyperlink r:id="rId161">
         <w:r>
           <w:rPr>
             <w:rStyle w:val="VerbatimChar"/>
@@ -19928,9 +20323,9 @@
         </w:pict>
       </w:r>
     </w:p>
-    <w:bookmarkEnd w:id="153"/>
-    <w:bookmarkEnd w:id="154"/>
-    <w:bookmarkStart w:id="212" w:name="parte-v-cierre-académico"/>
+    <w:bookmarkEnd w:id="162"/>
+    <w:bookmarkEnd w:id="163"/>
+    <w:bookmarkStart w:id="221" w:name="parte-v-cierre-académico"/>
     <w:p>
       <w:pPr>
         <w:pStyle w:val="Heading1"/>
@@ -19939,7 +20334,7 @@
         <w:t xml:space="preserve">PARTE V — CIERRE ACADÉMICO</w:t>
       </w:r>
     </w:p>
-    <w:bookmarkStart w:id="155" w:name="resumen-de-resultados"/>
+    <w:bookmarkStart w:id="164" w:name="resumen-de-resultados"/>
     <w:p>
       <w:pPr>
         <w:pStyle w:val="Heading2"/>
@@ -20379,8 +20774,8 @@
         </w:tc>
       </w:tr>
     </w:tbl>
-    <w:bookmarkEnd w:id="155"/>
-    <w:bookmarkStart w:id="156" w:name="conclusiones"/>
+    <w:bookmarkEnd w:id="164"/>
+    <w:bookmarkStart w:id="165" w:name="conclusiones"/>
     <w:p>
       <w:pPr>
         <w:pStyle w:val="Heading2"/>
@@ -20577,11 +20972,11 @@
         <w:t xml:space="preserve"> </w:t>
       </w:r>
       <w:r>
-        <w:t xml:space="preserve">La app móvil y la consola de Keycloak del Codespace no se pudieron verificar en este entorno (pendiente del equipo); las llaves RSA se generan en memoria y se pierden al reiniciar (adecuado para un laboratorio, no para producción).</w:t>
+        <w:t xml:space="preserve">La app móvil y la consola de Keycloak del Codespace no se pudieron verificar en este entorno (pendiente del equipo) y el Codespace con Docker aún debe confirmarse; las llaves RSA se generan en memoria y se pierden al reiniciar (adecuado para un laboratorio, no para producción).</w:t>
       </w:r>
     </w:p>
-    <w:bookmarkEnd w:id="156"/>
-    <w:bookmarkStart w:id="157" w:name="recomendaciones"/>
+    <w:bookmarkEnd w:id="165"/>
+    <w:bookmarkStart w:id="166" w:name="recomendaciones"/>
     <w:p>
       <w:pPr>
         <w:pStyle w:val="Heading2"/>
@@ -20637,7 +21032,7 @@
           <w:bCs/>
           <w:b/>
         </w:rPr>
-        <w:t xml:space="preserve">Activar la protección de</w:t>
+        <w:t xml:space="preserve">Mantener la protección de</w:t>
       </w:r>
       <w:r>
         <w:rPr>
@@ -20658,7 +21053,7 @@
         <w:t xml:space="preserve"> </w:t>
       </w:r>
       <w:r>
-        <w:t xml:space="preserve">(§15) para que ningún cambio llegue sin las cinco pruebas en verde.</w:t>
+        <w:t xml:space="preserve">(§15, ya activa) y, si el equipo crece, exigir al menos una aprobación de revisión.</w:t>
       </w:r>
       <w:r>
         <w:t xml:space="preserve"> </w:t>
@@ -20956,8 +21351,8 @@
         <w:t xml:space="preserve">del código junto al pipeline, dado el hallazgo metodológico de §13.4.</w:t>
       </w:r>
     </w:p>
-    <w:bookmarkEnd w:id="157"/>
-    <w:bookmarkStart w:id="158" w:name="referencias"/>
+    <w:bookmarkEnd w:id="166"/>
+    <w:bookmarkStart w:id="167" w:name="referencias"/>
     <w:p>
       <w:pPr>
         <w:pStyle w:val="Heading2"/>
@@ -21352,8 +21747,8 @@
         </w:pict>
       </w:r>
     </w:p>
-    <w:bookmarkEnd w:id="158"/>
-    <w:bookmarkStart w:id="159" w:name="cobertura-de-la-rúbrica-del-proyecto"/>
+    <w:bookmarkEnd w:id="167"/>
+    <w:bookmarkStart w:id="168" w:name="cobertura-de-la-rúbrica-del-proyecto"/>
     <w:p>
       <w:pPr>
         <w:pStyle w:val="Heading2"/>
@@ -21851,8 +22246,8 @@
         </w:pict>
       </w:r>
     </w:p>
-    <w:bookmarkEnd w:id="159"/>
-    <w:bookmarkStart w:id="160" w:name="anexos"/>
+    <w:bookmarkEnd w:id="168"/>
+    <w:bookmarkStart w:id="169" w:name="anexos"/>
     <w:p>
       <w:pPr>
         <w:pStyle w:val="Heading2"/>
@@ -22088,8 +22483,8 @@
         </w:pict>
       </w:r>
     </w:p>
-    <w:bookmarkEnd w:id="160"/>
-    <w:bookmarkStart w:id="199" w:name="anexo-a-tablas-16-completas"/>
+    <w:bookmarkEnd w:id="169"/>
+    <w:bookmarkStart w:id="208" w:name="anexo-a-tablas-16-completas"/>
     <w:p>
       <w:pPr>
         <w:pStyle w:val="Heading2"/>
@@ -22098,7 +22493,7 @@
         <w:t xml:space="preserve">Anexo A — Tablas 1–6 completas</w:t>
       </w:r>
     </w:p>
-    <w:bookmarkStart w:id="166" w:name="tabla-1-requisitos-de-seguridad"/>
+    <w:bookmarkStart w:id="175" w:name="tabla-1-requisitos-de-seguridad"/>
     <w:p>
       <w:pPr>
         <w:pStyle w:val="Heading3"/>
@@ -22137,7 +22532,7 @@
         <w:t xml:space="preserve">Marco de referencia: OWASP SAMM, NIST SSDF, OWASP ASVS y OWASP MASVS.</w:t>
       </w:r>
     </w:p>
-    <w:bookmarkStart w:id="161" w:name="requisitos-de-seguridad"/>
+    <w:bookmarkStart w:id="170" w:name="requisitos-de-seguridad"/>
     <w:p>
       <w:pPr>
         <w:pStyle w:val="Heading4"/>
@@ -22539,8 +22934,8 @@
         </w:tc>
       </w:tr>
     </w:tbl>
-    <w:bookmarkEnd w:id="161"/>
-    <w:bookmarkStart w:id="162" w:name="justificación-de-cada-requisito-por-qué"/>
+    <w:bookmarkEnd w:id="170"/>
+    <w:bookmarkStart w:id="171" w:name="justificación-de-cada-requisito-por-qué"/>
     <w:p>
       <w:pPr>
         <w:pStyle w:val="Heading4"/>
@@ -22671,8 +23066,8 @@
         <w:t xml:space="preserve">Para operaciones sensibles, debe quedar evidencia de quién hizo qué y cuándo. La bitácora permite auditoría y detección de abusos. Se documenta como requisito adicional para exceder el alcance mínimo (CIA + autenticación).</w:t>
       </w:r>
     </w:p>
-    <w:bookmarkEnd w:id="162"/>
-    <w:bookmarkStart w:id="163" w:name="mapeo-con-estándares"/>
+    <w:bookmarkEnd w:id="171"/>
+    <w:bookmarkStart w:id="172" w:name="mapeo-con-estándares"/>
     <w:p>
       <w:pPr>
         <w:pStyle w:val="Heading4"/>
@@ -23071,8 +23466,8 @@
         </w:tc>
       </w:tr>
     </w:tbl>
-    <w:bookmarkEnd w:id="163"/>
-    <w:bookmarkStart w:id="164" w:name="X666b4e7d9d99764e434239e12ace7d4bf548d22"/>
+    <w:bookmarkEnd w:id="172"/>
+    <w:bookmarkStart w:id="173" w:name="X666b4e7d9d99764e434239e12ace7d4bf548d22"/>
     <w:p>
       <w:pPr>
         <w:pStyle w:val="Heading4"/>
@@ -23372,8 +23767,8 @@
         </w:tc>
       </w:tr>
     </w:tbl>
-    <w:bookmarkEnd w:id="164"/>
-    <w:bookmarkStart w:id="165" w:name="nota-de-trazabilidad"/>
+    <w:bookmarkEnd w:id="173"/>
+    <w:bookmarkStart w:id="174" w:name="nota-de-trazabilidad"/>
     <w:p>
       <w:pPr>
         <w:pStyle w:val="Heading4"/>
@@ -23390,9 +23785,9 @@
         <w:t xml:space="preserve">Esta tabla alimenta: informe §5, Tabla 2 (STRIDE — los controles responden a las amenazas), Tabla 5 (riesgo — los requisitos priorizan las mitigaciones) y Tabla 6 (pruebas — cada requisito tiene su prueba de verificación).</w:t>
       </w:r>
     </w:p>
-    <w:bookmarkEnd w:id="165"/>
-    <w:bookmarkEnd w:id="166"/>
-    <w:bookmarkStart w:id="172" w:name="tabla-2-amenazas-stride"/>
+    <w:bookmarkEnd w:id="174"/>
+    <w:bookmarkEnd w:id="175"/>
+    <w:bookmarkStart w:id="181" w:name="tabla-2-amenazas-stride"/>
     <w:p>
       <w:pPr>
         <w:pStyle w:val="Heading3"/>
@@ -23425,7 +23820,7 @@
         <w:t xml:space="preserve">— Primer Avance. Modelado de amenazas con STRIDE (Microsoft): por cada amenaza, qué componente afecta, un ejemplo de ataque y cómo se frena.</w:t>
       </w:r>
     </w:p>
-    <w:bookmarkStart w:id="167" w:name="amenazas-stride-1"/>
+    <w:bookmarkStart w:id="176" w:name="amenazas-stride-1"/>
     <w:p>
       <w:pPr>
         <w:pStyle w:val="Heading4"/>
@@ -23858,8 +24253,8 @@
         </w:tc>
       </w:tr>
     </w:tbl>
-    <w:bookmarkEnd w:id="167"/>
-    <w:bookmarkStart w:id="168" w:name="severidad-estimada-por-amenaza"/>
+    <w:bookmarkEnd w:id="176"/>
+    <w:bookmarkStart w:id="177" w:name="severidad-estimada-por-amenaza"/>
     <w:p>
       <w:pPr>
         <w:pStyle w:val="Heading4"/>
@@ -24202,8 +24597,8 @@
         </w:tc>
       </w:tr>
     </w:tbl>
-    <w:bookmarkEnd w:id="168"/>
-    <w:bookmarkStart w:id="169" w:name="X4136c939b174cf6b5602bf7d696b7a729574dcc"/>
+    <w:bookmarkEnd w:id="177"/>
+    <w:bookmarkStart w:id="178" w:name="X4136c939b174cf6b5602bf7d696b7a729574dcc"/>
     <w:p>
       <w:pPr>
         <w:pStyle w:val="Heading4"/>
@@ -24774,8 +25169,8 @@
         </w:tc>
       </w:tr>
     </w:tbl>
-    <w:bookmarkEnd w:id="169"/>
-    <w:bookmarkStart w:id="170" w:name="mapeo-a-cwe-para-cruzar-con-la-tabla-3"/>
+    <w:bookmarkEnd w:id="178"/>
+    <w:bookmarkStart w:id="179" w:name="mapeo-a-cwe-para-cruzar-con-la-tabla-3"/>
     <w:p>
       <w:pPr>
         <w:pStyle w:val="Heading4"/>
@@ -25084,8 +25479,8 @@
         </w:tc>
       </w:tr>
     </w:tbl>
-    <w:bookmarkEnd w:id="170"/>
-    <w:bookmarkStart w:id="171" w:name="nota-de-trazabilidad-1"/>
+    <w:bookmarkEnd w:id="179"/>
+    <w:bookmarkStart w:id="180" w:name="nota-de-trazabilidad-1"/>
     <w:p>
       <w:pPr>
         <w:pStyle w:val="Heading4"/>
@@ -25102,9 +25497,9 @@
         <w:t xml:space="preserve">Esta tabla alimenta: informe §6, Tabla 3 (los hallazgos de Fase 1 se clasifican por amenaza/CWE), Tabla 5 (riesgo — la severidad aquí se cuantifica con P×I) y Tabla 6 (las pruebas de verificación de esta tabla se ejecutan y documentan).</w:t>
       </w:r>
     </w:p>
-    <w:bookmarkEnd w:id="171"/>
-    <w:bookmarkEnd w:id="172"/>
-    <w:bookmarkStart w:id="178" w:name="X88e3b57aa7f7cbbca5e2ce00a2ca14142f424a2"/>
+    <w:bookmarkEnd w:id="180"/>
+    <w:bookmarkEnd w:id="181"/>
+    <w:bookmarkStart w:id="187" w:name="X88e3b57aa7f7cbbca5e2ce00a2ca14142f424a2"/>
     <w:p>
       <w:pPr>
         <w:pStyle w:val="Heading3"/>
@@ -25159,7 +25554,7 @@
         <w:t xml:space="preserve">, código oficial sin remediar), descargada de GitHub Actions. Es la única corrida que refleja el proyecto tal como llegó, antes de corregir. Reportes: EV-C204-020/021/022 (zips de artefactos), EV-C204-027 (SBOM) y EV-C204-028 (log de los jobs en rojo); capturas de pantalla EV-C204-033 a EV-C204-051.</w:t>
       </w:r>
     </w:p>
-    <w:bookmarkStart w:id="173" w:name="resultado-por-prueba"/>
+    <w:bookmarkStart w:id="182" w:name="resultado-por-prueba"/>
     <w:p>
       <w:pPr>
         <w:pStyle w:val="Heading4"/>
@@ -25610,8 +26005,8 @@
         </w:tc>
       </w:tr>
     </w:tbl>
-    <w:bookmarkEnd w:id="173"/>
-    <w:bookmarkStart w:id="174" w:name="hallazgos-h-01-a-h-15"/>
+    <w:bookmarkEnd w:id="182"/>
+    <w:bookmarkStart w:id="183" w:name="hallazgos-h-01-a-h-15"/>
     <w:p>
       <w:pPr>
         <w:pStyle w:val="Heading4"/>
@@ -27642,8 +28037,8 @@
         <w:t xml:space="preserve">: por eso la revisión manual del código sigue siendo necesaria además del pipeline.</w:t>
       </w:r>
     </w:p>
-    <w:bookmarkEnd w:id="174"/>
-    <w:bookmarkStart w:id="175" w:name="dónde-encontrar-cada-hallazgo"/>
+    <w:bookmarkEnd w:id="183"/>
+    <w:bookmarkStart w:id="184" w:name="dónde-encontrar-cada-hallazgo"/>
     <w:p>
       <w:pPr>
         <w:pStyle w:val="Heading4"/>
@@ -27931,8 +28326,8 @@
         </w:tc>
       </w:tr>
     </w:tbl>
-    <w:bookmarkEnd w:id="175"/>
-    <w:bookmarkStart w:id="176" w:name="evidencia-descargada-fase-1"/>
+    <w:bookmarkEnd w:id="184"/>
+    <w:bookmarkStart w:id="185" w:name="evidencia-descargada-fase-1"/>
     <w:p>
       <w:pPr>
         <w:pStyle w:val="Heading4"/>
@@ -28123,8 +28518,8 @@
         <w:t xml:space="preserve">porque el job de CodeQL avanzado no llegó a publicar alertas; las alertas de CodeQL de la Fase 2 están en EV-C204-025.</w:t>
       </w:r>
     </w:p>
-    <w:bookmarkEnd w:id="176"/>
-    <w:bookmarkStart w:id="177" w:name="registro-de-confirmación"/>
+    <w:bookmarkEnd w:id="185"/>
+    <w:bookmarkStart w:id="186" w:name="registro-de-confirmación"/>
     <w:p>
       <w:pPr>
         <w:pStyle w:val="Heading4"/>
@@ -28173,9 +28568,9 @@
         <w:t xml:space="preserve">(H-06, H-10, H-12, H-16); H-15 es un falso positivo documentado. Ningún hallazgo esperado quedó sin evidencia de alguna de las dos fuentes.</w:t>
       </w:r>
     </w:p>
-    <w:bookmarkEnd w:id="177"/>
-    <w:bookmarkEnd w:id="178"/>
-    <w:bookmarkStart w:id="181" w:name="X37972edf4fadebafaabacd263fa60fae156b3b2"/>
+    <w:bookmarkEnd w:id="186"/>
+    <w:bookmarkEnd w:id="187"/>
+    <w:bookmarkStart w:id="190" w:name="X37972edf4fadebafaabacd263fa60fae156b3b2"/>
     <w:p>
       <w:pPr>
         <w:pStyle w:val="Heading3"/>
@@ -28248,7 +28643,7 @@
         <w:t xml:space="preserve">, 5/5 jobs en verde y CodeQL con 0 alertas abiertas, EV-C204-026 y EV-C204-025).</w:t>
       </w:r>
     </w:p>
-    <w:bookmarkStart w:id="179" w:name="evidencia-antesdespués-por-hallazgo"/>
+    <w:bookmarkStart w:id="188" w:name="evidencia-antesdespués-por-hallazgo"/>
     <w:p>
       <w:pPr>
         <w:pStyle w:val="Heading4"/>
@@ -30095,8 +30490,8 @@
         </w:tc>
       </w:tr>
     </w:tbl>
-    <w:bookmarkEnd w:id="179"/>
-    <w:bookmarkStart w:id="180" w:name="Xcafc4bbed3100adc00f4dde4e229385ac3cc079"/>
+    <w:bookmarkEnd w:id="188"/>
+    <w:bookmarkStart w:id="189" w:name="Xcafc4bbed3100adc00f4dde4e229385ac3cc079"/>
     <w:p>
       <w:pPr>
         <w:pStyle w:val="Heading4"/>
@@ -31064,9 +31459,9 @@
         <w:t xml:space="preserve">.</w:t>
       </w:r>
     </w:p>
-    <w:bookmarkEnd w:id="180"/>
-    <w:bookmarkEnd w:id="181"/>
-    <w:bookmarkStart w:id="190" w:name="tabla-5-cálculo-de-riesgo"/>
+    <w:bookmarkEnd w:id="189"/>
+    <w:bookmarkEnd w:id="190"/>
+    <w:bookmarkStart w:id="199" w:name="tabla-5-cálculo-de-riesgo"/>
     <w:p>
       <w:pPr>
         <w:pStyle w:val="Heading3"/>
@@ -31125,7 +31520,7 @@
         <w:t xml:space="preserve">con la evidencia de la corrida verde 35442482331 (Tabla 4). Los valores de P e I son un juicio fundamentado del equipo con la escala documentada abajo; no son mediciones.</w:t>
       </w:r>
     </w:p>
-    <w:bookmarkStart w:id="182" w:name="metodología-1"/>
+    <w:bookmarkStart w:id="191" w:name="metodología-1"/>
     <w:p>
       <w:pPr>
         <w:pStyle w:val="Heading4"/>
@@ -31357,8 +31752,8 @@
         <w:t xml:space="preserve">Bajo (1–2) · Medio (3–4) · Alto (6–9)</w:t>
       </w:r>
     </w:p>
-    <w:bookmarkEnd w:id="182"/>
-    <w:bookmarkStart w:id="183" w:name="X5c4b44931359586bf6fdcf229fcfeb0dad2479a"/>
+    <w:bookmarkEnd w:id="191"/>
+    <w:bookmarkStart w:id="192" w:name="X5c4b44931359586bf6fdcf229fcfeb0dad2479a"/>
     <w:p>
       <w:pPr>
         <w:pStyle w:val="Heading4"/>
@@ -33366,8 +33761,8 @@
         <w:t xml:space="preserve">. Ningún riesgo llega a 1 porque el impacto potencial del activo no cambia con la corrección; solo baja la probabilidad.</w:t>
       </w:r>
     </w:p>
-    <w:bookmarkEnd w:id="183"/>
-    <w:bookmarkStart w:id="186" w:name="análisis-gerencial-complementario"/>
+    <w:bookmarkEnd w:id="192"/>
+    <w:bookmarkStart w:id="195" w:name="análisis-gerencial-complementario"/>
     <w:p>
       <w:pPr>
         <w:pStyle w:val="Heading4"/>
@@ -33376,7 +33771,7 @@
         <w:t xml:space="preserve">Análisis gerencial complementario</w:t>
       </w:r>
     </w:p>
-    <w:bookmarkStart w:id="184" w:name="pérdida-anual-esperada-ale"/>
+    <w:bookmarkStart w:id="193" w:name="pérdida-anual-esperada-ale"/>
     <w:p>
       <w:pPr>
         <w:pStyle w:val="Heading5"/>
@@ -34058,8 +34453,8 @@
         <w:t xml:space="preserve">para el laboratorio académico (no hay un negocio real detrás) y se ajustarían con datos del contexto si el docente lo solicita. La tasa ARO «después» es una estimación del equipo tras los controles verificados.</w:t>
       </w:r>
     </w:p>
-    <w:bookmarkEnd w:id="184"/>
-    <w:bookmarkStart w:id="185" w:name="justificación-de-probabilidades"/>
+    <w:bookmarkEnd w:id="193"/>
+    <w:bookmarkStart w:id="194" w:name="justificación-de-probabilidades"/>
     <w:p>
       <w:pPr>
         <w:pStyle w:val="Heading5"/>
@@ -34215,9 +34610,9 @@
         <w:t xml:space="preserve">P=3: cualquiera puede repetir peticiones sin límite; impacto 2 (abuso del servicio como oráculo o saturación).</w:t>
       </w:r>
     </w:p>
-    <w:bookmarkEnd w:id="185"/>
-    <w:bookmarkEnd w:id="186"/>
-    <w:bookmarkStart w:id="187" w:name="priorización-y-decisiones"/>
+    <w:bookmarkEnd w:id="194"/>
+    <w:bookmarkEnd w:id="195"/>
+    <w:bookmarkStart w:id="196" w:name="priorización-y-decisiones"/>
     <w:p>
       <w:pPr>
         <w:pStyle w:val="Heading4"/>
@@ -34278,8 +34673,8 @@
         <w:t xml:space="preserve">.</w:t>
       </w:r>
     </w:p>
-    <w:bookmarkEnd w:id="187"/>
-    <w:bookmarkStart w:id="188" w:name="riesgo-residual-aceptado"/>
+    <w:bookmarkEnd w:id="196"/>
+    <w:bookmarkStart w:id="197" w:name="riesgo-residual-aceptado"/>
     <w:p>
       <w:pPr>
         <w:pStyle w:val="Heading4"/>
@@ -34366,8 +34761,8 @@
         <w:t xml:space="preserve">: los valores de práctica siguen en el historial de git; son ficticios. En un proyecto real habría que rotarlos y reescribir el historial.</w:t>
       </w:r>
     </w:p>
-    <w:bookmarkEnd w:id="188"/>
-    <w:bookmarkStart w:id="189" w:name="nota-de-trazabilidad-2"/>
+    <w:bookmarkEnd w:id="197"/>
+    <w:bookmarkStart w:id="198" w:name="nota-de-trazabilidad-2"/>
     <w:p>
       <w:pPr>
         <w:pStyle w:val="Heading4"/>
@@ -34384,9 +34779,9 @@
         <w:t xml:space="preserve">Esta tabla alimenta: informe §16, la plantilla de diagnóstico y la Tabla 4.</w:t>
       </w:r>
     </w:p>
-    <w:bookmarkEnd w:id="189"/>
-    <w:bookmarkEnd w:id="190"/>
-    <w:bookmarkStart w:id="198" w:name="tabla-6-documentación-de-pruebas"/>
+    <w:bookmarkEnd w:id="198"/>
+    <w:bookmarkEnd w:id="199"/>
+    <w:bookmarkStart w:id="207" w:name="tabla-6-documentación-de-pruebas"/>
     <w:p>
       <w:pPr>
         <w:pStyle w:val="Heading3"/>
@@ -34495,7 +34890,7 @@
         <w:t xml:space="preserve">0).</w:t>
       </w:r>
     </w:p>
-    <w:bookmarkStart w:id="191" w:name="pruebas-funcionales-del-servicio"/>
+    <w:bookmarkStart w:id="200" w:name="pruebas-funcionales-del-servicio"/>
     <w:p>
       <w:pPr>
         <w:pStyle w:val="Heading4"/>
@@ -35744,8 +36139,8 @@
         </w:tc>
       </w:tr>
     </w:tbl>
-    <w:bookmarkEnd w:id="191"/>
-    <w:bookmarkStart w:id="192" w:name="pruebas-del-pipeline-github-actions"/>
+    <w:bookmarkEnd w:id="200"/>
+    <w:bookmarkStart w:id="201" w:name="pruebas-del-pipeline-github-actions"/>
     <w:p>
       <w:pPr>
         <w:pStyle w:val="Heading4"/>
@@ -36231,8 +36626,8 @@
         </w:tc>
       </w:tr>
     </w:tbl>
-    <w:bookmarkEnd w:id="192"/>
-    <w:bookmarkStart w:id="193" w:name="pruebas-de-pentest-manual"/>
+    <w:bookmarkEnd w:id="201"/>
+    <w:bookmarkStart w:id="202" w:name="pruebas-de-pentest-manual"/>
     <w:p>
       <w:pPr>
         <w:pStyle w:val="Heading4"/>
@@ -37152,8 +37547,8 @@
         </w:tc>
       </w:tr>
     </w:tbl>
-    <w:bookmarkEnd w:id="193"/>
-    <w:bookmarkStart w:id="194" w:name="X207d9e294f25d3c7c9d023b75d8e86673560f2f"/>
+    <w:bookmarkEnd w:id="202"/>
+    <w:bookmarkStart w:id="203" w:name="X207d9e294f25d3c7c9d023b75d8e86673560f2f"/>
     <w:p>
       <w:pPr>
         <w:pStyle w:val="Heading4"/>
@@ -37646,8 +38041,8 @@
         </w:tc>
       </w:tr>
     </w:tbl>
-    <w:bookmarkEnd w:id="194"/>
-    <w:bookmarkStart w:id="195" w:name="ajustes-de-pruebas-realizados"/>
+    <w:bookmarkEnd w:id="203"/>
+    <w:bookmarkStart w:id="204" w:name="ajustes-de-pruebas-realizados"/>
     <w:p>
       <w:pPr>
         <w:pStyle w:val="Heading4"/>
@@ -37906,8 +38301,8 @@
         <w:t xml:space="preserve">la primera prueba de expiración esperó 8 s con tokens de 5 s y aceptó el token, porque el servicio tolera 5 s de desfase de reloj. No era un fallo del servicio: se ajustó la espera a 12 s.</w:t>
       </w:r>
     </w:p>
-    <w:bookmarkEnd w:id="195"/>
-    <w:bookmarkStart w:id="196" w:name="X267b18a9dacca8e9e870fac5000f4897318d54f"/>
+    <w:bookmarkEnd w:id="204"/>
+    <w:bookmarkStart w:id="205" w:name="X267b18a9dacca8e9e870fac5000f4897318d54f"/>
     <w:p>
       <w:pPr>
         <w:pStyle w:val="Heading4"/>
@@ -38133,8 +38528,8 @@
         </w:tc>
       </w:tr>
     </w:tbl>
-    <w:bookmarkEnd w:id="196"/>
-    <w:bookmarkStart w:id="197" w:name="nota-de-trazabilidad-3"/>
+    <w:bookmarkEnd w:id="205"/>
+    <w:bookmarkStart w:id="206" w:name="nota-de-trazabilidad-3"/>
     <w:p>
       <w:pPr>
         <w:pStyle w:val="Heading4"/>
@@ -38158,10 +38553,10 @@
         </w:pict>
       </w:r>
     </w:p>
-    <w:bookmarkEnd w:id="197"/>
-    <w:bookmarkEnd w:id="198"/>
-    <w:bookmarkEnd w:id="199"/>
-    <w:bookmarkStart w:id="200" w:name="anexo-b-reportes-del-pipeline"/>
+    <w:bookmarkEnd w:id="206"/>
+    <w:bookmarkEnd w:id="207"/>
+    <w:bookmarkEnd w:id="208"/>
+    <w:bookmarkStart w:id="209" w:name="anexo-b-reportes-del-pipeline"/>
     <w:p>
       <w:pPr>
         <w:pStyle w:val="Heading2"/>
@@ -38588,8 +38983,8 @@
         </w:pict>
       </w:r>
     </w:p>
-    <w:bookmarkEnd w:id="200"/>
-    <w:bookmarkStart w:id="201" w:name="anexo-c-manifiesto-sha-256"/>
+    <w:bookmarkEnd w:id="209"/>
+    <w:bookmarkStart w:id="210" w:name="anexo-c-manifiesto-sha-256"/>
     <w:p>
       <w:pPr>
         <w:pStyle w:val="Heading2"/>
@@ -38729,8 +39124,8 @@
         </w:pict>
       </w:r>
     </w:p>
-    <w:bookmarkEnd w:id="201"/>
-    <w:bookmarkStart w:id="202" w:name="X1192fa1c2e07773af67639ba7cbc366731d2a91"/>
+    <w:bookmarkEnd w:id="210"/>
+    <w:bookmarkStart w:id="211" w:name="X1192fa1c2e07773af67639ba7cbc366731d2a91"/>
     <w:p>
       <w:pPr>
         <w:pStyle w:val="Heading2"/>
@@ -40053,8 +40448,8 @@
         </w:pict>
       </w:r>
     </w:p>
-    <w:bookmarkEnd w:id="202"/>
-    <w:bookmarkStart w:id="203" w:name="anexo-e-cronograma-del-proyecto"/>
+    <w:bookmarkEnd w:id="211"/>
+    <w:bookmarkStart w:id="212" w:name="anexo-e-cronograma-del-proyecto"/>
     <w:p>
       <w:pPr>
         <w:pStyle w:val="Heading2"/>
@@ -40541,7 +40936,7 @@
               <w:jc w:val="left"/>
             </w:pPr>
             <w:r>
-              <w:t xml:space="preserve">✅ CodeQL revisado · ⏳ protección de</w:t>
+              <w:t xml:space="preserve">✅ CodeQL revisado · ✅ protección de</w:t>
             </w:r>
             <w:r>
               <w:t xml:space="preserve"> </w:t>
@@ -40649,8 +41044,8 @@
         </w:pict>
       </w:r>
     </w:p>
-    <w:bookmarkEnd w:id="203"/>
-    <w:bookmarkStart w:id="207" w:name="X97195745177c874f01ad80e4dce35521f49f2f2"/>
+    <w:bookmarkEnd w:id="212"/>
+    <w:bookmarkStart w:id="216" w:name="X97195745177c874f01ad80e4dce35521f49f2f2"/>
     <w:p>
       <w:pPr>
         <w:pStyle w:val="Heading2"/>
@@ -40659,7 +41054,7 @@
         <w:t xml:space="preserve">Anexo F — Guía de lectura (evidencias, siglas y archivos)</w:t>
       </w:r>
     </w:p>
-    <w:bookmarkStart w:id="204" w:name="sistema-de-evidencias"/>
+    <w:bookmarkStart w:id="213" w:name="sistema-de-evidencias"/>
     <w:p>
       <w:pPr>
         <w:pStyle w:val="Heading3"/>
@@ -40734,8 +41129,8 @@
         <w:t xml:space="preserve">registra el SHA-256 de cada una (Anexo C).</w:t>
       </w:r>
     </w:p>
-    <w:bookmarkEnd w:id="204"/>
-    <w:bookmarkStart w:id="205" w:name="siglas-usadas"/>
+    <w:bookmarkEnd w:id="213"/>
+    <w:bookmarkStart w:id="214" w:name="siglas-usadas"/>
     <w:p>
       <w:pPr>
         <w:pStyle w:val="Heading3"/>
@@ -41097,8 +41492,8 @@
         </w:tc>
       </w:tr>
     </w:tbl>
-    <w:bookmarkEnd w:id="205"/>
-    <w:bookmarkStart w:id="206" w:name="archivos-clave"/>
+    <w:bookmarkEnd w:id="214"/>
+    <w:bookmarkStart w:id="215" w:name="archivos-clave"/>
     <w:p>
       <w:pPr>
         <w:pStyle w:val="Heading3"/>
@@ -41569,9 +41964,9 @@
         </w:pict>
       </w:r>
     </w:p>
-    <w:bookmarkEnd w:id="206"/>
-    <w:bookmarkEnd w:id="207"/>
-    <w:bookmarkStart w:id="208" w:name="anexo-g-glosario-y-convenciones"/>
+    <w:bookmarkEnd w:id="215"/>
+    <w:bookmarkEnd w:id="216"/>
+    <w:bookmarkStart w:id="217" w:name="anexo-g-glosario-y-convenciones"/>
     <w:p>
       <w:pPr>
         <w:pStyle w:val="Heading2"/>
@@ -41938,8 +42333,8 @@
         </w:pict>
       </w:r>
     </w:p>
-    <w:bookmarkEnd w:id="208"/>
-    <w:bookmarkStart w:id="209" w:name="anexo-h-nota-de-transparencia-ia"/>
+    <w:bookmarkEnd w:id="217"/>
+    <w:bookmarkStart w:id="218" w:name="anexo-h-nota-de-transparencia-ia"/>
     <w:p>
       <w:pPr>
         <w:pStyle w:val="Heading2"/>
@@ -41992,8 +42387,8 @@
         </w:pict>
       </w:r>
     </w:p>
-    <w:bookmarkEnd w:id="209"/>
-    <w:bookmarkStart w:id="210" w:name="Xf921bb8221ffe1af72098ef1de4d7827c2de6ff"/>
+    <w:bookmarkEnd w:id="218"/>
+    <w:bookmarkStart w:id="219" w:name="Xf921bb8221ffe1af72098ef1de4d7827c2de6ff"/>
     <w:p>
       <w:pPr>
         <w:pStyle w:val="Heading2"/>
@@ -43523,8 +43918,8 @@
         </w:pict>
       </w:r>
     </w:p>
-    <w:bookmarkEnd w:id="210"/>
-    <w:bookmarkStart w:id="211" w:name="anexo-j-cómo-verificar-este-informe"/>
+    <w:bookmarkEnd w:id="219"/>
+    <w:bookmarkStart w:id="220" w:name="anexo-j-cómo-verificar-este-informe"/>
     <w:p>
       <w:pPr>
         <w:pStyle w:val="Heading2"/>
@@ -43770,8 +44165,8 @@
         <w:t xml:space="preserve">).</w:t>
       </w:r>
     </w:p>
-    <w:bookmarkEnd w:id="211"/>
-    <w:bookmarkEnd w:id="212"/>
+    <w:bookmarkEnd w:id="220"/>
+    <w:bookmarkEnd w:id="221"/>
     <w:sectPr/>
   </w:body>
 </w:document>

</xml_diff>

<commit_message>
docs(evidencias): EV-012, EV-013, EV-014 y EV-030 (ruleset proteger-main) incorporadas al informe (#1)
Capturas del equipo (via ChatGPT en navegador): pipeline verde run #27, alertas CodeQL
(0 abiertas, 3 cerradas) y rulesets. Configuracion real del ruleset obtenida por API.
Informe, README de evidencias, auditoria, plan y validacion actualizados; manifiesto 85 entradas.

Co-authored-by: Claude Sonnet 5 <noreply@anthropic.com>
</commit_message>
<xml_diff>
--- a/docs/evidencias/informe-maestro.docx
+++ b/docs/evidencias/informe-maestro.docx
@@ -1439,22 +1439,40 @@
               <w:jc w:val="left"/>
             </w:pPr>
             <w:r>
-              <w:t xml:space="preserve">Alertas CodeQL (Code scanning)</w:t>
-            </w:r>
-          </w:p>
-        </w:tc>
-        <w:tc>
-          <w:tcPr/>
-          <w:p>
-            <w:pPr>
-              <w:pStyle w:val="Compact"/>
-              <w:jc w:val="left"/>
-            </w:pPr>
-            <w:r>
-              <w:rPr>
-                <w:rStyle w:val="VerbatimChar"/>
-              </w:rPr>
-              <w:t xml:space="preserve">capturas/EV-C204-025-codeql-alertas.json</w:t>
+              <w:t xml:space="preserve">Alertas CodeQL (Code scanning): 0 abiertas, 3 cerradas</w:t>
+            </w:r>
+          </w:p>
+        </w:tc>
+        <w:tc>
+          <w:tcPr/>
+          <w:p>
+            <w:pPr>
+              <w:pStyle w:val="Compact"/>
+              <w:jc w:val="left"/>
+            </w:pPr>
+            <w:r>
+              <w:rPr>
+                <w:rStyle w:val="VerbatimChar"/>
+              </w:rPr>
+              <w:t xml:space="preserve">capturas/EV-C204-012-codeql-alertas.png</w:t>
+            </w:r>
+            <w:r>
+              <w:t xml:space="preserve"> </w:t>
+            </w:r>
+            <w:r>
+              <w:t xml:space="preserve">(+ datos:</w:t>
+            </w:r>
+            <w:r>
+              <w:t xml:space="preserve"> </w:t>
+            </w:r>
+            <w:r>
+              <w:rPr>
+                <w:rStyle w:val="VerbatimChar"/>
+              </w:rPr>
+              <w:t xml:space="preserve">EV-C204-025-codeql-alertas.json</w:t>
+            </w:r>
+            <w:r>
+              <w:t xml:space="preserve">)</w:t>
             </w:r>
           </w:p>
         </w:tc>
@@ -1492,34 +1510,52 @@
               <w:jc w:val="left"/>
             </w:pPr>
             <w:r>
-              <w:t xml:space="preserve">Pipeline Fase 2 (todo verde)</w:t>
-            </w:r>
-          </w:p>
-        </w:tc>
-        <w:tc>
-          <w:tcPr/>
-          <w:p>
-            <w:pPr>
-              <w:pStyle w:val="Compact"/>
-              <w:jc w:val="left"/>
-            </w:pPr>
-            <w:r>
-              <w:rPr>
-                <w:rStyle w:val="VerbatimChar"/>
-              </w:rPr>
-              <w:t xml:space="preserve">capturas/EV-C204-026-run-verde.txt</w:t>
-            </w:r>
-          </w:p>
-        </w:tc>
-        <w:tc>
-          <w:tcPr/>
-          <w:p>
-            <w:pPr>
-              <w:pStyle w:val="Compact"/>
-              <w:jc w:val="left"/>
-            </w:pPr>
-            <w:r>
-              <w:t xml:space="preserve">✅ transcripción; captura de pantalla: pendiente del equipo</w:t>
+              <w:t xml:space="preserve">Pipeline Fase 2 (todo verde), run #27 (35442482331)</w:t>
+            </w:r>
+          </w:p>
+        </w:tc>
+        <w:tc>
+          <w:tcPr/>
+          <w:p>
+            <w:pPr>
+              <w:pStyle w:val="Compact"/>
+              <w:jc w:val="left"/>
+            </w:pPr>
+            <w:r>
+              <w:rPr>
+                <w:rStyle w:val="VerbatimChar"/>
+              </w:rPr>
+              <w:t xml:space="preserve">capturas/EV-C204-013-pipeline-verde.png</w:t>
+            </w:r>
+            <w:r>
+              <w:t xml:space="preserve"> </w:t>
+            </w:r>
+            <w:r>
+              <w:t xml:space="preserve">(+ transcripción:</w:t>
+            </w:r>
+            <w:r>
+              <w:t xml:space="preserve"> </w:t>
+            </w:r>
+            <w:r>
+              <w:rPr>
+                <w:rStyle w:val="VerbatimChar"/>
+              </w:rPr>
+              <w:t xml:space="preserve">EV-C204-026-run-verde.txt</w:t>
+            </w:r>
+            <w:r>
+              <w:t xml:space="preserve">)</w:t>
+            </w:r>
+          </w:p>
+        </w:tc>
+        <w:tc>
+          <w:tcPr/>
+          <w:p>
+            <w:pPr>
+              <w:pStyle w:val="Compact"/>
+              <w:jc w:val="left"/>
+            </w:pPr>
+            <w:r>
+              <w:t xml:space="preserve">✅</w:t>
             </w:r>
           </w:p>
         </w:tc>
@@ -1560,31 +1596,329 @@
               <w:t xml:space="preserve"> </w:t>
             </w:r>
             <w:r>
-              <w:t xml:space="preserve">protegida</w:t>
-            </w:r>
-          </w:p>
-        </w:tc>
-        <w:tc>
-          <w:tcPr/>
-          <w:p>
-            <w:pPr>
-              <w:pStyle w:val="Compact"/>
-              <w:jc w:val="left"/>
-            </w:pPr>
-            <w:r>
-              <w:t xml:space="preserve">—</w:t>
-            </w:r>
-          </w:p>
-        </w:tc>
-        <w:tc>
-          <w:tcPr/>
-          <w:p>
-            <w:pPr>
-              <w:pStyle w:val="Compact"/>
-              <w:jc w:val="left"/>
-            </w:pPr>
-            <w:r>
-              <w:t xml:space="preserve">⏳</w:t>
+              <w:t xml:space="preserve">protegida (ruleset</w:t>
+            </w:r>
+            <w:r>
+              <w:t xml:space="preserve"> </w:t>
+            </w:r>
+            <w:r>
+              <w:rPr>
+                <w:rStyle w:val="VerbatimChar"/>
+              </w:rPr>
+              <w:t xml:space="preserve">proteger-main</w:t>
+            </w:r>
+            <w:r>
+              <w:t xml:space="preserve">)</w:t>
+            </w:r>
+          </w:p>
+        </w:tc>
+        <w:tc>
+          <w:tcPr/>
+          <w:p>
+            <w:pPr>
+              <w:pStyle w:val="Compact"/>
+              <w:jc w:val="left"/>
+            </w:pPr>
+            <w:r>
+              <w:rPr>
+                <w:rStyle w:val="VerbatimChar"/>
+              </w:rPr>
+              <w:t xml:space="preserve">capturas/EV-C204-014-proteccion.png</w:t>
+            </w:r>
+            <w:r>
+              <w:t xml:space="preserve"> </w:t>
+            </w:r>
+            <w:r>
+              <w:t xml:space="preserve">(+ configuración:</w:t>
+            </w:r>
+            <w:r>
+              <w:t xml:space="preserve"> </w:t>
+            </w:r>
+            <w:r>
+              <w:rPr>
+                <w:rStyle w:val="VerbatimChar"/>
+              </w:rPr>
+              <w:t xml:space="preserve">EV-C204-030-ruleset-main.json</w:t>
+            </w:r>
+            <w:r>
+              <w:t xml:space="preserve">)</w:t>
+            </w:r>
+          </w:p>
+        </w:tc>
+        <w:tc>
+          <w:tcPr/>
+          <w:p>
+            <w:pPr>
+              <w:pStyle w:val="Compact"/>
+              <w:jc w:val="left"/>
+            </w:pPr>
+            <w:r>
+              <w:t xml:space="preserve">✅</w:t>
+            </w:r>
+          </w:p>
+        </w:tc>
+      </w:tr>
+      <w:tr>
+        <w:tc>
+          <w:tcPr/>
+          <w:p>
+            <w:pPr>
+              <w:pStyle w:val="Compact"/>
+              <w:jc w:val="left"/>
+            </w:pPr>
+            <w:r>
+              <w:t xml:space="preserve">EV-C204-015</w:t>
+            </w:r>
+          </w:p>
+        </w:tc>
+        <w:tc>
+          <w:tcPr/>
+          <w:p>
+            <w:pPr>
+              <w:pStyle w:val="Compact"/>
+              <w:jc w:val="left"/>
+            </w:pPr>
+            <w:r>
+              <w:t xml:space="preserve">Figura 1. Contexto de la aplicación</w:t>
+            </w:r>
+          </w:p>
+        </w:tc>
+        <w:tc>
+          <w:tcPr/>
+          <w:p>
+            <w:pPr>
+              <w:pStyle w:val="Compact"/>
+              <w:jc w:val="left"/>
+            </w:pPr>
+            <w:r>
+              <w:rPr>
+                <w:rStyle w:val="VerbatimChar"/>
+              </w:rPr>
+              <w:t xml:space="preserve">figuras/figura-1-contexto.svg</w:t>
+            </w:r>
+          </w:p>
+        </w:tc>
+        <w:tc>
+          <w:tcPr/>
+          <w:p>
+            <w:pPr>
+              <w:pStyle w:val="Compact"/>
+              <w:jc w:val="left"/>
+            </w:pPr>
+            <w:r>
+              <w:t xml:space="preserve">✅</w:t>
+            </w:r>
+          </w:p>
+        </w:tc>
+      </w:tr>
+      <w:tr>
+        <w:tc>
+          <w:tcPr/>
+          <w:p>
+            <w:pPr>
+              <w:pStyle w:val="Compact"/>
+              <w:jc w:val="left"/>
+            </w:pPr>
+            <w:r>
+              <w:t xml:space="preserve">EV-C204-016</w:t>
+            </w:r>
+          </w:p>
+        </w:tc>
+        <w:tc>
+          <w:tcPr/>
+          <w:p>
+            <w:pPr>
+              <w:pStyle w:val="Compact"/>
+              <w:jc w:val="left"/>
+            </w:pPr>
+            <w:r>
+              <w:t xml:space="preserve">Figura 2. Arquitectura y límites de confianza</w:t>
+            </w:r>
+          </w:p>
+        </w:tc>
+        <w:tc>
+          <w:tcPr/>
+          <w:p>
+            <w:pPr>
+              <w:pStyle w:val="Compact"/>
+              <w:jc w:val="left"/>
+            </w:pPr>
+            <w:r>
+              <w:rPr>
+                <w:rStyle w:val="VerbatimChar"/>
+              </w:rPr>
+              <w:t xml:space="preserve">figuras/figura-2-arquitectura.svg</w:t>
+            </w:r>
+          </w:p>
+        </w:tc>
+        <w:tc>
+          <w:tcPr/>
+          <w:p>
+            <w:pPr>
+              <w:pStyle w:val="Compact"/>
+              <w:jc w:val="left"/>
+            </w:pPr>
+            <w:r>
+              <w:t xml:space="preserve">✅</w:t>
+            </w:r>
+          </w:p>
+        </w:tc>
+      </w:tr>
+      <w:tr>
+        <w:tc>
+          <w:tcPr/>
+          <w:p>
+            <w:pPr>
+              <w:pStyle w:val="Compact"/>
+              <w:jc w:val="left"/>
+            </w:pPr>
+            <w:r>
+              <w:t xml:space="preserve">EV-C204-017</w:t>
+            </w:r>
+          </w:p>
+        </w:tc>
+        <w:tc>
+          <w:tcPr/>
+          <w:p>
+            <w:pPr>
+              <w:pStyle w:val="Compact"/>
+              <w:jc w:val="left"/>
+            </w:pPr>
+            <w:r>
+              <w:t xml:space="preserve">Figura 3. Flujo de cifrado con identidad</w:t>
+            </w:r>
+          </w:p>
+        </w:tc>
+        <w:tc>
+          <w:tcPr/>
+          <w:p>
+            <w:pPr>
+              <w:pStyle w:val="Compact"/>
+              <w:jc w:val="left"/>
+            </w:pPr>
+            <w:r>
+              <w:rPr>
+                <w:rStyle w:val="VerbatimChar"/>
+              </w:rPr>
+              <w:t xml:space="preserve">figuras/figura-3-flujo.svg</w:t>
+            </w:r>
+          </w:p>
+        </w:tc>
+        <w:tc>
+          <w:tcPr/>
+          <w:p>
+            <w:pPr>
+              <w:pStyle w:val="Compact"/>
+              <w:jc w:val="left"/>
+            </w:pPr>
+            <w:r>
+              <w:t xml:space="preserve">✅</w:t>
+            </w:r>
+          </w:p>
+        </w:tc>
+      </w:tr>
+      <w:tr>
+        <w:tc>
+          <w:tcPr/>
+          <w:p>
+            <w:pPr>
+              <w:pStyle w:val="Compact"/>
+              <w:jc w:val="left"/>
+            </w:pPr>
+            <w:r>
+              <w:t xml:space="preserve">EV-C204-018 / 019</w:t>
+            </w:r>
+          </w:p>
+        </w:tc>
+        <w:tc>
+          <w:tcPr/>
+          <w:p>
+            <w:pPr>
+              <w:pStyle w:val="Compact"/>
+              <w:jc w:val="left"/>
+            </w:pPr>
+            <w:r>
+              <w:t xml:space="preserve">Capturas de consola del equipo (PPTX y PDF originales)</w:t>
+            </w:r>
+          </w:p>
+        </w:tc>
+        <w:tc>
+          <w:tcPr/>
+          <w:p>
+            <w:pPr>
+              <w:pStyle w:val="Compact"/>
+              <w:jc w:val="left"/>
+            </w:pPr>
+            <w:r>
+              <w:rPr>
+                <w:rStyle w:val="VerbatimChar"/>
+              </w:rPr>
+              <w:t xml:space="preserve">capturas/EV-C204-018-…pptx</w:t>
+            </w:r>
+            <w:r>
+              <w:t xml:space="preserve">,</w:t>
+            </w:r>
+            <w:r>
+              <w:t xml:space="preserve"> </w:t>
+            </w:r>
+            <w:r>
+              <w:rPr>
+                <w:rStyle w:val="VerbatimChar"/>
+              </w:rPr>
+              <w:t xml:space="preserve">EV-C204-019-…pdf</w:t>
+            </w:r>
+          </w:p>
+        </w:tc>
+        <w:tc>
+          <w:tcPr/>
+          <w:p>
+            <w:pPr>
+              <w:pStyle w:val="Compact"/>
+              <w:jc w:val="left"/>
+            </w:pPr>
+            <w:r>
+              <w:t xml:space="preserve">✅</w:t>
+            </w:r>
+          </w:p>
+        </w:tc>
+      </w:tr>
+      <w:tr>
+        <w:tc>
+          <w:tcPr/>
+          <w:p>
+            <w:pPr>
+              <w:pStyle w:val="Compact"/>
+              <w:jc w:val="left"/>
+            </w:pPr>
+            <w:r>
+              <w:t xml:space="preserve">EV-C204-020</w:t>
+            </w:r>
+          </w:p>
+        </w:tc>
+        <w:tc>
+          <w:tcPr/>
+          <w:p>
+            <w:pPr>
+              <w:pStyle w:val="Compact"/>
+              <w:jc w:val="left"/>
+            </w:pPr>
+            <w:r>
+              <w:t xml:space="preserve">Artefacto</w:t>
+            </w:r>
+            <w:r>
+              <w:t xml:space="preserve"> </w:t>
+            </w:r>
+            <w:r>
+              <w:rPr>
+                <w:rStyle w:val="VerbatimChar"/>
+              </w:rPr>
+              <w:t xml:space="preserve">reporte-gitleaks</w:t>
+            </w:r>
+            <w:r>
+              <w:t xml:space="preserve"> </w:t>
+            </w:r>
+            <w:r>
+              <w:t xml:space="preserve">de la</w:t>
             </w:r>
             <w:r>
               <w:t xml:space="preserve"> </w:t>
@@ -1594,54 +1928,28 @@
                 <w:bCs/>
                 <w:b/>
               </w:rPr>
-              <w:t xml:space="preserve">pendiente del equipo</w:t>
+              <w:t xml:space="preserve">Fase 1</w:t>
             </w:r>
             <w:r>
               <w:t xml:space="preserve"> </w:t>
             </w:r>
             <w:r>
-              <w:t xml:space="preserve">(§15)</w:t>
-            </w:r>
-          </w:p>
-        </w:tc>
-      </w:tr>
-      <w:tr>
-        <w:tc>
-          <w:tcPr/>
-          <w:p>
-            <w:pPr>
-              <w:pStyle w:val="Compact"/>
-              <w:jc w:val="left"/>
-            </w:pPr>
-            <w:r>
-              <w:t xml:space="preserve">EV-C204-015</w:t>
-            </w:r>
-          </w:p>
-        </w:tc>
-        <w:tc>
-          <w:tcPr/>
-          <w:p>
-            <w:pPr>
-              <w:pStyle w:val="Compact"/>
-              <w:jc w:val="left"/>
-            </w:pPr>
-            <w:r>
-              <w:t xml:space="preserve">Figura 1. Contexto de la aplicación</w:t>
-            </w:r>
-          </w:p>
-        </w:tc>
-        <w:tc>
-          <w:tcPr/>
-          <w:p>
-            <w:pPr>
-              <w:pStyle w:val="Compact"/>
-              <w:jc w:val="left"/>
-            </w:pPr>
-            <w:r>
-              <w:rPr>
-                <w:rStyle w:val="VerbatimChar"/>
-              </w:rPr>
-              <w:t xml:space="preserve">figuras/figura-1-contexto.svg</w:t>
+              <w:t xml:space="preserve">(run 35365578175)</w:t>
+            </w:r>
+          </w:p>
+        </w:tc>
+        <w:tc>
+          <w:tcPr/>
+          <w:p>
+            <w:pPr>
+              <w:pStyle w:val="Compact"/>
+              <w:jc w:val="left"/>
+            </w:pPr>
+            <w:r>
+              <w:rPr>
+                <w:rStyle w:val="VerbatimChar"/>
+              </w:rPr>
+              <w:t xml:space="preserve">capturas/EV-C204-020-reporte-gitleaks.zip</w:t>
             </w:r>
           </w:p>
         </w:tc>
@@ -1667,143 +1975,19 @@
               <w:jc w:val="left"/>
             </w:pPr>
             <w:r>
-              <w:t xml:space="preserve">EV-C204-016</w:t>
-            </w:r>
-          </w:p>
-        </w:tc>
-        <w:tc>
-          <w:tcPr/>
-          <w:p>
-            <w:pPr>
-              <w:pStyle w:val="Compact"/>
-              <w:jc w:val="left"/>
-            </w:pPr>
-            <w:r>
-              <w:t xml:space="preserve">Figura 2. Arquitectura y límites de confianza</w:t>
-            </w:r>
-          </w:p>
-        </w:tc>
-        <w:tc>
-          <w:tcPr/>
-          <w:p>
-            <w:pPr>
-              <w:pStyle w:val="Compact"/>
-              <w:jc w:val="left"/>
-            </w:pPr>
-            <w:r>
-              <w:rPr>
-                <w:rStyle w:val="VerbatimChar"/>
-              </w:rPr>
-              <w:t xml:space="preserve">figuras/figura-2-arquitectura.svg</w:t>
-            </w:r>
-          </w:p>
-        </w:tc>
-        <w:tc>
-          <w:tcPr/>
-          <w:p>
-            <w:pPr>
-              <w:pStyle w:val="Compact"/>
-              <w:jc w:val="left"/>
-            </w:pPr>
-            <w:r>
-              <w:t xml:space="preserve">✅</w:t>
-            </w:r>
-          </w:p>
-        </w:tc>
-      </w:tr>
-      <w:tr>
-        <w:tc>
-          <w:tcPr/>
-          <w:p>
-            <w:pPr>
-              <w:pStyle w:val="Compact"/>
-              <w:jc w:val="left"/>
-            </w:pPr>
-            <w:r>
-              <w:t xml:space="preserve">EV-C204-017</w:t>
-            </w:r>
-          </w:p>
-        </w:tc>
-        <w:tc>
-          <w:tcPr/>
-          <w:p>
-            <w:pPr>
-              <w:pStyle w:val="Compact"/>
-              <w:jc w:val="left"/>
-            </w:pPr>
-            <w:r>
-              <w:t xml:space="preserve">Figura 3. Flujo de cifrado con identidad</w:t>
-            </w:r>
-          </w:p>
-        </w:tc>
-        <w:tc>
-          <w:tcPr/>
-          <w:p>
-            <w:pPr>
-              <w:pStyle w:val="Compact"/>
-              <w:jc w:val="left"/>
-            </w:pPr>
-            <w:r>
-              <w:rPr>
-                <w:rStyle w:val="VerbatimChar"/>
-              </w:rPr>
-              <w:t xml:space="preserve">figuras/figura-3-flujo.svg</w:t>
-            </w:r>
-          </w:p>
-        </w:tc>
-        <w:tc>
-          <w:tcPr/>
-          <w:p>
-            <w:pPr>
-              <w:pStyle w:val="Compact"/>
-              <w:jc w:val="left"/>
-            </w:pPr>
-            <w:r>
-              <w:t xml:space="preserve">✅</w:t>
-            </w:r>
-          </w:p>
-        </w:tc>
-      </w:tr>
-      <w:tr>
-        <w:tc>
-          <w:tcPr/>
-          <w:p>
-            <w:pPr>
-              <w:pStyle w:val="Compact"/>
-              <w:jc w:val="left"/>
-            </w:pPr>
-            <w:r>
-              <w:t xml:space="preserve">EV-C204-018 / 019</w:t>
-            </w:r>
-          </w:p>
-        </w:tc>
-        <w:tc>
-          <w:tcPr/>
-          <w:p>
-            <w:pPr>
-              <w:pStyle w:val="Compact"/>
-              <w:jc w:val="left"/>
-            </w:pPr>
-            <w:r>
-              <w:t xml:space="preserve">Capturas de consola del equipo (PPTX y PDF originales)</w:t>
-            </w:r>
-          </w:p>
-        </w:tc>
-        <w:tc>
-          <w:tcPr/>
-          <w:p>
-            <w:pPr>
-              <w:pStyle w:val="Compact"/>
-              <w:jc w:val="left"/>
-            </w:pPr>
-            <w:r>
-              <w:rPr>
-                <w:rStyle w:val="VerbatimChar"/>
-              </w:rPr>
-              <w:t xml:space="preserve">capturas/EV-C204-018-…pptx</w:t>
-            </w:r>
-            <w:r>
-              <w:t xml:space="preserve">,</w:t>
+              <w:t xml:space="preserve">EV-C204-021</w:t>
+            </w:r>
+          </w:p>
+        </w:tc>
+        <w:tc>
+          <w:tcPr/>
+          <w:p>
+            <w:pPr>
+              <w:pStyle w:val="Compact"/>
+              <w:jc w:val="left"/>
+            </w:pPr>
+            <w:r>
+              <w:t xml:space="preserve">Artefacto</w:t>
             </w:r>
             <w:r>
               <w:t xml:space="preserve"> </w:t>
@@ -1812,54 +1996,7 @@
               <w:rPr>
                 <w:rStyle w:val="VerbatimChar"/>
               </w:rPr>
-              <w:t xml:space="preserve">EV-C204-019-…pdf</w:t>
-            </w:r>
-          </w:p>
-        </w:tc>
-        <w:tc>
-          <w:tcPr/>
-          <w:p>
-            <w:pPr>
-              <w:pStyle w:val="Compact"/>
-              <w:jc w:val="left"/>
-            </w:pPr>
-            <w:r>
-              <w:t xml:space="preserve">✅</w:t>
-            </w:r>
-          </w:p>
-        </w:tc>
-      </w:tr>
-      <w:tr>
-        <w:tc>
-          <w:tcPr/>
-          <w:p>
-            <w:pPr>
-              <w:pStyle w:val="Compact"/>
-              <w:jc w:val="left"/>
-            </w:pPr>
-            <w:r>
-              <w:t xml:space="preserve">EV-C204-020</w:t>
-            </w:r>
-          </w:p>
-        </w:tc>
-        <w:tc>
-          <w:tcPr/>
-          <w:p>
-            <w:pPr>
-              <w:pStyle w:val="Compact"/>
-              <w:jc w:val="left"/>
-            </w:pPr>
-            <w:r>
-              <w:t xml:space="preserve">Artefacto</w:t>
-            </w:r>
-            <w:r>
-              <w:t xml:space="preserve"> </w:t>
-            </w:r>
-            <w:r>
-              <w:rPr>
-                <w:rStyle w:val="VerbatimChar"/>
-              </w:rPr>
-              <w:t xml:space="preserve">reporte-gitleaks</w:t>
+              <w:t xml:space="preserve">reporte-semgrep</w:t>
             </w:r>
             <w:r>
               <w:t xml:space="preserve"> </w:t>
@@ -1877,73 +2014,67 @@
               </w:rPr>
               <w:t xml:space="preserve">Fase 1</w:t>
             </w:r>
+          </w:p>
+        </w:tc>
+        <w:tc>
+          <w:tcPr/>
+          <w:p>
+            <w:pPr>
+              <w:pStyle w:val="Compact"/>
+              <w:jc w:val="left"/>
+            </w:pPr>
+            <w:r>
+              <w:rPr>
+                <w:rStyle w:val="VerbatimChar"/>
+              </w:rPr>
+              <w:t xml:space="preserve">capturas/EV-C204-021-reporte-semgrep.zip</w:t>
+            </w:r>
+          </w:p>
+        </w:tc>
+        <w:tc>
+          <w:tcPr/>
+          <w:p>
+            <w:pPr>
+              <w:pStyle w:val="Compact"/>
+              <w:jc w:val="left"/>
+            </w:pPr>
+            <w:r>
+              <w:t xml:space="preserve">✅</w:t>
+            </w:r>
+          </w:p>
+        </w:tc>
+      </w:tr>
+      <w:tr>
+        <w:tc>
+          <w:tcPr/>
+          <w:p>
+            <w:pPr>
+              <w:pStyle w:val="Compact"/>
+              <w:jc w:val="left"/>
+            </w:pPr>
+            <w:r>
+              <w:t xml:space="preserve">EV-C204-022</w:t>
+            </w:r>
+          </w:p>
+        </w:tc>
+        <w:tc>
+          <w:tcPr/>
+          <w:p>
+            <w:pPr>
+              <w:pStyle w:val="Compact"/>
+              <w:jc w:val="left"/>
+            </w:pPr>
+            <w:r>
+              <w:t xml:space="preserve">Artefacto</w:t>
+            </w:r>
             <w:r>
               <w:t xml:space="preserve"> </w:t>
             </w:r>
             <w:r>
-              <w:t xml:space="preserve">(run 35365578175)</w:t>
-            </w:r>
-          </w:p>
-        </w:tc>
-        <w:tc>
-          <w:tcPr/>
-          <w:p>
-            <w:pPr>
-              <w:pStyle w:val="Compact"/>
-              <w:jc w:val="left"/>
-            </w:pPr>
-            <w:r>
-              <w:rPr>
-                <w:rStyle w:val="VerbatimChar"/>
-              </w:rPr>
-              <w:t xml:space="preserve">capturas/EV-C204-020-reporte-gitleaks.zip</w:t>
-            </w:r>
-          </w:p>
-        </w:tc>
-        <w:tc>
-          <w:tcPr/>
-          <w:p>
-            <w:pPr>
-              <w:pStyle w:val="Compact"/>
-              <w:jc w:val="left"/>
-            </w:pPr>
-            <w:r>
-              <w:t xml:space="preserve">✅</w:t>
-            </w:r>
-          </w:p>
-        </w:tc>
-      </w:tr>
-      <w:tr>
-        <w:tc>
-          <w:tcPr/>
-          <w:p>
-            <w:pPr>
-              <w:pStyle w:val="Compact"/>
-              <w:jc w:val="left"/>
-            </w:pPr>
-            <w:r>
-              <w:t xml:space="preserve">EV-C204-021</w:t>
-            </w:r>
-          </w:p>
-        </w:tc>
-        <w:tc>
-          <w:tcPr/>
-          <w:p>
-            <w:pPr>
-              <w:pStyle w:val="Compact"/>
-              <w:jc w:val="left"/>
-            </w:pPr>
-            <w:r>
-              <w:t xml:space="preserve">Artefacto</w:t>
-            </w:r>
-            <w:r>
-              <w:t xml:space="preserve"> </w:t>
-            </w:r>
-            <w:r>
-              <w:rPr>
-                <w:rStyle w:val="VerbatimChar"/>
-              </w:rPr>
-              <w:t xml:space="preserve">reporte-semgrep</w:t>
+              <w:rPr>
+                <w:rStyle w:val="VerbatimChar"/>
+              </w:rPr>
+              <w:t xml:space="preserve">reporte-zap</w:t>
             </w:r>
             <w:r>
               <w:t xml:space="preserve"> </w:t>
@@ -1974,7 +2105,7 @@
               <w:rPr>
                 <w:rStyle w:val="VerbatimChar"/>
               </w:rPr>
-              <w:t xml:space="preserve">capturas/EV-C204-021-reporte-semgrep.zip</w:t>
+              <w:t xml:space="preserve">capturas/EV-C204-022-reporte-zap.zip</w:t>
             </w:r>
           </w:p>
         </w:tc>
@@ -2000,19 +2131,72 @@
               <w:jc w:val="left"/>
             </w:pPr>
             <w:r>
-              <w:t xml:space="preserve">EV-C204-022</w:t>
-            </w:r>
-          </w:p>
-        </w:tc>
-        <w:tc>
-          <w:tcPr/>
-          <w:p>
-            <w:pPr>
-              <w:pStyle w:val="Compact"/>
-              <w:jc w:val="left"/>
-            </w:pPr>
-            <w:r>
-              <w:t xml:space="preserve">Artefacto</w:t>
+              <w:t xml:space="preserve">EV-C204-023</w:t>
+            </w:r>
+          </w:p>
+        </w:tc>
+        <w:tc>
+          <w:tcPr/>
+          <w:p>
+            <w:pPr>
+              <w:pStyle w:val="Compact"/>
+              <w:jc w:val="left"/>
+            </w:pPr>
+            <w:r>
+              <w:t xml:space="preserve">Pruebas extremo a extremo con Keycloak real (25 comprobaciones)</w:t>
+            </w:r>
+          </w:p>
+        </w:tc>
+        <w:tc>
+          <w:tcPr/>
+          <w:p>
+            <w:pPr>
+              <w:pStyle w:val="Compact"/>
+              <w:jc w:val="left"/>
+            </w:pPr>
+            <w:r>
+              <w:rPr>
+                <w:rStyle w:val="VerbatimChar"/>
+              </w:rPr>
+              <w:t xml:space="preserve">capturas/EV-C204-023-pruebas-e2e-keycloak.txt</w:t>
+            </w:r>
+          </w:p>
+        </w:tc>
+        <w:tc>
+          <w:tcPr/>
+          <w:p>
+            <w:pPr>
+              <w:pStyle w:val="Compact"/>
+              <w:jc w:val="left"/>
+            </w:pPr>
+            <w:r>
+              <w:t xml:space="preserve">✅</w:t>
+            </w:r>
+          </w:p>
+        </w:tc>
+      </w:tr>
+      <w:tr>
+        <w:tc>
+          <w:tcPr/>
+          <w:p>
+            <w:pPr>
+              <w:pStyle w:val="Compact"/>
+              <w:jc w:val="left"/>
+            </w:pPr>
+            <w:r>
+              <w:t xml:space="preserve">EV-C204-024</w:t>
+            </w:r>
+          </w:p>
+        </w:tc>
+        <w:tc>
+          <w:tcPr/>
+          <w:p>
+            <w:pPr>
+              <w:pStyle w:val="Compact"/>
+              <w:jc w:val="left"/>
+            </w:pPr>
+            <w:r>
+              <w:t xml:space="preserve">Pruebas Jest (22), ESLint y</w:t>
             </w:r>
             <w:r>
               <w:t xml:space="preserve"> </w:t>
@@ -2021,13 +2205,166 @@
               <w:rPr>
                 <w:rStyle w:val="VerbatimChar"/>
               </w:rPr>
-              <w:t xml:space="preserve">reporte-zap</w:t>
-            </w:r>
-            <w:r>
-              <w:t xml:space="preserve"> </w:t>
-            </w:r>
-            <w:r>
-              <w:t xml:space="preserve">de la</w:t>
+              <w:t xml:space="preserve">npm audit</w:t>
+            </w:r>
+          </w:p>
+        </w:tc>
+        <w:tc>
+          <w:tcPr/>
+          <w:p>
+            <w:pPr>
+              <w:pStyle w:val="Compact"/>
+              <w:jc w:val="left"/>
+            </w:pPr>
+            <w:r>
+              <w:rPr>
+                <w:rStyle w:val="VerbatimChar"/>
+              </w:rPr>
+              <w:t xml:space="preserve">capturas/EV-C204-024-pruebas-unitarias.txt</w:t>
+            </w:r>
+          </w:p>
+        </w:tc>
+        <w:tc>
+          <w:tcPr/>
+          <w:p>
+            <w:pPr>
+              <w:pStyle w:val="Compact"/>
+              <w:jc w:val="left"/>
+            </w:pPr>
+            <w:r>
+              <w:t xml:space="preserve">✅</w:t>
+            </w:r>
+          </w:p>
+        </w:tc>
+      </w:tr>
+      <w:tr>
+        <w:tc>
+          <w:tcPr/>
+          <w:p>
+            <w:pPr>
+              <w:pStyle w:val="Compact"/>
+              <w:jc w:val="left"/>
+            </w:pPr>
+            <w:r>
+              <w:t xml:space="preserve">EV-C204-025</w:t>
+            </w:r>
+          </w:p>
+        </w:tc>
+        <w:tc>
+          <w:tcPr/>
+          <w:p>
+            <w:pPr>
+              <w:pStyle w:val="Compact"/>
+              <w:jc w:val="left"/>
+            </w:pPr>
+            <w:r>
+              <w:t xml:space="preserve">Alertas y análisis de CodeQL</w:t>
+            </w:r>
+          </w:p>
+        </w:tc>
+        <w:tc>
+          <w:tcPr/>
+          <w:p>
+            <w:pPr>
+              <w:pStyle w:val="Compact"/>
+              <w:jc w:val="left"/>
+            </w:pPr>
+            <w:r>
+              <w:rPr>
+                <w:rStyle w:val="VerbatimChar"/>
+              </w:rPr>
+              <w:t xml:space="preserve">capturas/EV-C204-025-codeql-alertas.json</w:t>
+            </w:r>
+          </w:p>
+        </w:tc>
+        <w:tc>
+          <w:tcPr/>
+          <w:p>
+            <w:pPr>
+              <w:pStyle w:val="Compact"/>
+              <w:jc w:val="left"/>
+            </w:pPr>
+            <w:r>
+              <w:t xml:space="preserve">✅</w:t>
+            </w:r>
+          </w:p>
+        </w:tc>
+      </w:tr>
+      <w:tr>
+        <w:tc>
+          <w:tcPr/>
+          <w:p>
+            <w:pPr>
+              <w:pStyle w:val="Compact"/>
+              <w:jc w:val="left"/>
+            </w:pPr>
+            <w:r>
+              <w:t xml:space="preserve">EV-C204-026</w:t>
+            </w:r>
+          </w:p>
+        </w:tc>
+        <w:tc>
+          <w:tcPr/>
+          <w:p>
+            <w:pPr>
+              <w:pStyle w:val="Compact"/>
+              <w:jc w:val="left"/>
+            </w:pPr>
+            <w:r>
+              <w:t xml:space="preserve">Run verde de referencia (jobs, artefactos, CodeQL)</w:t>
+            </w:r>
+          </w:p>
+        </w:tc>
+        <w:tc>
+          <w:tcPr/>
+          <w:p>
+            <w:pPr>
+              <w:pStyle w:val="Compact"/>
+              <w:jc w:val="left"/>
+            </w:pPr>
+            <w:r>
+              <w:rPr>
+                <w:rStyle w:val="VerbatimChar"/>
+              </w:rPr>
+              <w:t xml:space="preserve">capturas/EV-C204-026-run-verde.txt</w:t>
+            </w:r>
+          </w:p>
+        </w:tc>
+        <w:tc>
+          <w:tcPr/>
+          <w:p>
+            <w:pPr>
+              <w:pStyle w:val="Compact"/>
+              <w:jc w:val="left"/>
+            </w:pPr>
+            <w:r>
+              <w:t xml:space="preserve">✅</w:t>
+            </w:r>
+          </w:p>
+        </w:tc>
+      </w:tr>
+      <w:tr>
+        <w:tc>
+          <w:tcPr/>
+          <w:p>
+            <w:pPr>
+              <w:pStyle w:val="Compact"/>
+              <w:jc w:val="left"/>
+            </w:pPr>
+            <w:r>
+              <w:t xml:space="preserve">EV-C204-027</w:t>
+            </w:r>
+          </w:p>
+        </w:tc>
+        <w:tc>
+          <w:tcPr/>
+          <w:p>
+            <w:pPr>
+              <w:pStyle w:val="Compact"/>
+              <w:jc w:val="left"/>
+            </w:pPr>
+            <w:r>
+              <w:t xml:space="preserve">SBOM de la</w:t>
             </w:r>
             <w:r>
               <w:t xml:space="preserve"> </w:t>
@@ -2039,20 +2376,26 @@
               </w:rPr>
               <w:t xml:space="preserve">Fase 1</w:t>
             </w:r>
-          </w:p>
-        </w:tc>
-        <w:tc>
-          <w:tcPr/>
-          <w:p>
-            <w:pPr>
-              <w:pStyle w:val="Compact"/>
-              <w:jc w:val="left"/>
-            </w:pPr>
-            <w:r>
-              <w:rPr>
-                <w:rStyle w:val="VerbatimChar"/>
-              </w:rPr>
-              <w:t xml:space="preserve">capturas/EV-C204-022-reporte-zap.zip</w:t>
+            <w:r>
+              <w:t xml:space="preserve"> </w:t>
+            </w:r>
+            <w:r>
+              <w:t xml:space="preserve">(comprimido)</w:t>
+            </w:r>
+          </w:p>
+        </w:tc>
+        <w:tc>
+          <w:tcPr/>
+          <w:p>
+            <w:pPr>
+              <w:pStyle w:val="Compact"/>
+              <w:jc w:val="left"/>
+            </w:pPr>
+            <w:r>
+              <w:rPr>
+                <w:rStyle w:val="VerbatimChar"/>
+              </w:rPr>
+              <w:t xml:space="preserve">capturas/EV-C204-027-sbom-fase1.zip</w:t>
             </w:r>
           </w:p>
         </w:tc>
@@ -2078,34 +2421,34 @@
               <w:jc w:val="left"/>
             </w:pPr>
             <w:r>
-              <w:t xml:space="preserve">EV-C204-023</w:t>
-            </w:r>
-          </w:p>
-        </w:tc>
-        <w:tc>
-          <w:tcPr/>
-          <w:p>
-            <w:pPr>
-              <w:pStyle w:val="Compact"/>
-              <w:jc w:val="left"/>
-            </w:pPr>
-            <w:r>
-              <w:t xml:space="preserve">Pruebas extremo a extremo con Keycloak real (25 comprobaciones)</w:t>
-            </w:r>
-          </w:p>
-        </w:tc>
-        <w:tc>
-          <w:tcPr/>
-          <w:p>
-            <w:pPr>
-              <w:pStyle w:val="Compact"/>
-              <w:jc w:val="left"/>
-            </w:pPr>
-            <w:r>
-              <w:rPr>
-                <w:rStyle w:val="VerbatimChar"/>
-              </w:rPr>
-              <w:t xml:space="preserve">capturas/EV-C204-023-pruebas-e2e-keycloak.txt</w:t>
+              <w:t xml:space="preserve">EV-C204-028</w:t>
+            </w:r>
+          </w:p>
+        </w:tc>
+        <w:tc>
+          <w:tcPr/>
+          <w:p>
+            <w:pPr>
+              <w:pStyle w:val="Compact"/>
+              <w:jc w:val="left"/>
+            </w:pPr>
+            <w:r>
+              <w:t xml:space="preserve">Log de los jobs en rojo de la Fase 1 (secretos redactados)</w:t>
+            </w:r>
+          </w:p>
+        </w:tc>
+        <w:tc>
+          <w:tcPr/>
+          <w:p>
+            <w:pPr>
+              <w:pStyle w:val="Compact"/>
+              <w:jc w:val="left"/>
+            </w:pPr>
+            <w:r>
+              <w:rPr>
+                <w:rStyle w:val="VerbatimChar"/>
+              </w:rPr>
+              <w:t xml:space="preserve">capturas/EV-C204-028-log-fase1-jobs-rojos.txt</w:t>
             </w:r>
           </w:p>
         </w:tc>
@@ -2131,43 +2474,93 @@
               <w:jc w:val="left"/>
             </w:pPr>
             <w:r>
-              <w:t xml:space="preserve">EV-C204-024</w:t>
-            </w:r>
-          </w:p>
-        </w:tc>
-        <w:tc>
-          <w:tcPr/>
-          <w:p>
-            <w:pPr>
-              <w:pStyle w:val="Compact"/>
-              <w:jc w:val="left"/>
-            </w:pPr>
-            <w:r>
-              <w:t xml:space="preserve">Pruebas Jest (22), ESLint y</w:t>
+              <w:t xml:space="preserve">EV-C204-029</w:t>
+            </w:r>
+          </w:p>
+        </w:tc>
+        <w:tc>
+          <w:tcPr/>
+          <w:p>
+            <w:pPr>
+              <w:pStyle w:val="Compact"/>
+              <w:jc w:val="left"/>
+            </w:pPr>
+            <w:r>
+              <w:t xml:space="preserve">Historial de las 22+ ejecuciones del pipeline</w:t>
+            </w:r>
+          </w:p>
+        </w:tc>
+        <w:tc>
+          <w:tcPr/>
+          <w:p>
+            <w:pPr>
+              <w:pStyle w:val="Compact"/>
+              <w:jc w:val="left"/>
+            </w:pPr>
+            <w:r>
+              <w:rPr>
+                <w:rStyle w:val="VerbatimChar"/>
+              </w:rPr>
+              <w:t xml:space="preserve">capturas/EV-C204-029-historial-runs.txt</w:t>
+            </w:r>
+          </w:p>
+        </w:tc>
+        <w:tc>
+          <w:tcPr/>
+          <w:p>
+            <w:pPr>
+              <w:pStyle w:val="Compact"/>
+              <w:jc w:val="left"/>
+            </w:pPr>
+            <w:r>
+              <w:t xml:space="preserve">✅</w:t>
+            </w:r>
+          </w:p>
+        </w:tc>
+      </w:tr>
+      <w:tr>
+        <w:tc>
+          <w:tcPr/>
+          <w:p>
+            <w:pPr>
+              <w:pStyle w:val="Compact"/>
+              <w:jc w:val="left"/>
+            </w:pPr>
+            <w:r>
+              <w:t xml:space="preserve">EV-C204-033 … 051</w:t>
+            </w:r>
+          </w:p>
+        </w:tc>
+        <w:tc>
+          <w:tcPr/>
+          <w:p>
+            <w:pPr>
+              <w:pStyle w:val="Compact"/>
+              <w:jc w:val="left"/>
+            </w:pPr>
+            <w:r>
+              <w:t xml:space="preserve">19 capturas de pantalla del equipo, individualizadas</w:t>
+            </w:r>
+          </w:p>
+        </w:tc>
+        <w:tc>
+          <w:tcPr/>
+          <w:p>
+            <w:pPr>
+              <w:pStyle w:val="Compact"/>
+              <w:jc w:val="left"/>
+            </w:pPr>
+            <w:r>
+              <w:rPr>
+                <w:rStyle w:val="VerbatimChar"/>
+              </w:rPr>
+              <w:t xml:space="preserve">capturas/consola-git/</w:t>
             </w:r>
             <w:r>
               <w:t xml:space="preserve"> </w:t>
             </w:r>
             <w:r>
-              <w:rPr>
-                <w:rStyle w:val="VerbatimChar"/>
-              </w:rPr>
-              <w:t xml:space="preserve">npm audit</w:t>
-            </w:r>
-          </w:p>
-        </w:tc>
-        <w:tc>
-          <w:tcPr/>
-          <w:p>
-            <w:pPr>
-              <w:pStyle w:val="Compact"/>
-              <w:jc w:val="left"/>
-            </w:pPr>
-            <w:r>
-              <w:rPr>
-                <w:rStyle w:val="VerbatimChar"/>
-              </w:rPr>
-              <w:t xml:space="preserve">capturas/EV-C204-024-pruebas-unitarias.txt</w:t>
+              <w:t xml:space="preserve">(Anexo I)</w:t>
             </w:r>
           </w:p>
         </w:tc>
@@ -2193,321 +2586,49 @@
               <w:jc w:val="left"/>
             </w:pPr>
             <w:r>
-              <w:t xml:space="preserve">EV-C204-025</w:t>
-            </w:r>
-          </w:p>
-        </w:tc>
-        <w:tc>
-          <w:tcPr/>
-          <w:p>
-            <w:pPr>
-              <w:pStyle w:val="Compact"/>
-              <w:jc w:val="left"/>
-            </w:pPr>
-            <w:r>
-              <w:t xml:space="preserve">Alertas y análisis de CodeQL</w:t>
-            </w:r>
-          </w:p>
-        </w:tc>
-        <w:tc>
-          <w:tcPr/>
-          <w:p>
-            <w:pPr>
-              <w:pStyle w:val="Compact"/>
-              <w:jc w:val="left"/>
-            </w:pPr>
-            <w:r>
-              <w:rPr>
-                <w:rStyle w:val="VerbatimChar"/>
-              </w:rPr>
-              <w:t xml:space="preserve">capturas/EV-C204-025-codeql-alertas.json</w:t>
-            </w:r>
-          </w:p>
-        </w:tc>
-        <w:tc>
-          <w:tcPr/>
-          <w:p>
-            <w:pPr>
-              <w:pStyle w:val="Compact"/>
-              <w:jc w:val="left"/>
-            </w:pPr>
-            <w:r>
-              <w:t xml:space="preserve">✅</w:t>
-            </w:r>
-          </w:p>
-        </w:tc>
-      </w:tr>
-      <w:tr>
-        <w:tc>
-          <w:tcPr/>
-          <w:p>
-            <w:pPr>
-              <w:pStyle w:val="Compact"/>
-              <w:jc w:val="left"/>
-            </w:pPr>
-            <w:r>
-              <w:t xml:space="preserve">EV-C204-026</w:t>
-            </w:r>
-          </w:p>
-        </w:tc>
-        <w:tc>
-          <w:tcPr/>
-          <w:p>
-            <w:pPr>
-              <w:pStyle w:val="Compact"/>
-              <w:jc w:val="left"/>
-            </w:pPr>
-            <w:r>
-              <w:t xml:space="preserve">Run verde de referencia (jobs, artefactos, CodeQL)</w:t>
-            </w:r>
-          </w:p>
-        </w:tc>
-        <w:tc>
-          <w:tcPr/>
-          <w:p>
-            <w:pPr>
-              <w:pStyle w:val="Compact"/>
-              <w:jc w:val="left"/>
-            </w:pPr>
-            <w:r>
-              <w:rPr>
-                <w:rStyle w:val="VerbatimChar"/>
-              </w:rPr>
-              <w:t xml:space="preserve">capturas/EV-C204-026-run-verde.txt</w:t>
-            </w:r>
-          </w:p>
-        </w:tc>
-        <w:tc>
-          <w:tcPr/>
-          <w:p>
-            <w:pPr>
-              <w:pStyle w:val="Compact"/>
-              <w:jc w:val="left"/>
-            </w:pPr>
-            <w:r>
-              <w:t xml:space="preserve">✅</w:t>
-            </w:r>
-          </w:p>
-        </w:tc>
-      </w:tr>
-      <w:tr>
-        <w:tc>
-          <w:tcPr/>
-          <w:p>
-            <w:pPr>
-              <w:pStyle w:val="Compact"/>
-              <w:jc w:val="left"/>
-            </w:pPr>
-            <w:r>
-              <w:t xml:space="preserve">EV-C204-027</w:t>
-            </w:r>
-          </w:p>
-        </w:tc>
-        <w:tc>
-          <w:tcPr/>
-          <w:p>
-            <w:pPr>
-              <w:pStyle w:val="Compact"/>
-              <w:jc w:val="left"/>
-            </w:pPr>
-            <w:r>
-              <w:t xml:space="preserve">SBOM de la</w:t>
+              <w:t xml:space="preserve">EV-C204-030</w:t>
+            </w:r>
+          </w:p>
+        </w:tc>
+        <w:tc>
+          <w:tcPr/>
+          <w:p>
+            <w:pPr>
+              <w:pStyle w:val="Compact"/>
+              <w:jc w:val="left"/>
+            </w:pPr>
+            <w:r>
+              <w:t xml:space="preserve">Configuración real del ruleset</w:t>
             </w:r>
             <w:r>
               <w:t xml:space="preserve"> </w:t>
             </w:r>
             <w:r>
               <w:rPr>
-                <w:bCs/>
-                <w:b/>
-              </w:rPr>
-              <w:t xml:space="preserve">Fase 1</w:t>
+                <w:rStyle w:val="VerbatimChar"/>
+              </w:rPr>
+              <w:t xml:space="preserve">proteger-main</w:t>
             </w:r>
             <w:r>
               <w:t xml:space="preserve"> </w:t>
             </w:r>
             <w:r>
-              <w:t xml:space="preserve">(comprimido)</w:t>
-            </w:r>
-          </w:p>
-        </w:tc>
-        <w:tc>
-          <w:tcPr/>
-          <w:p>
-            <w:pPr>
-              <w:pStyle w:val="Compact"/>
-              <w:jc w:val="left"/>
-            </w:pPr>
-            <w:r>
-              <w:rPr>
-                <w:rStyle w:val="VerbatimChar"/>
-              </w:rPr>
-              <w:t xml:space="preserve">capturas/EV-C204-027-sbom-fase1.zip</w:t>
-            </w:r>
-          </w:p>
-        </w:tc>
-        <w:tc>
-          <w:tcPr/>
-          <w:p>
-            <w:pPr>
-              <w:pStyle w:val="Compact"/>
-              <w:jc w:val="left"/>
-            </w:pPr>
-            <w:r>
-              <w:t xml:space="preserve">✅</w:t>
-            </w:r>
-          </w:p>
-        </w:tc>
-      </w:tr>
-      <w:tr>
-        <w:tc>
-          <w:tcPr/>
-          <w:p>
-            <w:pPr>
-              <w:pStyle w:val="Compact"/>
-              <w:jc w:val="left"/>
-            </w:pPr>
-            <w:r>
-              <w:t xml:space="preserve">EV-C204-028</w:t>
-            </w:r>
-          </w:p>
-        </w:tc>
-        <w:tc>
-          <w:tcPr/>
-          <w:p>
-            <w:pPr>
-              <w:pStyle w:val="Compact"/>
-              <w:jc w:val="left"/>
-            </w:pPr>
-            <w:r>
-              <w:t xml:space="preserve">Log de los jobs en rojo de la Fase 1 (secretos redactados)</w:t>
-            </w:r>
-          </w:p>
-        </w:tc>
-        <w:tc>
-          <w:tcPr/>
-          <w:p>
-            <w:pPr>
-              <w:pStyle w:val="Compact"/>
-              <w:jc w:val="left"/>
-            </w:pPr>
-            <w:r>
-              <w:rPr>
-                <w:rStyle w:val="VerbatimChar"/>
-              </w:rPr>
-              <w:t xml:space="preserve">capturas/EV-C204-028-log-fase1-jobs-rojos.txt</w:t>
-            </w:r>
-          </w:p>
-        </w:tc>
-        <w:tc>
-          <w:tcPr/>
-          <w:p>
-            <w:pPr>
-              <w:pStyle w:val="Compact"/>
-              <w:jc w:val="left"/>
-            </w:pPr>
-            <w:r>
-              <w:t xml:space="preserve">✅</w:t>
-            </w:r>
-          </w:p>
-        </w:tc>
-      </w:tr>
-      <w:tr>
-        <w:tc>
-          <w:tcPr/>
-          <w:p>
-            <w:pPr>
-              <w:pStyle w:val="Compact"/>
-              <w:jc w:val="left"/>
-            </w:pPr>
-            <w:r>
-              <w:t xml:space="preserve">EV-C204-029</w:t>
-            </w:r>
-          </w:p>
-        </w:tc>
-        <w:tc>
-          <w:tcPr/>
-          <w:p>
-            <w:pPr>
-              <w:pStyle w:val="Compact"/>
-              <w:jc w:val="left"/>
-            </w:pPr>
-            <w:r>
-              <w:t xml:space="preserve">Historial de las 22+ ejecuciones del pipeline</w:t>
-            </w:r>
-          </w:p>
-        </w:tc>
-        <w:tc>
-          <w:tcPr/>
-          <w:p>
-            <w:pPr>
-              <w:pStyle w:val="Compact"/>
-              <w:jc w:val="left"/>
-            </w:pPr>
-            <w:r>
-              <w:rPr>
-                <w:rStyle w:val="VerbatimChar"/>
-              </w:rPr>
-              <w:t xml:space="preserve">capturas/EV-C204-029-historial-runs.txt</w:t>
-            </w:r>
-          </w:p>
-        </w:tc>
-        <w:tc>
-          <w:tcPr/>
-          <w:p>
-            <w:pPr>
-              <w:pStyle w:val="Compact"/>
-              <w:jc w:val="left"/>
-            </w:pPr>
-            <w:r>
-              <w:t xml:space="preserve">✅</w:t>
-            </w:r>
-          </w:p>
-        </w:tc>
-      </w:tr>
-      <w:tr>
-        <w:tc>
-          <w:tcPr/>
-          <w:p>
-            <w:pPr>
-              <w:pStyle w:val="Compact"/>
-              <w:jc w:val="left"/>
-            </w:pPr>
-            <w:r>
-              <w:t xml:space="preserve">EV-C204-033 … 051</w:t>
-            </w:r>
-          </w:p>
-        </w:tc>
-        <w:tc>
-          <w:tcPr/>
-          <w:p>
-            <w:pPr>
-              <w:pStyle w:val="Compact"/>
-              <w:jc w:val="left"/>
-            </w:pPr>
-            <w:r>
-              <w:t xml:space="preserve">19 capturas de pantalla del equipo, individualizadas</w:t>
-            </w:r>
-          </w:p>
-        </w:tc>
-        <w:tc>
-          <w:tcPr/>
-          <w:p>
-            <w:pPr>
-              <w:pStyle w:val="Compact"/>
-              <w:jc w:val="left"/>
-            </w:pPr>
-            <w:r>
-              <w:rPr>
-                <w:rStyle w:val="VerbatimChar"/>
-              </w:rPr>
-              <w:t xml:space="preserve">capturas/consola-git/</w:t>
-            </w:r>
-            <w:r>
-              <w:t xml:space="preserve"> </w:t>
-            </w:r>
-            <w:r>
-              <w:t xml:space="preserve">(Anexo I)</w:t>
+              <w:t xml:space="preserve">(API de GitHub)</w:t>
+            </w:r>
+          </w:p>
+        </w:tc>
+        <w:tc>
+          <w:tcPr/>
+          <w:p>
+            <w:pPr>
+              <w:pStyle w:val="Compact"/>
+              <w:jc w:val="left"/>
+            </w:pPr>
+            <w:r>
+              <w:rPr>
+                <w:rStyle w:val="VerbatimChar"/>
+              </w:rPr>
+              <w:t xml:space="preserve">capturas/EV-C204-030-ruleset-main.json</w:t>
             </w:r>
           </w:p>
         </w:tc>
@@ -2592,7 +2713,7 @@
         <w:pStyle w:val="BlockText"/>
       </w:pPr>
       <w:r>
-        <w:t xml:space="preserve">Los identificadores 030–032 no se usan. Las etiquetas «EV-C204-006 … 011» que aparecen dentro de las diapositivas del PPTX original son notas internas del equipo y</w:t>
+        <w:t xml:space="preserve">Los identificadores 031–032 no se usan. Las etiquetas «EV-C204-006 … 011» que aparecen dentro de las diapositivas del PPTX original son notas internas del equipo y</w:t>
       </w:r>
       <w:r>
         <w:t xml:space="preserve"> </w:t>
@@ -13927,7 +14048,7 @@
     <w:bookmarkEnd w:id="91"/>
     <w:bookmarkEnd w:id="92"/>
     <w:bookmarkEnd w:id="93"/>
-    <w:bookmarkStart w:id="147" w:name="parte-iii-diagnóstico-y-remediación"/>
+    <w:bookmarkStart w:id="156" w:name="parte-iii-diagnóstico-y-remediación"/>
     <w:p>
       <w:pPr>
         <w:pStyle w:val="Heading1"/>
@@ -16626,7 +16747,7 @@
     </w:p>
     <w:bookmarkEnd w:id="137"/>
     <w:bookmarkEnd w:id="138"/>
-    <w:bookmarkStart w:id="145" w:name="fase-2-remediación-de-rojo-a-verde"/>
+    <w:bookmarkStart w:id="151" w:name="fase-2-remediación-de-rojo-a-verde"/>
     <w:p>
       <w:pPr>
         <w:pStyle w:val="Heading2"/>
@@ -18168,7 +18289,7 @@
       </w:r>
     </w:p>
     <w:bookmarkEnd w:id="142"/>
-    <w:bookmarkStart w:id="143" w:name="X802f1d2677ce5a199922dbac06914387fda5134"/>
+    <w:bookmarkStart w:id="149" w:name="X802f1d2677ce5a199922dbac06914387fda5134"/>
     <w:p>
       <w:pPr>
         <w:pStyle w:val="Heading3"/>
@@ -18594,7 +18715,127 @@
         <w:pStyle w:val="BodyText"/>
       </w:pPr>
       <w:r>
-        <w:t xml:space="preserve">Evidencia: EV-C204-008 a 011 (reportes del run verde), EV-C204-025 y 026. El script</w:t>
+        <w:t xml:space="preserve">Evidencia: EV-C204-008 a 011 (reportes del run verde), EV-C204-012, EV-C204-013, EV-C204-025 y 026.</w:t>
+      </w:r>
+    </w:p>
+    <w:p>
+      <w:pPr>
+        <w:pStyle w:val="CaptionedFigure"/>
+      </w:pPr>
+      <w:r>
+        <w:drawing>
+          <wp:inline>
+            <wp:extent cx="5067300" cy="5595496"/>
+            <wp:effectExtent b="0" l="0" r="0" t="0"/>
+            <wp:docPr descr="EV-C204-013 — Run #27 (35442482331, commit 0fc1c11): los 5 jobs en verde y 5 artefactos con su huella SHA-256" title="" id="144" name="Picture"/>
+            <a:graphic>
+              <a:graphicData uri="http://schemas.openxmlformats.org/drawingml/2006/picture">
+                <pic:pic>
+                  <pic:nvPicPr>
+                    <pic:cNvPr descr="evidencias/capturas/EV-C204-013-pipeline-verde.png" id="145" name="Picture"/>
+                    <pic:cNvPicPr>
+                      <a:picLocks noChangeArrowheads="1" noChangeAspect="1"/>
+                    </pic:cNvPicPr>
+                  </pic:nvPicPr>
+                  <pic:blipFill>
+                    <a:blip r:embed="rId143"/>
+                    <a:stretch>
+                      <a:fillRect/>
+                    </a:stretch>
+                  </pic:blipFill>
+                  <pic:spPr bwMode="auto">
+                    <a:xfrm>
+                      <a:off x="0" y="0"/>
+                      <a:ext cx="5067300" cy="5595496"/>
+                    </a:xfrm>
+                    <a:prstGeom prst="rect">
+                      <a:avLst/>
+                    </a:prstGeom>
+                    <a:noFill/>
+                    <a:ln w="9525">
+                      <a:noFill/>
+                      <a:headEnd/>
+                      <a:tailEnd/>
+                    </a:ln>
+                  </pic:spPr>
+                </pic:pic>
+              </a:graphicData>
+            </a:graphic>
+          </wp:inline>
+        </w:drawing>
+      </w:r>
+    </w:p>
+    <w:p>
+      <w:pPr>
+        <w:pStyle w:val="ImageCaption"/>
+      </w:pPr>
+      <w:r>
+        <w:t xml:space="preserve">EV-C204-013 — Run #27 (35442482331, commit</w:t>
+      </w:r>
+      <w:r>
+        <w:t xml:space="preserve"> </w:t>
+      </w:r>
+      <w:r>
+        <w:rPr>
+          <w:rStyle w:val="VerbatimChar"/>
+        </w:rPr>
+        <w:t xml:space="preserve">0fc1c11</w:t>
+      </w:r>
+      <w:r>
+        <w:t xml:space="preserve">): los 5 jobs en verde y 5 artefactos con su huella SHA-256</w:t>
+      </w:r>
+    </w:p>
+    <w:p>
+      <w:pPr>
+        <w:pStyle w:val="BodyText"/>
+      </w:pPr>
+      <w:r>
+        <w:drawing>
+          <wp:inline>
+            <wp:extent cx="5067300" cy="2352876"/>
+            <wp:effectExtent b="0" l="0" r="0" t="0"/>
+            <wp:docPr descr="EV-C204-012 — Code scanning (CodeQL): 0 alertas abiertas y 3 cerradas como corregidas («Missing rate limiting», servidor/servidor.js líneas 57, 72 y 86). El aviso rojo «CodeQL is reporting errors» es un mensaje de estado de GitHub visible en ese momento; los datos del repositorio (EV-C204-025) no muestran ningún error en los análisis" title="" id="147" name="Picture"/>
+            <a:graphic>
+              <a:graphicData uri="http://schemas.openxmlformats.org/drawingml/2006/picture">
+                <pic:pic>
+                  <pic:nvPicPr>
+                    <pic:cNvPr descr="evidencias/capturas/EV-C204-012-codeql-alertas.png" id="148" name="Picture"/>
+                    <pic:cNvPicPr>
+                      <a:picLocks noChangeArrowheads="1" noChangeAspect="1"/>
+                    </pic:cNvPicPr>
+                  </pic:nvPicPr>
+                  <pic:blipFill>
+                    <a:blip r:embed="rId146"/>
+                    <a:stretch>
+                      <a:fillRect/>
+                    </a:stretch>
+                  </pic:blipFill>
+                  <pic:spPr bwMode="auto">
+                    <a:xfrm>
+                      <a:off x="0" y="0"/>
+                      <a:ext cx="5067300" cy="2352876"/>
+                    </a:xfrm>
+                    <a:prstGeom prst="rect">
+                      <a:avLst/>
+                    </a:prstGeom>
+                    <a:noFill/>
+                    <a:ln w="9525">
+                      <a:noFill/>
+                      <a:headEnd/>
+                      <a:tailEnd/>
+                    </a:ln>
+                  </pic:spPr>
+                </pic:pic>
+              </a:graphicData>
+            </a:graphic>
+          </wp:inline>
+        </w:drawing>
+      </w:r>
+      <w:r>
+        <w:t xml:space="preserve"> </w:t>
+      </w:r>
+      <w:r>
+        <w:t xml:space="preserve">El script</w:t>
       </w:r>
       <w:r>
         <w:t xml:space="preserve"> </w:t>
@@ -18628,8 +18869,8 @@
         <w:t xml:space="preserve">a los artefactos del run.</w:t>
       </w:r>
     </w:p>
-    <w:bookmarkEnd w:id="143"/>
-    <w:bookmarkStart w:id="144" w:name="X90c915205735c26bb30e51af496094beb9c6e7a"/>
+    <w:bookmarkEnd w:id="149"/>
+    <w:bookmarkStart w:id="150" w:name="X90c915205735c26bb30e51af496094beb9c6e7a"/>
     <w:p>
       <w:pPr>
         <w:pStyle w:val="Heading3"/>
@@ -18904,9 +19145,9 @@
         </w:tc>
       </w:tr>
     </w:tbl>
-    <w:bookmarkEnd w:id="144"/>
-    <w:bookmarkEnd w:id="145"/>
-    <w:bookmarkStart w:id="146" w:name="protección-de-la-rama-principal"/>
+    <w:bookmarkEnd w:id="150"/>
+    <w:bookmarkEnd w:id="151"/>
+    <w:bookmarkStart w:id="155" w:name="protección-de-la-rama-principal"/>
     <w:p>
       <w:pPr>
         <w:pStyle w:val="Heading2"/>
@@ -18924,13 +19165,13 @@
           <w:bCs/>
           <w:b/>
         </w:rPr>
-        <w:t xml:space="preserve">Estado: pendiente de activar por el titular del repositorio.</w:t>
-      </w:r>
-      <w:r>
-        <w:t xml:space="preserve"> </w:t>
-      </w:r>
-      <w:r>
-        <w:t xml:space="preserve">Cambiar la configuración de seguridad de un repositorio es una decisión de quien lo administra, por lo que no se aplicó automáticamente. La guía (paso 14) pide proteger</w:t>
+        <w:t xml:space="preserve">Estado: activada el 19-sep-2026 por el titular del repositorio</w:t>
+      </w:r>
+      <w:r>
+        <w:t xml:space="preserve"> </w:t>
+      </w:r>
+      <w:r>
+        <w:t xml:space="preserve">(cambiar la configuración de seguridad de un repositorio es decisión de quien lo administra, por lo que no se aplicó automáticamente). La guía (paso 14) pide proteger</w:t>
       </w:r>
       <w:r>
         <w:t xml:space="preserve"> </w:t>
@@ -18950,7 +19191,31 @@
         <w:pStyle w:val="BodyText"/>
       </w:pPr>
       <w:r>
-        <w:t xml:space="preserve">Configuración recomendada (Settings → Rules → Rulesets →</w:t>
+        <w:t xml:space="preserve">Configuración aplicada (Settings → Rules → Rulesets → ruleset</w:t>
+      </w:r>
+      <w:r>
+        <w:t xml:space="preserve"> </w:t>
+      </w:r>
+      <w:r>
+        <w:rPr>
+          <w:rStyle w:val="VerbatimChar"/>
+        </w:rPr>
+        <w:t xml:space="preserve">proteger-main</w:t>
+      </w:r>
+      <w:r>
+        <w:t xml:space="preserve">, activo, objetivo: rama por defecto</w:t>
+      </w:r>
+      <w:r>
+        <w:t xml:space="preserve"> </w:t>
+      </w:r>
+      <w:r>
+        <w:rPr>
+          <w:rStyle w:val="VerbatimChar"/>
+        </w:rPr>
+        <w:t xml:space="preserve">main</w:t>
+      </w:r>
+      <w:r>
+        <w:t xml:space="preserve">, sin excepciones de</w:t>
       </w:r>
       <w:r>
         <w:t xml:space="preserve"> </w:t>
@@ -18960,19 +19225,7 @@
           <w:iCs/>
           <w:i/>
         </w:rPr>
-        <w:t xml:space="preserve">New branch ruleset</w:t>
-      </w:r>
-      <w:r>
-        <w:t xml:space="preserve">, rama objetivo</w:t>
-      </w:r>
-      <w:r>
-        <w:t xml:space="preserve"> </w:t>
-      </w:r>
-      <w:r>
-        <w:rPr>
-          <w:rStyle w:val="VerbatimChar"/>
-        </w:rPr>
-        <w:t xml:space="preserve">main</w:t>
+        <w:t xml:space="preserve">bypass</w:t>
       </w:r>
       <w:r>
         <w:t xml:space="preserve">):</w:t>
@@ -19119,19 +19372,70 @@
         <w:pStyle w:val="FirstParagraph"/>
       </w:pPr>
       <w:r>
-        <w:t xml:space="preserve">El paso a paso con capturas está en</w:t>
-      </w:r>
-      <w:r>
-        <w:t xml:space="preserve"> </w:t>
+        <w:t xml:space="preserve">Se verificó la configuración real con la API de GitHub (</w:t>
       </w:r>
       <w:r>
         <w:rPr>
           <w:rStyle w:val="VerbatimChar"/>
         </w:rPr>
-        <w:t xml:space="preserve">docs/evidencias/INSTRUCCIONES-CAPTURA.md</w:t>
-      </w:r>
-      <w:r>
-        <w:t xml:space="preserve">. Al activarlo, guardar la captura como</w:t>
+        <w:t xml:space="preserve">EV-C204-030-ruleset-main.json</w:t>
+      </w:r>
+      <w:r>
+        <w:t xml:space="preserve">): reglas</w:t>
+      </w:r>
+      <w:r>
+        <w:t xml:space="preserve"> </w:t>
+      </w:r>
+      <w:r>
+        <w:rPr>
+          <w:rStyle w:val="VerbatimChar"/>
+        </w:rPr>
+        <w:t xml:space="preserve">deletion</w:t>
+      </w:r>
+      <w:r>
+        <w:t xml:space="preserve">,</w:t>
+      </w:r>
+      <w:r>
+        <w:t xml:space="preserve"> </w:t>
+      </w:r>
+      <w:r>
+        <w:rPr>
+          <w:rStyle w:val="VerbatimChar"/>
+        </w:rPr>
+        <w:t xml:space="preserve">non_fast_forward</w:t>
+      </w:r>
+      <w:r>
+        <w:t xml:space="preserve">,</w:t>
+      </w:r>
+      <w:r>
+        <w:t xml:space="preserve"> </w:t>
+      </w:r>
+      <w:r>
+        <w:rPr>
+          <w:rStyle w:val="VerbatimChar"/>
+        </w:rPr>
+        <w:t xml:space="preserve">pull_request</w:t>
+      </w:r>
+      <w:r>
+        <w:t xml:space="preserve"> </w:t>
+      </w:r>
+      <w:r>
+        <w:t xml:space="preserve">(0 aprobaciones) y</w:t>
+      </w:r>
+      <w:r>
+        <w:t xml:space="preserve"> </w:t>
+      </w:r>
+      <w:r>
+        <w:rPr>
+          <w:rStyle w:val="VerbatimChar"/>
+        </w:rPr>
+        <w:t xml:space="preserve">required_status_checks</w:t>
+      </w:r>
+      <w:r>
+        <w:t xml:space="preserve"> </w:t>
+      </w:r>
+      <w:r>
+        <w:t xml:space="preserve">con los cinco nombres exactos del pipeline.</w:t>
       </w:r>
       <w:r>
         <w:t xml:space="preserve"> </w:t>
@@ -19141,10 +19445,114 @@
           <w:bCs/>
           <w:b/>
         </w:rPr>
-        <w:t xml:space="preserve">EV-C204-014</w:t>
-      </w:r>
-      <w:r>
-        <w:t xml:space="preserve">.</w:t>
+        <w:t xml:space="preserve">Consecuencia:</w:t>
+      </w:r>
+      <w:r>
+        <w:t xml:space="preserve"> </w:t>
+      </w:r>
+      <w:r>
+        <w:t xml:space="preserve">desde este momento todo cambio a</w:t>
+      </w:r>
+      <w:r>
+        <w:t xml:space="preserve"> </w:t>
+      </w:r>
+      <w:r>
+        <w:rPr>
+          <w:rStyle w:val="VerbatimChar"/>
+        </w:rPr>
+        <w:t xml:space="preserve">main</w:t>
+      </w:r>
+      <w:r>
+        <w:t xml:space="preserve"> </w:t>
+      </w:r>
+      <w:r>
+        <w:t xml:space="preserve">entra por</w:t>
+      </w:r>
+      <w:r>
+        <w:t xml:space="preserve"> </w:t>
+      </w:r>
+      <w:r>
+        <w:rPr>
+          <w:iCs/>
+          <w:i/>
+        </w:rPr>
+        <w:t xml:space="preserve">pull request</w:t>
+      </w:r>
+      <w:r>
+        <w:t xml:space="preserve"> </w:t>
+      </w:r>
+      <w:r>
+        <w:t xml:space="preserve">y solo se puede fusionar con las cinco pruebas en verde.</w:t>
+      </w:r>
+    </w:p>
+    <w:p>
+      <w:pPr>
+        <w:pStyle w:val="CaptionedFigure"/>
+      </w:pPr>
+      <w:r>
+        <w:drawing>
+          <wp:inline>
+            <wp:extent cx="4800600" cy="2686623"/>
+            <wp:effectExtent b="0" l="0" r="0" t="0"/>
+            <wp:docPr descr="EV-C204-014 — Rulesets del repositorio: proteger-main activo, 4 reglas, 1 rama" title="" id="153" name="Picture"/>
+            <a:graphic>
+              <a:graphicData uri="http://schemas.openxmlformats.org/drawingml/2006/picture">
+                <pic:pic>
+                  <pic:nvPicPr>
+                    <pic:cNvPr descr="evidencias/capturas/EV-C204-014-proteccion.png" id="154" name="Picture"/>
+                    <pic:cNvPicPr>
+                      <a:picLocks noChangeArrowheads="1" noChangeAspect="1"/>
+                    </pic:cNvPicPr>
+                  </pic:nvPicPr>
+                  <pic:blipFill>
+                    <a:blip r:embed="rId152"/>
+                    <a:stretch>
+                      <a:fillRect/>
+                    </a:stretch>
+                  </pic:blipFill>
+                  <pic:spPr bwMode="auto">
+                    <a:xfrm>
+                      <a:off x="0" y="0"/>
+                      <a:ext cx="4800600" cy="2686623"/>
+                    </a:xfrm>
+                    <a:prstGeom prst="rect">
+                      <a:avLst/>
+                    </a:prstGeom>
+                    <a:noFill/>
+                    <a:ln w="9525">
+                      <a:noFill/>
+                      <a:headEnd/>
+                      <a:tailEnd/>
+                    </a:ln>
+                  </pic:spPr>
+                </pic:pic>
+              </a:graphicData>
+            </a:graphic>
+          </wp:inline>
+        </w:drawing>
+      </w:r>
+    </w:p>
+    <w:p>
+      <w:pPr>
+        <w:pStyle w:val="ImageCaption"/>
+      </w:pPr>
+      <w:r>
+        <w:t xml:space="preserve">EV-C204-014 — Rulesets del repositorio:</w:t>
+      </w:r>
+      <w:r>
+        <w:t xml:space="preserve"> </w:t>
+      </w:r>
+      <w:r>
+        <w:rPr>
+          <w:rStyle w:val="VerbatimChar"/>
+        </w:rPr>
+        <w:t xml:space="preserve">proteger-main</w:t>
+      </w:r>
+      <w:r>
+        <w:t xml:space="preserve"> </w:t>
+      </w:r>
+      <w:r>
+        <w:t xml:space="preserve">activo, 4 reglas, 1 rama</w:t>
       </w:r>
     </w:p>
     <w:p>
@@ -19162,20 +19570,7 @@
         <w:t xml:space="preserve"> </w:t>
       </w:r>
       <w:r>
-        <w:t xml:space="preserve">EV-C204-014 —</w:t>
-      </w:r>
-      <w:r>
-        <w:t xml:space="preserve"> </w:t>
-      </w:r>
-      <w:r>
-        <w:rPr>
-          <w:bCs/>
-          <w:b/>
-        </w:rPr>
-        <w:t xml:space="preserve">pendiente del equipo</w:t>
-      </w:r>
-      <w:r>
-        <w:t xml:space="preserve">.</w:t>
+        <w:t xml:space="preserve">EV-C204-014 y EV-C204-030.</w:t>
       </w:r>
     </w:p>
     <w:p>
@@ -19185,9 +19580,9 @@
         </w:pict>
       </w:r>
     </w:p>
-    <w:bookmarkEnd w:id="146"/>
-    <w:bookmarkEnd w:id="147"/>
-    <w:bookmarkStart w:id="154" w:name="parte-iv-pruebas-y-riesgos"/>
+    <w:bookmarkEnd w:id="155"/>
+    <w:bookmarkEnd w:id="156"/>
+    <w:bookmarkStart w:id="163" w:name="parte-iv-pruebas-y-riesgos"/>
     <w:p>
       <w:pPr>
         <w:pStyle w:val="Heading1"/>
@@ -19196,7 +19591,7 @@
         <w:t xml:space="preserve">PARTE IV — PRUEBAS Y RIESGOS</w:t>
       </w:r>
     </w:p>
-    <w:bookmarkStart w:id="149" w:name="cálculo-de-riesgo"/>
+    <w:bookmarkStart w:id="158" w:name="cálculo-de-riesgo"/>
     <w:p>
       <w:pPr>
         <w:pStyle w:val="Heading2"/>
@@ -19231,7 +19626,7 @@
       <w:r>
         <w:t xml:space="preserve"> </w:t>
       </w:r>
-      <w:hyperlink r:id="rId148">
+      <w:hyperlink r:id="rId157">
         <w:r>
           <w:rPr>
             <w:rStyle w:val="VerbatimChar"/>
@@ -19488,8 +19883,8 @@
         <w:t xml:space="preserve">Riesgo residual aceptado: CVEs de util-linux sin parche, falso positivo de ZAP en respuestas 404 y secretos ficticios que permanecen en el historial de git.</w:t>
       </w:r>
     </w:p>
-    <w:bookmarkEnd w:id="149"/>
-    <w:bookmarkStart w:id="151" w:name="documentación-de-pruebas"/>
+    <w:bookmarkEnd w:id="158"/>
+    <w:bookmarkStart w:id="160" w:name="documentación-de-pruebas"/>
     <w:p>
       <w:pPr>
         <w:pStyle w:val="Heading2"/>
@@ -19524,7 +19919,7 @@
       <w:r>
         <w:t xml:space="preserve"> </w:t>
       </w:r>
-      <w:hyperlink r:id="rId150">
+      <w:hyperlink r:id="rId159">
         <w:r>
           <w:rPr>
             <w:rStyle w:val="VerbatimChar"/>
@@ -19886,8 +20281,8 @@
         <w:t xml:space="preserve">P-27 (app móvil) y P-28 (consola de Keycloak en el Codespace).</w:t>
       </w:r>
     </w:p>
-    <w:bookmarkEnd w:id="151"/>
-    <w:bookmarkStart w:id="153" w:name="plantilla-de-diagnóstico-del-curso"/>
+    <w:bookmarkEnd w:id="160"/>
+    <w:bookmarkStart w:id="162" w:name="plantilla-de-diagnóstico-del-curso"/>
     <w:p>
       <w:pPr>
         <w:pStyle w:val="Heading2"/>
@@ -19906,7 +20301,7 @@
       <w:r>
         <w:t xml:space="preserve"> </w:t>
       </w:r>
-      <w:hyperlink r:id="rId152">
+      <w:hyperlink r:id="rId161">
         <w:r>
           <w:rPr>
             <w:rStyle w:val="VerbatimChar"/>
@@ -19928,9 +20323,9 @@
         </w:pict>
       </w:r>
     </w:p>
-    <w:bookmarkEnd w:id="153"/>
-    <w:bookmarkEnd w:id="154"/>
-    <w:bookmarkStart w:id="212" w:name="parte-v-cierre-académico"/>
+    <w:bookmarkEnd w:id="162"/>
+    <w:bookmarkEnd w:id="163"/>
+    <w:bookmarkStart w:id="221" w:name="parte-v-cierre-académico"/>
     <w:p>
       <w:pPr>
         <w:pStyle w:val="Heading1"/>
@@ -19939,7 +20334,7 @@
         <w:t xml:space="preserve">PARTE V — CIERRE ACADÉMICO</w:t>
       </w:r>
     </w:p>
-    <w:bookmarkStart w:id="155" w:name="resumen-de-resultados"/>
+    <w:bookmarkStart w:id="164" w:name="resumen-de-resultados"/>
     <w:p>
       <w:pPr>
         <w:pStyle w:val="Heading2"/>
@@ -20379,8 +20774,8 @@
         </w:tc>
       </w:tr>
     </w:tbl>
-    <w:bookmarkEnd w:id="155"/>
-    <w:bookmarkStart w:id="156" w:name="conclusiones"/>
+    <w:bookmarkEnd w:id="164"/>
+    <w:bookmarkStart w:id="165" w:name="conclusiones"/>
     <w:p>
       <w:pPr>
         <w:pStyle w:val="Heading2"/>
@@ -20577,11 +20972,11 @@
         <w:t xml:space="preserve"> </w:t>
       </w:r>
       <w:r>
-        <w:t xml:space="preserve">La app móvil y la consola de Keycloak del Codespace no se pudieron verificar en este entorno (pendiente del equipo); las llaves RSA se generan en memoria y se pierden al reiniciar (adecuado para un laboratorio, no para producción).</w:t>
+        <w:t xml:space="preserve">La app móvil y la consola de Keycloak del Codespace no se pudieron verificar en este entorno (pendiente del equipo) y el Codespace con Docker aún debe confirmarse; las llaves RSA se generan en memoria y se pierden al reiniciar (adecuado para un laboratorio, no para producción).</w:t>
       </w:r>
     </w:p>
-    <w:bookmarkEnd w:id="156"/>
-    <w:bookmarkStart w:id="157" w:name="recomendaciones"/>
+    <w:bookmarkEnd w:id="165"/>
+    <w:bookmarkStart w:id="166" w:name="recomendaciones"/>
     <w:p>
       <w:pPr>
         <w:pStyle w:val="Heading2"/>
@@ -20637,7 +21032,7 @@
           <w:bCs/>
           <w:b/>
         </w:rPr>
-        <w:t xml:space="preserve">Activar la protección de</w:t>
+        <w:t xml:space="preserve">Mantener la protección de</w:t>
       </w:r>
       <w:r>
         <w:rPr>
@@ -20658,7 +21053,7 @@
         <w:t xml:space="preserve"> </w:t>
       </w:r>
       <w:r>
-        <w:t xml:space="preserve">(§15) para que ningún cambio llegue sin las cinco pruebas en verde.</w:t>
+        <w:t xml:space="preserve">(§15, ya activa) y, si el equipo crece, exigir al menos una aprobación de revisión.</w:t>
       </w:r>
       <w:r>
         <w:t xml:space="preserve"> </w:t>
@@ -20956,8 +21351,8 @@
         <w:t xml:space="preserve">del código junto al pipeline, dado el hallazgo metodológico de §13.4.</w:t>
       </w:r>
     </w:p>
-    <w:bookmarkEnd w:id="157"/>
-    <w:bookmarkStart w:id="158" w:name="referencias"/>
+    <w:bookmarkEnd w:id="166"/>
+    <w:bookmarkStart w:id="167" w:name="referencias"/>
     <w:p>
       <w:pPr>
         <w:pStyle w:val="Heading2"/>
@@ -21352,8 +21747,8 @@
         </w:pict>
       </w:r>
     </w:p>
-    <w:bookmarkEnd w:id="158"/>
-    <w:bookmarkStart w:id="159" w:name="cobertura-de-la-rúbrica-del-proyecto"/>
+    <w:bookmarkEnd w:id="167"/>
+    <w:bookmarkStart w:id="168" w:name="cobertura-de-la-rúbrica-del-proyecto"/>
     <w:p>
       <w:pPr>
         <w:pStyle w:val="Heading2"/>
@@ -21851,8 +22246,8 @@
         </w:pict>
       </w:r>
     </w:p>
-    <w:bookmarkEnd w:id="159"/>
-    <w:bookmarkStart w:id="160" w:name="anexos"/>
+    <w:bookmarkEnd w:id="168"/>
+    <w:bookmarkStart w:id="169" w:name="anexos"/>
     <w:p>
       <w:pPr>
         <w:pStyle w:val="Heading2"/>
@@ -22088,8 +22483,8 @@
         </w:pict>
       </w:r>
     </w:p>
-    <w:bookmarkEnd w:id="160"/>
-    <w:bookmarkStart w:id="199" w:name="anexo-a-tablas-16-completas"/>
+    <w:bookmarkEnd w:id="169"/>
+    <w:bookmarkStart w:id="208" w:name="anexo-a-tablas-16-completas"/>
     <w:p>
       <w:pPr>
         <w:pStyle w:val="Heading2"/>
@@ -22098,7 +22493,7 @@
         <w:t xml:space="preserve">Anexo A — Tablas 1–6 completas</w:t>
       </w:r>
     </w:p>
-    <w:bookmarkStart w:id="166" w:name="tabla-1-requisitos-de-seguridad"/>
+    <w:bookmarkStart w:id="175" w:name="tabla-1-requisitos-de-seguridad"/>
     <w:p>
       <w:pPr>
         <w:pStyle w:val="Heading3"/>
@@ -22137,7 +22532,7 @@
         <w:t xml:space="preserve">Marco de referencia: OWASP SAMM, NIST SSDF, OWASP ASVS y OWASP MASVS.</w:t>
       </w:r>
     </w:p>
-    <w:bookmarkStart w:id="161" w:name="requisitos-de-seguridad"/>
+    <w:bookmarkStart w:id="170" w:name="requisitos-de-seguridad"/>
     <w:p>
       <w:pPr>
         <w:pStyle w:val="Heading4"/>
@@ -22539,8 +22934,8 @@
         </w:tc>
       </w:tr>
     </w:tbl>
-    <w:bookmarkEnd w:id="161"/>
-    <w:bookmarkStart w:id="162" w:name="justificación-de-cada-requisito-por-qué"/>
+    <w:bookmarkEnd w:id="170"/>
+    <w:bookmarkStart w:id="171" w:name="justificación-de-cada-requisito-por-qué"/>
     <w:p>
       <w:pPr>
         <w:pStyle w:val="Heading4"/>
@@ -22671,8 +23066,8 @@
         <w:t xml:space="preserve">Para operaciones sensibles, debe quedar evidencia de quién hizo qué y cuándo. La bitácora permite auditoría y detección de abusos. Se documenta como requisito adicional para exceder el alcance mínimo (CIA + autenticación).</w:t>
       </w:r>
     </w:p>
-    <w:bookmarkEnd w:id="162"/>
-    <w:bookmarkStart w:id="163" w:name="mapeo-con-estándares"/>
+    <w:bookmarkEnd w:id="171"/>
+    <w:bookmarkStart w:id="172" w:name="mapeo-con-estándares"/>
     <w:p>
       <w:pPr>
         <w:pStyle w:val="Heading4"/>
@@ -23071,8 +23466,8 @@
         </w:tc>
       </w:tr>
     </w:tbl>
-    <w:bookmarkEnd w:id="163"/>
-    <w:bookmarkStart w:id="164" w:name="X666b4e7d9d99764e434239e12ace7d4bf548d22"/>
+    <w:bookmarkEnd w:id="172"/>
+    <w:bookmarkStart w:id="173" w:name="X666b4e7d9d99764e434239e12ace7d4bf548d22"/>
     <w:p>
       <w:pPr>
         <w:pStyle w:val="Heading4"/>
@@ -23372,8 +23767,8 @@
         </w:tc>
       </w:tr>
     </w:tbl>
-    <w:bookmarkEnd w:id="164"/>
-    <w:bookmarkStart w:id="165" w:name="nota-de-trazabilidad"/>
+    <w:bookmarkEnd w:id="173"/>
+    <w:bookmarkStart w:id="174" w:name="nota-de-trazabilidad"/>
     <w:p>
       <w:pPr>
         <w:pStyle w:val="Heading4"/>
@@ -23390,9 +23785,9 @@
         <w:t xml:space="preserve">Esta tabla alimenta: informe §5, Tabla 2 (STRIDE — los controles responden a las amenazas), Tabla 5 (riesgo — los requisitos priorizan las mitigaciones) y Tabla 6 (pruebas — cada requisito tiene su prueba de verificación).</w:t>
       </w:r>
     </w:p>
-    <w:bookmarkEnd w:id="165"/>
-    <w:bookmarkEnd w:id="166"/>
-    <w:bookmarkStart w:id="172" w:name="tabla-2-amenazas-stride"/>
+    <w:bookmarkEnd w:id="174"/>
+    <w:bookmarkEnd w:id="175"/>
+    <w:bookmarkStart w:id="181" w:name="tabla-2-amenazas-stride"/>
     <w:p>
       <w:pPr>
         <w:pStyle w:val="Heading3"/>
@@ -23425,7 +23820,7 @@
         <w:t xml:space="preserve">— Primer Avance. Modelado de amenazas con STRIDE (Microsoft): por cada amenaza, qué componente afecta, un ejemplo de ataque y cómo se frena.</w:t>
       </w:r>
     </w:p>
-    <w:bookmarkStart w:id="167" w:name="amenazas-stride-1"/>
+    <w:bookmarkStart w:id="176" w:name="amenazas-stride-1"/>
     <w:p>
       <w:pPr>
         <w:pStyle w:val="Heading4"/>
@@ -23858,8 +24253,8 @@
         </w:tc>
       </w:tr>
     </w:tbl>
-    <w:bookmarkEnd w:id="167"/>
-    <w:bookmarkStart w:id="168" w:name="severidad-estimada-por-amenaza"/>
+    <w:bookmarkEnd w:id="176"/>
+    <w:bookmarkStart w:id="177" w:name="severidad-estimada-por-amenaza"/>
     <w:p>
       <w:pPr>
         <w:pStyle w:val="Heading4"/>
@@ -24202,8 +24597,8 @@
         </w:tc>
       </w:tr>
     </w:tbl>
-    <w:bookmarkEnd w:id="168"/>
-    <w:bookmarkStart w:id="169" w:name="X4136c939b174cf6b5602bf7d696b7a729574dcc"/>
+    <w:bookmarkEnd w:id="177"/>
+    <w:bookmarkStart w:id="178" w:name="X4136c939b174cf6b5602bf7d696b7a729574dcc"/>
     <w:p>
       <w:pPr>
         <w:pStyle w:val="Heading4"/>
@@ -24774,8 +25169,8 @@
         </w:tc>
       </w:tr>
     </w:tbl>
-    <w:bookmarkEnd w:id="169"/>
-    <w:bookmarkStart w:id="170" w:name="mapeo-a-cwe-para-cruzar-con-la-tabla-3"/>
+    <w:bookmarkEnd w:id="178"/>
+    <w:bookmarkStart w:id="179" w:name="mapeo-a-cwe-para-cruzar-con-la-tabla-3"/>
     <w:p>
       <w:pPr>
         <w:pStyle w:val="Heading4"/>
@@ -25084,8 +25479,8 @@
         </w:tc>
       </w:tr>
     </w:tbl>
-    <w:bookmarkEnd w:id="170"/>
-    <w:bookmarkStart w:id="171" w:name="nota-de-trazabilidad-1"/>
+    <w:bookmarkEnd w:id="179"/>
+    <w:bookmarkStart w:id="180" w:name="nota-de-trazabilidad-1"/>
     <w:p>
       <w:pPr>
         <w:pStyle w:val="Heading4"/>
@@ -25102,9 +25497,9 @@
         <w:t xml:space="preserve">Esta tabla alimenta: informe §6, Tabla 3 (los hallazgos de Fase 1 se clasifican por amenaza/CWE), Tabla 5 (riesgo — la severidad aquí se cuantifica con P×I) y Tabla 6 (las pruebas de verificación de esta tabla se ejecutan y documentan).</w:t>
       </w:r>
     </w:p>
-    <w:bookmarkEnd w:id="171"/>
-    <w:bookmarkEnd w:id="172"/>
-    <w:bookmarkStart w:id="178" w:name="X88e3b57aa7f7cbbca5e2ce00a2ca14142f424a2"/>
+    <w:bookmarkEnd w:id="180"/>
+    <w:bookmarkEnd w:id="181"/>
+    <w:bookmarkStart w:id="187" w:name="X88e3b57aa7f7cbbca5e2ce00a2ca14142f424a2"/>
     <w:p>
       <w:pPr>
         <w:pStyle w:val="Heading3"/>
@@ -25159,7 +25554,7 @@
         <w:t xml:space="preserve">, código oficial sin remediar), descargada de GitHub Actions. Es la única corrida que refleja el proyecto tal como llegó, antes de corregir. Reportes: EV-C204-020/021/022 (zips de artefactos), EV-C204-027 (SBOM) y EV-C204-028 (log de los jobs en rojo); capturas de pantalla EV-C204-033 a EV-C204-051.</w:t>
       </w:r>
     </w:p>
-    <w:bookmarkStart w:id="173" w:name="resultado-por-prueba"/>
+    <w:bookmarkStart w:id="182" w:name="resultado-por-prueba"/>
     <w:p>
       <w:pPr>
         <w:pStyle w:val="Heading4"/>
@@ -25610,8 +26005,8 @@
         </w:tc>
       </w:tr>
     </w:tbl>
-    <w:bookmarkEnd w:id="173"/>
-    <w:bookmarkStart w:id="174" w:name="hallazgos-h-01-a-h-15"/>
+    <w:bookmarkEnd w:id="182"/>
+    <w:bookmarkStart w:id="183" w:name="hallazgos-h-01-a-h-15"/>
     <w:p>
       <w:pPr>
         <w:pStyle w:val="Heading4"/>
@@ -27642,8 +28037,8 @@
         <w:t xml:space="preserve">: por eso la revisión manual del código sigue siendo necesaria además del pipeline.</w:t>
       </w:r>
     </w:p>
-    <w:bookmarkEnd w:id="174"/>
-    <w:bookmarkStart w:id="175" w:name="dónde-encontrar-cada-hallazgo"/>
+    <w:bookmarkEnd w:id="183"/>
+    <w:bookmarkStart w:id="184" w:name="dónde-encontrar-cada-hallazgo"/>
     <w:p>
       <w:pPr>
         <w:pStyle w:val="Heading4"/>
@@ -27931,8 +28326,8 @@
         </w:tc>
       </w:tr>
     </w:tbl>
-    <w:bookmarkEnd w:id="175"/>
-    <w:bookmarkStart w:id="176" w:name="evidencia-descargada-fase-1"/>
+    <w:bookmarkEnd w:id="184"/>
+    <w:bookmarkStart w:id="185" w:name="evidencia-descargada-fase-1"/>
     <w:p>
       <w:pPr>
         <w:pStyle w:val="Heading4"/>
@@ -28123,8 +28518,8 @@
         <w:t xml:space="preserve">porque el job de CodeQL avanzado no llegó a publicar alertas; las alertas de CodeQL de la Fase 2 están en EV-C204-025.</w:t>
       </w:r>
     </w:p>
-    <w:bookmarkEnd w:id="176"/>
-    <w:bookmarkStart w:id="177" w:name="registro-de-confirmación"/>
+    <w:bookmarkEnd w:id="185"/>
+    <w:bookmarkStart w:id="186" w:name="registro-de-confirmación"/>
     <w:p>
       <w:pPr>
         <w:pStyle w:val="Heading4"/>
@@ -28173,9 +28568,9 @@
         <w:t xml:space="preserve">(H-06, H-10, H-12, H-16); H-15 es un falso positivo documentado. Ningún hallazgo esperado quedó sin evidencia de alguna de las dos fuentes.</w:t>
       </w:r>
     </w:p>
-    <w:bookmarkEnd w:id="177"/>
-    <w:bookmarkEnd w:id="178"/>
-    <w:bookmarkStart w:id="181" w:name="X37972edf4fadebafaabacd263fa60fae156b3b2"/>
+    <w:bookmarkEnd w:id="186"/>
+    <w:bookmarkEnd w:id="187"/>
+    <w:bookmarkStart w:id="190" w:name="X37972edf4fadebafaabacd263fa60fae156b3b2"/>
     <w:p>
       <w:pPr>
         <w:pStyle w:val="Heading3"/>
@@ -28248,7 +28643,7 @@
         <w:t xml:space="preserve">, 5/5 jobs en verde y CodeQL con 0 alertas abiertas, EV-C204-026 y EV-C204-025).</w:t>
       </w:r>
     </w:p>
-    <w:bookmarkStart w:id="179" w:name="evidencia-antesdespués-por-hallazgo"/>
+    <w:bookmarkStart w:id="188" w:name="evidencia-antesdespués-por-hallazgo"/>
     <w:p>
       <w:pPr>
         <w:pStyle w:val="Heading4"/>
@@ -30095,8 +30490,8 @@
         </w:tc>
       </w:tr>
     </w:tbl>
-    <w:bookmarkEnd w:id="179"/>
-    <w:bookmarkStart w:id="180" w:name="Xcafc4bbed3100adc00f4dde4e229385ac3cc079"/>
+    <w:bookmarkEnd w:id="188"/>
+    <w:bookmarkStart w:id="189" w:name="Xcafc4bbed3100adc00f4dde4e229385ac3cc079"/>
     <w:p>
       <w:pPr>
         <w:pStyle w:val="Heading4"/>
@@ -31064,9 +31459,9 @@
         <w:t xml:space="preserve">.</w:t>
       </w:r>
     </w:p>
-    <w:bookmarkEnd w:id="180"/>
-    <w:bookmarkEnd w:id="181"/>
-    <w:bookmarkStart w:id="190" w:name="tabla-5-cálculo-de-riesgo"/>
+    <w:bookmarkEnd w:id="189"/>
+    <w:bookmarkEnd w:id="190"/>
+    <w:bookmarkStart w:id="199" w:name="tabla-5-cálculo-de-riesgo"/>
     <w:p>
       <w:pPr>
         <w:pStyle w:val="Heading3"/>
@@ -31125,7 +31520,7 @@
         <w:t xml:space="preserve">con la evidencia de la corrida verde 35442482331 (Tabla 4). Los valores de P e I son un juicio fundamentado del equipo con la escala documentada abajo; no son mediciones.</w:t>
       </w:r>
     </w:p>
-    <w:bookmarkStart w:id="182" w:name="metodología-1"/>
+    <w:bookmarkStart w:id="191" w:name="metodología-1"/>
     <w:p>
       <w:pPr>
         <w:pStyle w:val="Heading4"/>
@@ -31357,8 +31752,8 @@
         <w:t xml:space="preserve">Bajo (1–2) · Medio (3–4) · Alto (6–9)</w:t>
       </w:r>
     </w:p>
-    <w:bookmarkEnd w:id="182"/>
-    <w:bookmarkStart w:id="183" w:name="X5c4b44931359586bf6fdcf229fcfeb0dad2479a"/>
+    <w:bookmarkEnd w:id="191"/>
+    <w:bookmarkStart w:id="192" w:name="X5c4b44931359586bf6fdcf229fcfeb0dad2479a"/>
     <w:p>
       <w:pPr>
         <w:pStyle w:val="Heading4"/>
@@ -33366,8 +33761,8 @@
         <w:t xml:space="preserve">. Ningún riesgo llega a 1 porque el impacto potencial del activo no cambia con la corrección; solo baja la probabilidad.</w:t>
       </w:r>
     </w:p>
-    <w:bookmarkEnd w:id="183"/>
-    <w:bookmarkStart w:id="186" w:name="análisis-gerencial-complementario"/>
+    <w:bookmarkEnd w:id="192"/>
+    <w:bookmarkStart w:id="195" w:name="análisis-gerencial-complementario"/>
     <w:p>
       <w:pPr>
         <w:pStyle w:val="Heading4"/>
@@ -33376,7 +33771,7 @@
         <w:t xml:space="preserve">Análisis gerencial complementario</w:t>
       </w:r>
     </w:p>
-    <w:bookmarkStart w:id="184" w:name="pérdida-anual-esperada-ale"/>
+    <w:bookmarkStart w:id="193" w:name="pérdida-anual-esperada-ale"/>
     <w:p>
       <w:pPr>
         <w:pStyle w:val="Heading5"/>
@@ -34058,8 +34453,8 @@
         <w:t xml:space="preserve">para el laboratorio académico (no hay un negocio real detrás) y se ajustarían con datos del contexto si el docente lo solicita. La tasa ARO «después» es una estimación del equipo tras los controles verificados.</w:t>
       </w:r>
     </w:p>
-    <w:bookmarkEnd w:id="184"/>
-    <w:bookmarkStart w:id="185" w:name="justificación-de-probabilidades"/>
+    <w:bookmarkEnd w:id="193"/>
+    <w:bookmarkStart w:id="194" w:name="justificación-de-probabilidades"/>
     <w:p>
       <w:pPr>
         <w:pStyle w:val="Heading5"/>
@@ -34215,9 +34610,9 @@
         <w:t xml:space="preserve">P=3: cualquiera puede repetir peticiones sin límite; impacto 2 (abuso del servicio como oráculo o saturación).</w:t>
       </w:r>
     </w:p>
-    <w:bookmarkEnd w:id="185"/>
-    <w:bookmarkEnd w:id="186"/>
-    <w:bookmarkStart w:id="187" w:name="priorización-y-decisiones"/>
+    <w:bookmarkEnd w:id="194"/>
+    <w:bookmarkEnd w:id="195"/>
+    <w:bookmarkStart w:id="196" w:name="priorización-y-decisiones"/>
     <w:p>
       <w:pPr>
         <w:pStyle w:val="Heading4"/>
@@ -34278,8 +34673,8 @@
         <w:t xml:space="preserve">.</w:t>
       </w:r>
     </w:p>
-    <w:bookmarkEnd w:id="187"/>
-    <w:bookmarkStart w:id="188" w:name="riesgo-residual-aceptado"/>
+    <w:bookmarkEnd w:id="196"/>
+    <w:bookmarkStart w:id="197" w:name="riesgo-residual-aceptado"/>
     <w:p>
       <w:pPr>
         <w:pStyle w:val="Heading4"/>
@@ -34366,8 +34761,8 @@
         <w:t xml:space="preserve">: los valores de práctica siguen en el historial de git; son ficticios. En un proyecto real habría que rotarlos y reescribir el historial.</w:t>
       </w:r>
     </w:p>
-    <w:bookmarkEnd w:id="188"/>
-    <w:bookmarkStart w:id="189" w:name="nota-de-trazabilidad-2"/>
+    <w:bookmarkEnd w:id="197"/>
+    <w:bookmarkStart w:id="198" w:name="nota-de-trazabilidad-2"/>
     <w:p>
       <w:pPr>
         <w:pStyle w:val="Heading4"/>
@@ -34384,9 +34779,9 @@
         <w:t xml:space="preserve">Esta tabla alimenta: informe §16, la plantilla de diagnóstico y la Tabla 4.</w:t>
       </w:r>
     </w:p>
-    <w:bookmarkEnd w:id="189"/>
-    <w:bookmarkEnd w:id="190"/>
-    <w:bookmarkStart w:id="198" w:name="tabla-6-documentación-de-pruebas"/>
+    <w:bookmarkEnd w:id="198"/>
+    <w:bookmarkEnd w:id="199"/>
+    <w:bookmarkStart w:id="207" w:name="tabla-6-documentación-de-pruebas"/>
     <w:p>
       <w:pPr>
         <w:pStyle w:val="Heading3"/>
@@ -34495,7 +34890,7 @@
         <w:t xml:space="preserve">0).</w:t>
       </w:r>
     </w:p>
-    <w:bookmarkStart w:id="191" w:name="pruebas-funcionales-del-servicio"/>
+    <w:bookmarkStart w:id="200" w:name="pruebas-funcionales-del-servicio"/>
     <w:p>
       <w:pPr>
         <w:pStyle w:val="Heading4"/>
@@ -35744,8 +36139,8 @@
         </w:tc>
       </w:tr>
     </w:tbl>
-    <w:bookmarkEnd w:id="191"/>
-    <w:bookmarkStart w:id="192" w:name="pruebas-del-pipeline-github-actions"/>
+    <w:bookmarkEnd w:id="200"/>
+    <w:bookmarkStart w:id="201" w:name="pruebas-del-pipeline-github-actions"/>
     <w:p>
       <w:pPr>
         <w:pStyle w:val="Heading4"/>
@@ -36231,8 +36626,8 @@
         </w:tc>
       </w:tr>
     </w:tbl>
-    <w:bookmarkEnd w:id="192"/>
-    <w:bookmarkStart w:id="193" w:name="pruebas-de-pentest-manual"/>
+    <w:bookmarkEnd w:id="201"/>
+    <w:bookmarkStart w:id="202" w:name="pruebas-de-pentest-manual"/>
     <w:p>
       <w:pPr>
         <w:pStyle w:val="Heading4"/>
@@ -37152,8 +37547,8 @@
         </w:tc>
       </w:tr>
     </w:tbl>
-    <w:bookmarkEnd w:id="193"/>
-    <w:bookmarkStart w:id="194" w:name="X207d9e294f25d3c7c9d023b75d8e86673560f2f"/>
+    <w:bookmarkEnd w:id="202"/>
+    <w:bookmarkStart w:id="203" w:name="X207d9e294f25d3c7c9d023b75d8e86673560f2f"/>
     <w:p>
       <w:pPr>
         <w:pStyle w:val="Heading4"/>
@@ -37646,8 +38041,8 @@
         </w:tc>
       </w:tr>
     </w:tbl>
-    <w:bookmarkEnd w:id="194"/>
-    <w:bookmarkStart w:id="195" w:name="ajustes-de-pruebas-realizados"/>
+    <w:bookmarkEnd w:id="203"/>
+    <w:bookmarkStart w:id="204" w:name="ajustes-de-pruebas-realizados"/>
     <w:p>
       <w:pPr>
         <w:pStyle w:val="Heading4"/>
@@ -37906,8 +38301,8 @@
         <w:t xml:space="preserve">la primera prueba de expiración esperó 8 s con tokens de 5 s y aceptó el token, porque el servicio tolera 5 s de desfase de reloj. No era un fallo del servicio: se ajustó la espera a 12 s.</w:t>
       </w:r>
     </w:p>
-    <w:bookmarkEnd w:id="195"/>
-    <w:bookmarkStart w:id="196" w:name="X267b18a9dacca8e9e870fac5000f4897318d54f"/>
+    <w:bookmarkEnd w:id="204"/>
+    <w:bookmarkStart w:id="205" w:name="X267b18a9dacca8e9e870fac5000f4897318d54f"/>
     <w:p>
       <w:pPr>
         <w:pStyle w:val="Heading4"/>
@@ -38133,8 +38528,8 @@
         </w:tc>
       </w:tr>
     </w:tbl>
-    <w:bookmarkEnd w:id="196"/>
-    <w:bookmarkStart w:id="197" w:name="nota-de-trazabilidad-3"/>
+    <w:bookmarkEnd w:id="205"/>
+    <w:bookmarkStart w:id="206" w:name="nota-de-trazabilidad-3"/>
     <w:p>
       <w:pPr>
         <w:pStyle w:val="Heading4"/>
@@ -38158,10 +38553,10 @@
         </w:pict>
       </w:r>
     </w:p>
-    <w:bookmarkEnd w:id="197"/>
-    <w:bookmarkEnd w:id="198"/>
-    <w:bookmarkEnd w:id="199"/>
-    <w:bookmarkStart w:id="200" w:name="anexo-b-reportes-del-pipeline"/>
+    <w:bookmarkEnd w:id="206"/>
+    <w:bookmarkEnd w:id="207"/>
+    <w:bookmarkEnd w:id="208"/>
+    <w:bookmarkStart w:id="209" w:name="anexo-b-reportes-del-pipeline"/>
     <w:p>
       <w:pPr>
         <w:pStyle w:val="Heading2"/>
@@ -38588,8 +38983,8 @@
         </w:pict>
       </w:r>
     </w:p>
-    <w:bookmarkEnd w:id="200"/>
-    <w:bookmarkStart w:id="201" w:name="anexo-c-manifiesto-sha-256"/>
+    <w:bookmarkEnd w:id="209"/>
+    <w:bookmarkStart w:id="210" w:name="anexo-c-manifiesto-sha-256"/>
     <w:p>
       <w:pPr>
         <w:pStyle w:val="Heading2"/>
@@ -38729,8 +39124,8 @@
         </w:pict>
       </w:r>
     </w:p>
-    <w:bookmarkEnd w:id="201"/>
-    <w:bookmarkStart w:id="202" w:name="X1192fa1c2e07773af67639ba7cbc366731d2a91"/>
+    <w:bookmarkEnd w:id="210"/>
+    <w:bookmarkStart w:id="211" w:name="X1192fa1c2e07773af67639ba7cbc366731d2a91"/>
     <w:p>
       <w:pPr>
         <w:pStyle w:val="Heading2"/>
@@ -40053,8 +40448,8 @@
         </w:pict>
       </w:r>
     </w:p>
-    <w:bookmarkEnd w:id="202"/>
-    <w:bookmarkStart w:id="203" w:name="anexo-e-cronograma-del-proyecto"/>
+    <w:bookmarkEnd w:id="211"/>
+    <w:bookmarkStart w:id="212" w:name="anexo-e-cronograma-del-proyecto"/>
     <w:p>
       <w:pPr>
         <w:pStyle w:val="Heading2"/>
@@ -40541,7 +40936,7 @@
               <w:jc w:val="left"/>
             </w:pPr>
             <w:r>
-              <w:t xml:space="preserve">✅ CodeQL revisado · ⏳ protección de</w:t>
+              <w:t xml:space="preserve">✅ CodeQL revisado · ✅ protección de</w:t>
             </w:r>
             <w:r>
               <w:t xml:space="preserve"> </w:t>
@@ -40649,8 +41044,8 @@
         </w:pict>
       </w:r>
     </w:p>
-    <w:bookmarkEnd w:id="203"/>
-    <w:bookmarkStart w:id="207" w:name="X97195745177c874f01ad80e4dce35521f49f2f2"/>
+    <w:bookmarkEnd w:id="212"/>
+    <w:bookmarkStart w:id="216" w:name="X97195745177c874f01ad80e4dce35521f49f2f2"/>
     <w:p>
       <w:pPr>
         <w:pStyle w:val="Heading2"/>
@@ -40659,7 +41054,7 @@
         <w:t xml:space="preserve">Anexo F — Guía de lectura (evidencias, siglas y archivos)</w:t>
       </w:r>
     </w:p>
-    <w:bookmarkStart w:id="204" w:name="sistema-de-evidencias"/>
+    <w:bookmarkStart w:id="213" w:name="sistema-de-evidencias"/>
     <w:p>
       <w:pPr>
         <w:pStyle w:val="Heading3"/>
@@ -40734,8 +41129,8 @@
         <w:t xml:space="preserve">registra el SHA-256 de cada una (Anexo C).</w:t>
       </w:r>
     </w:p>
-    <w:bookmarkEnd w:id="204"/>
-    <w:bookmarkStart w:id="205" w:name="siglas-usadas"/>
+    <w:bookmarkEnd w:id="213"/>
+    <w:bookmarkStart w:id="214" w:name="siglas-usadas"/>
     <w:p>
       <w:pPr>
         <w:pStyle w:val="Heading3"/>
@@ -41097,8 +41492,8 @@
         </w:tc>
       </w:tr>
     </w:tbl>
-    <w:bookmarkEnd w:id="205"/>
-    <w:bookmarkStart w:id="206" w:name="archivos-clave"/>
+    <w:bookmarkEnd w:id="214"/>
+    <w:bookmarkStart w:id="215" w:name="archivos-clave"/>
     <w:p>
       <w:pPr>
         <w:pStyle w:val="Heading3"/>
@@ -41569,9 +41964,9 @@
         </w:pict>
       </w:r>
     </w:p>
-    <w:bookmarkEnd w:id="206"/>
-    <w:bookmarkEnd w:id="207"/>
-    <w:bookmarkStart w:id="208" w:name="anexo-g-glosario-y-convenciones"/>
+    <w:bookmarkEnd w:id="215"/>
+    <w:bookmarkEnd w:id="216"/>
+    <w:bookmarkStart w:id="217" w:name="anexo-g-glosario-y-convenciones"/>
     <w:p>
       <w:pPr>
         <w:pStyle w:val="Heading2"/>
@@ -41938,8 +42333,8 @@
         </w:pict>
       </w:r>
     </w:p>
-    <w:bookmarkEnd w:id="208"/>
-    <w:bookmarkStart w:id="209" w:name="anexo-h-nota-de-transparencia-ia"/>
+    <w:bookmarkEnd w:id="217"/>
+    <w:bookmarkStart w:id="218" w:name="anexo-h-nota-de-transparencia-ia"/>
     <w:p>
       <w:pPr>
         <w:pStyle w:val="Heading2"/>
@@ -41992,8 +42387,8 @@
         </w:pict>
       </w:r>
     </w:p>
-    <w:bookmarkEnd w:id="209"/>
-    <w:bookmarkStart w:id="210" w:name="Xf921bb8221ffe1af72098ef1de4d7827c2de6ff"/>
+    <w:bookmarkEnd w:id="218"/>
+    <w:bookmarkStart w:id="219" w:name="Xf921bb8221ffe1af72098ef1de4d7827c2de6ff"/>
     <w:p>
       <w:pPr>
         <w:pStyle w:val="Heading2"/>
@@ -43523,8 +43918,8 @@
         </w:pict>
       </w:r>
     </w:p>
-    <w:bookmarkEnd w:id="210"/>
-    <w:bookmarkStart w:id="211" w:name="anexo-j-cómo-verificar-este-informe"/>
+    <w:bookmarkEnd w:id="219"/>
+    <w:bookmarkStart w:id="220" w:name="anexo-j-cómo-verificar-este-informe"/>
     <w:p>
       <w:pPr>
         <w:pStyle w:val="Heading2"/>
@@ -43770,8 +44165,8 @@
         <w:t xml:space="preserve">).</w:t>
       </w:r>
     </w:p>
-    <w:bookmarkEnd w:id="211"/>
-    <w:bookmarkEnd w:id="212"/>
+    <w:bookmarkEnd w:id="220"/>
+    <w:bookmarkEnd w:id="221"/>
     <w:sectPr/>
   </w:body>
 </w:document>

</xml_diff>